<commit_message>
docs: separate G1 chat from consultation lifecycle
</commit_message>
<xml_diff>
--- a/reports/six-goals-functional-tz-2026-07-20/tz-g1-2-for-igor.docx
+++ b/reports/six-goals-functional-tz-2026-07-20/tz-g1-2-for-igor.docx
@@ -1061,7 +1061,7 @@
           <w:color w:val="17202A"/>
           <w:sz w:val="22"/>
         </w:rPr>
-        <w:t>Клиент создаёт запрос по конкретному кейсу и желаемому результату. До старта платной части клиент видит:</w:t>
+        <w:t>Клиент создаёт отдельный запрос по конкретному кейсу и желаемому результату. До старта платной части клиент видит:</w:t>
       </w:r>
     </w:p>
     <w:p>
@@ -1187,7 +1187,7 @@
           <w:color w:val="17202A"/>
           <w:sz w:val="22"/>
         </w:rPr>
-        <w:t>Принятый запрос создаёт одну consultation session внутри текущего диалога. Повторный запрос или повторная доставка не создаёт вторую session.</w:t>
+        <w:t>Запрос, его ожидание, принятие, отклонение, уточнение и истечение относятся к G1.3. После принятия и выполнения обязательных условий G1.3 создаёт одну consultation session внутри текущего диалога. Повторный запрос или повторная доставка не создаёт второй request или session.</w:t>
       </w:r>
     </w:p>
     <w:p>
@@ -1318,7 +1318,7 @@
           <w:color w:val="17202A"/>
           <w:sz w:val="22"/>
         </w:rPr>
-        <w:t>Session могут завершить клиент, назначенный Агент, модератор, super-admin или система.</w:t>
+        <w:t>G1.2 не определяет, кто и при каких условиях завершает session: это единый lifecycle-контракт G1.3. Чат:</w:t>
       </w:r>
     </w:p>
     <w:p>
@@ -1341,7 +1341,7 @@
           <w:color w:val="17202A"/>
           <w:sz w:val="22"/>
         </w:rPr>
-        <w:t>Агент и staff обязательно выбирают причину.</w:t>
+        <w:t>показывает только те действия завершения, которые разрешены текущему actor и состоянию по G1.3;</w:t>
       </w:r>
     </w:p>
     <w:p>
@@ -1364,7 +1364,7 @@
           <w:color w:val="17202A"/>
           <w:sz w:val="22"/>
         </w:rPr>
-        <w:t>Система сохраняет автоматическую причину.</w:t>
+        <w:t>запрашивает обязательную причину у Агента или staff, когда её требует G1.3;</w:t>
       </w:r>
     </w:p>
     <w:p>
@@ -1387,7 +1387,7 @@
           <w:color w:val="17202A"/>
           <w:sz w:val="22"/>
         </w:rPr>
-        <w:t>Агент не может завершить paid-консультацию молча: клиент получает корректное объяснение и следующие действия.</w:t>
+        <w:t>отображает клиенту корректное сообщение и следующие действия, полученные из результата завершения;</w:t>
       </w:r>
     </w:p>
     <w:p>
@@ -1410,498 +1410,7 @@
           <w:color w:val="17202A"/>
           <w:sz w:val="22"/>
         </w:rPr>
-        <w:t>После завершения диалог возвращается в бесплатный режим. Новый платный кейс требует нового запроса и новой session.</w:t>
-      </w:r>
-    </w:p>
-    <w:p>
-      <w:pPr>
-        <w:pStyle w:val="Heading1"/>
-      </w:pPr>
-      <w:r>
-        <w:t>6. Состояния, которые должен понимать клиент</w:t>
-      </w:r>
-    </w:p>
-    <w:p>
-      <w:pPr>
-        <w:keepNext/>
-      </w:pPr>
-      <w:r>
-        <w:rPr>
-          <w:rFonts w:ascii="Calibri" w:hAnsi="Calibri"/>
-          <w:b w:val="0"/>
-          <w:color w:val="17202A"/>
-          <w:sz w:val="22"/>
-        </w:rPr>
-        <w:t>Интерфейс должен однозначно передавать:</w:t>
-      </w:r>
-    </w:p>
-    <w:p>
-      <w:pPr>
-        <w:spacing w:after="80" w:line="300" w:lineRule="exact"/>
-        <w:ind w:left="605" w:hanging="374"/>
-      </w:pPr>
-      <w:r>
-        <w:rPr>
-          <w:rFonts w:ascii="Calibri" w:hAnsi="Calibri"/>
-          <w:color w:val="17202A"/>
-          <w:sz w:val="22"/>
-        </w:rPr>
-        <w:t xml:space="preserve">1.  </w:t>
-      </w:r>
-      <w:r>
-        <w:rPr>
-          <w:rFonts w:ascii="Calibri" w:hAnsi="Calibri"/>
-          <w:b w:val="0"/>
-          <w:color w:val="17202A"/>
-          <w:sz w:val="22"/>
-        </w:rPr>
-        <w:t>бесплатный диалог;</w:t>
-      </w:r>
-    </w:p>
-    <w:p>
-      <w:pPr>
-        <w:spacing w:after="80" w:line="300" w:lineRule="exact"/>
-        <w:ind w:left="605" w:hanging="374"/>
-      </w:pPr>
-      <w:r>
-        <w:rPr>
-          <w:rFonts w:ascii="Calibri" w:hAnsi="Calibri"/>
-          <w:color w:val="17202A"/>
-          <w:sz w:val="22"/>
-        </w:rPr>
-        <w:t xml:space="preserve">2.  </w:t>
-      </w:r>
-      <w:r>
-        <w:rPr>
-          <w:rFonts w:ascii="Calibri" w:hAnsi="Calibri"/>
-          <w:b w:val="0"/>
-          <w:color w:val="17202A"/>
-          <w:sz w:val="22"/>
-        </w:rPr>
-        <w:t>запрос на консультацию;</w:t>
-      </w:r>
-    </w:p>
-    <w:p>
-      <w:pPr>
-        <w:spacing w:after="80" w:line="300" w:lineRule="exact"/>
-        <w:ind w:left="605" w:hanging="374"/>
-      </w:pPr>
-      <w:r>
-        <w:rPr>
-          <w:rFonts w:ascii="Calibri" w:hAnsi="Calibri"/>
-          <w:color w:val="17202A"/>
-          <w:sz w:val="22"/>
-        </w:rPr>
-        <w:t xml:space="preserve">3.  </w:t>
-      </w:r>
-      <w:r>
-        <w:rPr>
-          <w:rFonts w:ascii="Calibri" w:hAnsi="Calibri"/>
-          <w:b w:val="0"/>
-          <w:color w:val="17202A"/>
-          <w:sz w:val="22"/>
-        </w:rPr>
-        <w:t>Эксперт доступен, занят или недоступен;</w:t>
-      </w:r>
-    </w:p>
-    <w:p>
-      <w:pPr>
-        <w:spacing w:after="80" w:line="300" w:lineRule="exact"/>
-        <w:ind w:left="605" w:hanging="374"/>
-      </w:pPr>
-      <w:r>
-        <w:rPr>
-          <w:rFonts w:ascii="Calibri" w:hAnsi="Calibri"/>
-          <w:color w:val="17202A"/>
-          <w:sz w:val="22"/>
-        </w:rPr>
-        <w:t xml:space="preserve">4.  </w:t>
-      </w:r>
-      <w:r>
-        <w:rPr>
-          <w:rFonts w:ascii="Calibri" w:hAnsi="Calibri"/>
-          <w:b w:val="0"/>
-          <w:color w:val="17202A"/>
-          <w:sz w:val="22"/>
-        </w:rPr>
-        <w:t>подключение или ожидание без списания;</w:t>
-      </w:r>
-    </w:p>
-    <w:p>
-      <w:pPr>
-        <w:spacing w:after="80" w:line="300" w:lineRule="exact"/>
-        <w:ind w:left="605" w:hanging="374"/>
-      </w:pPr>
-      <w:r>
-        <w:rPr>
-          <w:rFonts w:ascii="Calibri" w:hAnsi="Calibri"/>
-          <w:color w:val="17202A"/>
-          <w:sz w:val="22"/>
-        </w:rPr>
-        <w:t xml:space="preserve">5.  </w:t>
-      </w:r>
-      <w:r>
-        <w:rPr>
-          <w:rFonts w:ascii="Calibri" w:hAnsi="Calibri"/>
-          <w:b w:val="0"/>
-          <w:color w:val="17202A"/>
-          <w:sz w:val="22"/>
-        </w:rPr>
-        <w:t>coupon/trial активен, заканчивается или завершён;</w:t>
-      </w:r>
-    </w:p>
-    <w:p>
-      <w:pPr>
-        <w:spacing w:after="80" w:line="300" w:lineRule="exact"/>
-        <w:ind w:left="605" w:hanging="374"/>
-      </w:pPr>
-      <w:r>
-        <w:rPr>
-          <w:rFonts w:ascii="Calibri" w:hAnsi="Calibri"/>
-          <w:color w:val="17202A"/>
-          <w:sz w:val="22"/>
-        </w:rPr>
-        <w:t xml:space="preserve">6.  </w:t>
-      </w:r>
-      <w:r>
-        <w:rPr>
-          <w:rFonts w:ascii="Calibri" w:hAnsi="Calibri"/>
-          <w:b w:val="0"/>
-          <w:color w:val="17202A"/>
-          <w:sz w:val="22"/>
-        </w:rPr>
-        <w:t>paid активен;</w:t>
-      </w:r>
-    </w:p>
-    <w:p>
-      <w:pPr>
-        <w:spacing w:after="80" w:line="300" w:lineRule="exact"/>
-        <w:ind w:left="605" w:hanging="374"/>
-      </w:pPr>
-      <w:r>
-        <w:rPr>
-          <w:rFonts w:ascii="Calibri" w:hAnsi="Calibri"/>
-          <w:color w:val="17202A"/>
-          <w:sz w:val="22"/>
-        </w:rPr>
-        <w:t xml:space="preserve">7.  </w:t>
-      </w:r>
-      <w:r>
-        <w:rPr>
-          <w:rFonts w:ascii="Calibri" w:hAnsi="Calibri"/>
-          <w:b w:val="0"/>
-          <w:color w:val="17202A"/>
-          <w:sz w:val="22"/>
-        </w:rPr>
-        <w:t>мало credits или времени;</w:t>
-      </w:r>
-    </w:p>
-    <w:p>
-      <w:pPr>
-        <w:spacing w:after="80" w:line="300" w:lineRule="exact"/>
-        <w:ind w:left="605" w:hanging="374"/>
-      </w:pPr>
-      <w:r>
-        <w:rPr>
-          <w:rFonts w:ascii="Calibri" w:hAnsi="Calibri"/>
-          <w:color w:val="17202A"/>
-          <w:sz w:val="22"/>
-        </w:rPr>
-        <w:t xml:space="preserve">8.  </w:t>
-      </w:r>
-      <w:r>
-        <w:rPr>
-          <w:rFonts w:ascii="Calibri" w:hAnsi="Calibri"/>
-          <w:b w:val="0"/>
-          <w:color w:val="17202A"/>
-          <w:sz w:val="22"/>
-        </w:rPr>
-        <w:t>credits закончились;</w:t>
-      </w:r>
-    </w:p>
-    <w:p>
-      <w:pPr>
-        <w:spacing w:after="80" w:line="300" w:lineRule="exact"/>
-        <w:ind w:left="605" w:hanging="374"/>
-      </w:pPr>
-      <w:r>
-        <w:rPr>
-          <w:rFonts w:ascii="Calibri" w:hAnsi="Calibri"/>
-          <w:color w:val="17202A"/>
-          <w:sz w:val="22"/>
-        </w:rPr>
-        <w:t xml:space="preserve">9.  </w:t>
-      </w:r>
-      <w:r>
-        <w:rPr>
-          <w:rFonts w:ascii="Calibri" w:hAnsi="Calibri"/>
-          <w:b w:val="0"/>
-          <w:color w:val="17202A"/>
-          <w:sz w:val="22"/>
-        </w:rPr>
-        <w:t>пауза или ожидание стороны;</w:t>
-      </w:r>
-    </w:p>
-    <w:p>
-      <w:pPr>
-        <w:spacing w:after="80" w:line="300" w:lineRule="exact"/>
-        <w:ind w:left="605" w:hanging="374"/>
-      </w:pPr>
-      <w:r>
-        <w:rPr>
-          <w:rFonts w:ascii="Calibri" w:hAnsi="Calibri"/>
-          <w:color w:val="17202A"/>
-          <w:sz w:val="22"/>
-        </w:rPr>
-        <w:t xml:space="preserve">10.  </w:t>
-      </w:r>
-      <w:r>
-        <w:rPr>
-          <w:rFonts w:ascii="Calibri" w:hAnsi="Calibri"/>
-          <w:b w:val="0"/>
-          <w:color w:val="17202A"/>
-          <w:sz w:val="22"/>
-        </w:rPr>
-        <w:t>потеря связи, отправка, ошибка и повтор;</w:t>
-      </w:r>
-    </w:p>
-    <w:p>
-      <w:pPr>
-        <w:spacing w:after="80" w:line="300" w:lineRule="exact"/>
-        <w:ind w:left="605" w:hanging="374"/>
-      </w:pPr>
-      <w:r>
-        <w:rPr>
-          <w:rFonts w:ascii="Calibri" w:hAnsi="Calibri"/>
-          <w:color w:val="17202A"/>
-          <w:sz w:val="22"/>
-        </w:rPr>
-        <w:t xml:space="preserve">11.  </w:t>
-      </w:r>
-      <w:r>
-        <w:rPr>
-          <w:rFonts w:ascii="Calibri" w:hAnsi="Calibri"/>
-          <w:b w:val="0"/>
-          <w:color w:val="17202A"/>
-          <w:sz w:val="22"/>
-        </w:rPr>
-        <w:t>консультация завершена;</w:t>
-      </w:r>
-    </w:p>
-    <w:p>
-      <w:pPr>
-        <w:spacing w:after="80" w:line="300" w:lineRule="exact"/>
-        <w:ind w:left="605" w:hanging="374"/>
-      </w:pPr>
-      <w:r>
-        <w:rPr>
-          <w:rFonts w:ascii="Calibri" w:hAnsi="Calibri"/>
-          <w:color w:val="17202A"/>
-          <w:sz w:val="22"/>
-        </w:rPr>
-        <w:t xml:space="preserve">12.  </w:t>
-      </w:r>
-      <w:r>
-        <w:rPr>
-          <w:rFonts w:ascii="Calibri" w:hAnsi="Calibri"/>
-          <w:b w:val="0"/>
-          <w:color w:val="17202A"/>
-          <w:sz w:val="22"/>
-        </w:rPr>
-        <w:t>доступна «История консультации»;</w:t>
-      </w:r>
-    </w:p>
-    <w:p>
-      <w:pPr>
-        <w:spacing w:after="80" w:line="300" w:lineRule="exact"/>
-        <w:ind w:left="605" w:hanging="374"/>
-      </w:pPr>
-      <w:r>
-        <w:rPr>
-          <w:rFonts w:ascii="Calibri" w:hAnsi="Calibri"/>
-          <w:color w:val="17202A"/>
-          <w:sz w:val="22"/>
-        </w:rPr>
-        <w:t xml:space="preserve">13.  </w:t>
-      </w:r>
-      <w:r>
-        <w:rPr>
-          <w:rFonts w:ascii="Calibri" w:hAnsi="Calibri"/>
-          <w:b w:val="0"/>
-          <w:color w:val="17202A"/>
-          <w:sz w:val="22"/>
-        </w:rPr>
-        <w:t>доступны оценка, жалоба и «Поддержка Nebula».</w:t>
-      </w:r>
-    </w:p>
-    <w:p>
-      <w:r>
-        <w:rPr>
-          <w:rFonts w:ascii="Calibri" w:hAnsi="Calibri"/>
-          <w:b w:val="0"/>
-          <w:color w:val="17202A"/>
-          <w:sz w:val="22"/>
-        </w:rPr>
-        <w:t>Названия в интерфейсе могут быть короче, но смысл состояния и последствия для credits скрывать нельзя.</w:t>
-      </w:r>
-    </w:p>
-    <w:p>
-      <w:pPr>
-        <w:pStyle w:val="Heading1"/>
-      </w:pPr>
-      <w:r>
-        <w:t>7. Сообщения и вложения</w:t>
-      </w:r>
-    </w:p>
-    <w:p>
-      <w:pPr>
-        <w:keepNext/>
-      </w:pPr>
-      <w:r>
-        <w:rPr>
-          <w:rFonts w:ascii="Calibri" w:hAnsi="Calibri"/>
-          <w:b w:val="0"/>
-          <w:color w:val="17202A"/>
-          <w:sz w:val="22"/>
-        </w:rPr>
-        <w:t>В MVP разрешены:</w:t>
-      </w:r>
-    </w:p>
-    <w:p>
-      <w:pPr>
-        <w:spacing w:after="80" w:line="300" w:lineRule="exact"/>
-        <w:ind w:left="605" w:hanging="374"/>
-      </w:pPr>
-      <w:r>
-        <w:rPr>
-          <w:rFonts w:ascii="Calibri" w:hAnsi="Calibri"/>
-          <w:color w:val="17202A"/>
-          <w:sz w:val="22"/>
-        </w:rPr>
-        <w:t xml:space="preserve">•  </w:t>
-      </w:r>
-      <w:r>
-        <w:rPr>
-          <w:rFonts w:ascii="Calibri" w:hAnsi="Calibri"/>
-          <w:b w:val="0"/>
-          <w:color w:val="17202A"/>
-          <w:sz w:val="22"/>
-        </w:rPr>
-        <w:t>текст;</w:t>
-      </w:r>
-    </w:p>
-    <w:p>
-      <w:pPr>
-        <w:spacing w:after="80" w:line="300" w:lineRule="exact"/>
-        <w:ind w:left="605" w:hanging="374"/>
-      </w:pPr>
-      <w:r>
-        <w:rPr>
-          <w:rFonts w:ascii="Calibri" w:hAnsi="Calibri"/>
-          <w:color w:val="17202A"/>
-          <w:sz w:val="22"/>
-        </w:rPr>
-        <w:t xml:space="preserve">•  </w:t>
-      </w:r>
-      <w:r>
-        <w:rPr>
-          <w:rFonts w:ascii="Calibri" w:hAnsi="Calibri"/>
-          <w:b w:val="0"/>
-          <w:color w:val="17202A"/>
-          <w:sz w:val="22"/>
-        </w:rPr>
-        <w:t>системные сообщения;</w:t>
-      </w:r>
-    </w:p>
-    <w:p>
-      <w:pPr>
-        <w:spacing w:after="80" w:line="300" w:lineRule="exact"/>
-        <w:ind w:left="605" w:hanging="374"/>
-      </w:pPr>
-      <w:r>
-        <w:rPr>
-          <w:rFonts w:ascii="Calibri" w:hAnsi="Calibri"/>
-          <w:color w:val="17202A"/>
-          <w:sz w:val="22"/>
-        </w:rPr>
-        <w:t xml:space="preserve">•  </w:t>
-      </w:r>
-      <w:r>
-        <w:rPr>
-          <w:rFonts w:ascii="Calibri" w:hAnsi="Calibri"/>
-          <w:b w:val="0"/>
-          <w:color w:val="17202A"/>
-          <w:sz w:val="22"/>
-        </w:rPr>
-        <w:t>emoji;</w:t>
-      </w:r>
-    </w:p>
-    <w:p>
-      <w:pPr>
-        <w:spacing w:after="80" w:line="300" w:lineRule="exact"/>
-        <w:ind w:left="605" w:hanging="374"/>
-      </w:pPr>
-      <w:r>
-        <w:rPr>
-          <w:rFonts w:ascii="Calibri" w:hAnsi="Calibri"/>
-          <w:color w:val="17202A"/>
-          <w:sz w:val="22"/>
-        </w:rPr>
-        <w:t xml:space="preserve">•  </w:t>
-      </w:r>
-      <w:r>
-        <w:rPr>
-          <w:rFonts w:ascii="Calibri" w:hAnsi="Calibri"/>
-          <w:b w:val="0"/>
-          <w:color w:val="17202A"/>
-          <w:sz w:val="22"/>
-        </w:rPr>
-        <w:t>изображения разрешённых форматов;</w:t>
-      </w:r>
-    </w:p>
-    <w:p>
-      <w:pPr>
-        <w:spacing w:after="80" w:line="300" w:lineRule="exact"/>
-        <w:ind w:left="605" w:hanging="374"/>
-      </w:pPr>
-      <w:r>
-        <w:rPr>
-          <w:rFonts w:ascii="Calibri" w:hAnsi="Calibri"/>
-          <w:color w:val="17202A"/>
-          <w:sz w:val="22"/>
-        </w:rPr>
-        <w:t xml:space="preserve">•  </w:t>
-      </w:r>
-      <w:r>
-        <w:rPr>
-          <w:rFonts w:ascii="Calibri" w:hAnsi="Calibri"/>
-          <w:b w:val="0"/>
-          <w:color w:val="17202A"/>
-          <w:sz w:val="22"/>
-        </w:rPr>
-        <w:t>документы разрешённых форматов.</w:t>
-      </w:r>
-    </w:p>
-    <w:p>
-      <w:r>
-        <w:rPr>
-          <w:rFonts w:ascii="Calibri" w:hAnsi="Calibri"/>
-          <w:b w:val="0"/>
-          <w:color w:val="17202A"/>
-          <w:sz w:val="22"/>
-        </w:rPr>
-        <w:t>Аудио, видео и произвольные файлы запрещены. Переименование расширения не делает файл разрешённым. Изображение или документ доставляется только после применимых проверок формата, размера, безопасности и защищённых данных.</w:t>
-      </w:r>
-    </w:p>
-    <w:p>
-      <w:r>
-        <w:rPr>
-          <w:rFonts w:ascii="Calibri" w:hAnsi="Calibri"/>
-          <w:b w:val="0"/>
-          <w:color w:val="17202A"/>
-          <w:sz w:val="22"/>
-        </w:rPr>
-        <w:t xml:space="preserve">Клиент и Агент видят понятные состояния </w:t>
+        <w:t xml:space="preserve">после события </w:t>
       </w:r>
       <w:r>
         <w:rPr>
@@ -1909,7 +1418,7 @@
           <w:color w:val="31445A"/>
           <w:sz w:val="21"/>
         </w:rPr>
-        <w:t>отправляется</w:t>
+        <w:t>completed</w:t>
       </w:r>
       <w:r>
         <w:rPr>
@@ -1918,7 +1427,521 @@
           <w:color w:val="17202A"/>
           <w:sz w:val="22"/>
         </w:rPr>
-        <w:t xml:space="preserve">, </w:t>
+        <w:t xml:space="preserve"> возвращает постоянный диалог в бесплатный режим;</w:t>
+      </w:r>
+    </w:p>
+    <w:p>
+      <w:pPr>
+        <w:spacing w:after="80" w:line="300" w:lineRule="exact"/>
+        <w:ind w:left="605" w:hanging="374"/>
+      </w:pPr>
+      <w:r>
+        <w:rPr>
+          <w:rFonts w:ascii="Calibri" w:hAnsi="Calibri"/>
+          <w:color w:val="17202A"/>
+          <w:sz w:val="22"/>
+        </w:rPr>
+        <w:t xml:space="preserve">•  </w:t>
+      </w:r>
+      <w:r>
+        <w:rPr>
+          <w:rFonts w:ascii="Calibri" w:hAnsi="Calibri"/>
+          <w:b w:val="0"/>
+          <w:color w:val="17202A"/>
+          <w:sz w:val="22"/>
+        </w:rPr>
+        <w:t>не создаёт новый платный кейс без нового запроса и новой session.</w:t>
+      </w:r>
+    </w:p>
+    <w:p>
+      <w:pPr>
+        <w:pStyle w:val="Heading1"/>
+      </w:pPr>
+      <w:r>
+        <w:t>6. Состояния, которые должен понимать клиент</w:t>
+      </w:r>
+    </w:p>
+    <w:p>
+      <w:pPr>
+        <w:keepNext/>
+      </w:pPr>
+      <w:r>
+        <w:rPr>
+          <w:rFonts w:ascii="Calibri" w:hAnsi="Calibri"/>
+          <w:b w:val="0"/>
+          <w:color w:val="17202A"/>
+          <w:sz w:val="22"/>
+        </w:rPr>
+        <w:t>Интерфейс должен однозначно передавать:</w:t>
+      </w:r>
+    </w:p>
+    <w:p>
+      <w:pPr>
+        <w:spacing w:after="80" w:line="300" w:lineRule="exact"/>
+        <w:ind w:left="605" w:hanging="374"/>
+      </w:pPr>
+      <w:r>
+        <w:rPr>
+          <w:rFonts w:ascii="Calibri" w:hAnsi="Calibri"/>
+          <w:color w:val="17202A"/>
+          <w:sz w:val="22"/>
+        </w:rPr>
+        <w:t xml:space="preserve">1.  </w:t>
+      </w:r>
+      <w:r>
+        <w:rPr>
+          <w:rFonts w:ascii="Calibri" w:hAnsi="Calibri"/>
+          <w:b w:val="0"/>
+          <w:color w:val="17202A"/>
+          <w:sz w:val="22"/>
+        </w:rPr>
+        <w:t>бесплатный диалог;</w:t>
+      </w:r>
+    </w:p>
+    <w:p>
+      <w:pPr>
+        <w:spacing w:after="80" w:line="300" w:lineRule="exact"/>
+        <w:ind w:left="605" w:hanging="374"/>
+      </w:pPr>
+      <w:r>
+        <w:rPr>
+          <w:rFonts w:ascii="Calibri" w:hAnsi="Calibri"/>
+          <w:color w:val="17202A"/>
+          <w:sz w:val="22"/>
+        </w:rPr>
+        <w:t xml:space="preserve">2.  </w:t>
+      </w:r>
+      <w:r>
+        <w:rPr>
+          <w:rFonts w:ascii="Calibri" w:hAnsi="Calibri"/>
+          <w:b w:val="0"/>
+          <w:color w:val="17202A"/>
+          <w:sz w:val="22"/>
+        </w:rPr>
+        <w:t>запрос на консультацию;</w:t>
+      </w:r>
+    </w:p>
+    <w:p>
+      <w:pPr>
+        <w:spacing w:after="80" w:line="300" w:lineRule="exact"/>
+        <w:ind w:left="605" w:hanging="374"/>
+      </w:pPr>
+      <w:r>
+        <w:rPr>
+          <w:rFonts w:ascii="Calibri" w:hAnsi="Calibri"/>
+          <w:color w:val="17202A"/>
+          <w:sz w:val="22"/>
+        </w:rPr>
+        <w:t xml:space="preserve">3.  </w:t>
+      </w:r>
+      <w:r>
+        <w:rPr>
+          <w:rFonts w:ascii="Calibri" w:hAnsi="Calibri"/>
+          <w:b w:val="0"/>
+          <w:color w:val="17202A"/>
+          <w:sz w:val="22"/>
+        </w:rPr>
+        <w:t>Эксперт доступен, занят или недоступен;</w:t>
+      </w:r>
+    </w:p>
+    <w:p>
+      <w:pPr>
+        <w:spacing w:after="80" w:line="300" w:lineRule="exact"/>
+        <w:ind w:left="605" w:hanging="374"/>
+      </w:pPr>
+      <w:r>
+        <w:rPr>
+          <w:rFonts w:ascii="Calibri" w:hAnsi="Calibri"/>
+          <w:color w:val="17202A"/>
+          <w:sz w:val="22"/>
+        </w:rPr>
+        <w:t xml:space="preserve">4.  </w:t>
+      </w:r>
+      <w:r>
+        <w:rPr>
+          <w:rFonts w:ascii="Calibri" w:hAnsi="Calibri"/>
+          <w:b w:val="0"/>
+          <w:color w:val="17202A"/>
+          <w:sz w:val="22"/>
+        </w:rPr>
+        <w:t>подключение или ожидание без списания;</w:t>
+      </w:r>
+    </w:p>
+    <w:p>
+      <w:pPr>
+        <w:spacing w:after="80" w:line="300" w:lineRule="exact"/>
+        <w:ind w:left="605" w:hanging="374"/>
+      </w:pPr>
+      <w:r>
+        <w:rPr>
+          <w:rFonts w:ascii="Calibri" w:hAnsi="Calibri"/>
+          <w:color w:val="17202A"/>
+          <w:sz w:val="22"/>
+        </w:rPr>
+        <w:t xml:space="preserve">5.  </w:t>
+      </w:r>
+      <w:r>
+        <w:rPr>
+          <w:rFonts w:ascii="Calibri" w:hAnsi="Calibri"/>
+          <w:b w:val="0"/>
+          <w:color w:val="17202A"/>
+          <w:sz w:val="22"/>
+        </w:rPr>
+        <w:t>coupon/trial активен, заканчивается или завершён;</w:t>
+      </w:r>
+    </w:p>
+    <w:p>
+      <w:pPr>
+        <w:spacing w:after="80" w:line="300" w:lineRule="exact"/>
+        <w:ind w:left="605" w:hanging="374"/>
+      </w:pPr>
+      <w:r>
+        <w:rPr>
+          <w:rFonts w:ascii="Calibri" w:hAnsi="Calibri"/>
+          <w:color w:val="17202A"/>
+          <w:sz w:val="22"/>
+        </w:rPr>
+        <w:t xml:space="preserve">6.  </w:t>
+      </w:r>
+      <w:r>
+        <w:rPr>
+          <w:rFonts w:ascii="Calibri" w:hAnsi="Calibri"/>
+          <w:b w:val="0"/>
+          <w:color w:val="17202A"/>
+          <w:sz w:val="22"/>
+        </w:rPr>
+        <w:t>paid активен;</w:t>
+      </w:r>
+    </w:p>
+    <w:p>
+      <w:pPr>
+        <w:spacing w:after="80" w:line="300" w:lineRule="exact"/>
+        <w:ind w:left="605" w:hanging="374"/>
+      </w:pPr>
+      <w:r>
+        <w:rPr>
+          <w:rFonts w:ascii="Calibri" w:hAnsi="Calibri"/>
+          <w:color w:val="17202A"/>
+          <w:sz w:val="22"/>
+        </w:rPr>
+        <w:t xml:space="preserve">7.  </w:t>
+      </w:r>
+      <w:r>
+        <w:rPr>
+          <w:rFonts w:ascii="Calibri" w:hAnsi="Calibri"/>
+          <w:b w:val="0"/>
+          <w:color w:val="17202A"/>
+          <w:sz w:val="22"/>
+        </w:rPr>
+        <w:t>мало credits или времени;</w:t>
+      </w:r>
+    </w:p>
+    <w:p>
+      <w:pPr>
+        <w:spacing w:after="80" w:line="300" w:lineRule="exact"/>
+        <w:ind w:left="605" w:hanging="374"/>
+      </w:pPr>
+      <w:r>
+        <w:rPr>
+          <w:rFonts w:ascii="Calibri" w:hAnsi="Calibri"/>
+          <w:color w:val="17202A"/>
+          <w:sz w:val="22"/>
+        </w:rPr>
+        <w:t xml:space="preserve">8.  </w:t>
+      </w:r>
+      <w:r>
+        <w:rPr>
+          <w:rFonts w:ascii="Calibri" w:hAnsi="Calibri"/>
+          <w:b w:val="0"/>
+          <w:color w:val="17202A"/>
+          <w:sz w:val="22"/>
+        </w:rPr>
+        <w:t>credits закончились;</w:t>
+      </w:r>
+    </w:p>
+    <w:p>
+      <w:pPr>
+        <w:spacing w:after="80" w:line="300" w:lineRule="exact"/>
+        <w:ind w:left="605" w:hanging="374"/>
+      </w:pPr>
+      <w:r>
+        <w:rPr>
+          <w:rFonts w:ascii="Calibri" w:hAnsi="Calibri"/>
+          <w:color w:val="17202A"/>
+          <w:sz w:val="22"/>
+        </w:rPr>
+        <w:t xml:space="preserve">9.  </w:t>
+      </w:r>
+      <w:r>
+        <w:rPr>
+          <w:rFonts w:ascii="Calibri" w:hAnsi="Calibri"/>
+          <w:b w:val="0"/>
+          <w:color w:val="17202A"/>
+          <w:sz w:val="22"/>
+        </w:rPr>
+        <w:t>пауза или ожидание стороны;</w:t>
+      </w:r>
+    </w:p>
+    <w:p>
+      <w:pPr>
+        <w:spacing w:after="80" w:line="300" w:lineRule="exact"/>
+        <w:ind w:left="605" w:hanging="374"/>
+      </w:pPr>
+      <w:r>
+        <w:rPr>
+          <w:rFonts w:ascii="Calibri" w:hAnsi="Calibri"/>
+          <w:color w:val="17202A"/>
+          <w:sz w:val="22"/>
+        </w:rPr>
+        <w:t xml:space="preserve">10.  </w:t>
+      </w:r>
+      <w:r>
+        <w:rPr>
+          <w:rFonts w:ascii="Calibri" w:hAnsi="Calibri"/>
+          <w:b w:val="0"/>
+          <w:color w:val="17202A"/>
+          <w:sz w:val="22"/>
+        </w:rPr>
+        <w:t>потеря связи, отправка, ошибка и повтор;</w:t>
+      </w:r>
+    </w:p>
+    <w:p>
+      <w:pPr>
+        <w:spacing w:after="80" w:line="300" w:lineRule="exact"/>
+        <w:ind w:left="605" w:hanging="374"/>
+      </w:pPr>
+      <w:r>
+        <w:rPr>
+          <w:rFonts w:ascii="Calibri" w:hAnsi="Calibri"/>
+          <w:color w:val="17202A"/>
+          <w:sz w:val="22"/>
+        </w:rPr>
+        <w:t xml:space="preserve">11.  </w:t>
+      </w:r>
+      <w:r>
+        <w:rPr>
+          <w:rFonts w:ascii="Calibri" w:hAnsi="Calibri"/>
+          <w:b w:val="0"/>
+          <w:color w:val="17202A"/>
+          <w:sz w:val="22"/>
+        </w:rPr>
+        <w:t>консультация завершена;</w:t>
+      </w:r>
+    </w:p>
+    <w:p>
+      <w:pPr>
+        <w:spacing w:after="80" w:line="300" w:lineRule="exact"/>
+        <w:ind w:left="605" w:hanging="374"/>
+      </w:pPr>
+      <w:r>
+        <w:rPr>
+          <w:rFonts w:ascii="Calibri" w:hAnsi="Calibri"/>
+          <w:color w:val="17202A"/>
+          <w:sz w:val="22"/>
+        </w:rPr>
+        <w:t xml:space="preserve">12.  </w:t>
+      </w:r>
+      <w:r>
+        <w:rPr>
+          <w:rFonts w:ascii="Calibri" w:hAnsi="Calibri"/>
+          <w:b w:val="0"/>
+          <w:color w:val="17202A"/>
+          <w:sz w:val="22"/>
+        </w:rPr>
+        <w:t>доступна «История консультации»;</w:t>
+      </w:r>
+    </w:p>
+    <w:p>
+      <w:pPr>
+        <w:spacing w:after="80" w:line="300" w:lineRule="exact"/>
+        <w:ind w:left="605" w:hanging="374"/>
+      </w:pPr>
+      <w:r>
+        <w:rPr>
+          <w:rFonts w:ascii="Calibri" w:hAnsi="Calibri"/>
+          <w:color w:val="17202A"/>
+          <w:sz w:val="22"/>
+        </w:rPr>
+        <w:t xml:space="preserve">13.  </w:t>
+      </w:r>
+      <w:r>
+        <w:rPr>
+          <w:rFonts w:ascii="Calibri" w:hAnsi="Calibri"/>
+          <w:b w:val="0"/>
+          <w:color w:val="17202A"/>
+          <w:sz w:val="22"/>
+        </w:rPr>
+        <w:t>доступны оценка, жалоба и «Поддержка Nebula».</w:t>
+      </w:r>
+    </w:p>
+    <w:p>
+      <w:r>
+        <w:rPr>
+          <w:rFonts w:ascii="Calibri" w:hAnsi="Calibri"/>
+          <w:b w:val="0"/>
+          <w:color w:val="17202A"/>
+          <w:sz w:val="22"/>
+        </w:rPr>
+        <w:t>Названия в интерфейсе могут быть короче, но смысл состояния и последствия для credits скрывать нельзя.</w:t>
+      </w:r>
+    </w:p>
+    <w:p>
+      <w:pPr>
+        <w:pStyle w:val="Heading1"/>
+      </w:pPr>
+      <w:r>
+        <w:t>7. Сообщения и вложения</w:t>
+      </w:r>
+    </w:p>
+    <w:p>
+      <w:pPr>
+        <w:keepNext/>
+      </w:pPr>
+      <w:r>
+        <w:rPr>
+          <w:rFonts w:ascii="Calibri" w:hAnsi="Calibri"/>
+          <w:b w:val="0"/>
+          <w:color w:val="17202A"/>
+          <w:sz w:val="22"/>
+        </w:rPr>
+        <w:t>В MVP разрешены:</w:t>
+      </w:r>
+    </w:p>
+    <w:p>
+      <w:pPr>
+        <w:spacing w:after="80" w:line="300" w:lineRule="exact"/>
+        <w:ind w:left="605" w:hanging="374"/>
+      </w:pPr>
+      <w:r>
+        <w:rPr>
+          <w:rFonts w:ascii="Calibri" w:hAnsi="Calibri"/>
+          <w:color w:val="17202A"/>
+          <w:sz w:val="22"/>
+        </w:rPr>
+        <w:t xml:space="preserve">•  </w:t>
+      </w:r>
+      <w:r>
+        <w:rPr>
+          <w:rFonts w:ascii="Calibri" w:hAnsi="Calibri"/>
+          <w:b w:val="0"/>
+          <w:color w:val="17202A"/>
+          <w:sz w:val="22"/>
+        </w:rPr>
+        <w:t>текст;</w:t>
+      </w:r>
+    </w:p>
+    <w:p>
+      <w:pPr>
+        <w:spacing w:after="80" w:line="300" w:lineRule="exact"/>
+        <w:ind w:left="605" w:hanging="374"/>
+      </w:pPr>
+      <w:r>
+        <w:rPr>
+          <w:rFonts w:ascii="Calibri" w:hAnsi="Calibri"/>
+          <w:color w:val="17202A"/>
+          <w:sz w:val="22"/>
+        </w:rPr>
+        <w:t xml:space="preserve">•  </w:t>
+      </w:r>
+      <w:r>
+        <w:rPr>
+          <w:rFonts w:ascii="Calibri" w:hAnsi="Calibri"/>
+          <w:b w:val="0"/>
+          <w:color w:val="17202A"/>
+          <w:sz w:val="22"/>
+        </w:rPr>
+        <w:t>системные сообщения;</w:t>
+      </w:r>
+    </w:p>
+    <w:p>
+      <w:pPr>
+        <w:spacing w:after="80" w:line="300" w:lineRule="exact"/>
+        <w:ind w:left="605" w:hanging="374"/>
+      </w:pPr>
+      <w:r>
+        <w:rPr>
+          <w:rFonts w:ascii="Calibri" w:hAnsi="Calibri"/>
+          <w:color w:val="17202A"/>
+          <w:sz w:val="22"/>
+        </w:rPr>
+        <w:t xml:space="preserve">•  </w:t>
+      </w:r>
+      <w:r>
+        <w:rPr>
+          <w:rFonts w:ascii="Calibri" w:hAnsi="Calibri"/>
+          <w:b w:val="0"/>
+          <w:color w:val="17202A"/>
+          <w:sz w:val="22"/>
+        </w:rPr>
+        <w:t>emoji;</w:t>
+      </w:r>
+    </w:p>
+    <w:p>
+      <w:pPr>
+        <w:spacing w:after="80" w:line="300" w:lineRule="exact"/>
+        <w:ind w:left="605" w:hanging="374"/>
+      </w:pPr>
+      <w:r>
+        <w:rPr>
+          <w:rFonts w:ascii="Calibri" w:hAnsi="Calibri"/>
+          <w:color w:val="17202A"/>
+          <w:sz w:val="22"/>
+        </w:rPr>
+        <w:t xml:space="preserve">•  </w:t>
+      </w:r>
+      <w:r>
+        <w:rPr>
+          <w:rFonts w:ascii="Calibri" w:hAnsi="Calibri"/>
+          <w:b w:val="0"/>
+          <w:color w:val="17202A"/>
+          <w:sz w:val="22"/>
+        </w:rPr>
+        <w:t>изображения разрешённых форматов;</w:t>
+      </w:r>
+    </w:p>
+    <w:p>
+      <w:pPr>
+        <w:spacing w:after="80" w:line="300" w:lineRule="exact"/>
+        <w:ind w:left="605" w:hanging="374"/>
+      </w:pPr>
+      <w:r>
+        <w:rPr>
+          <w:rFonts w:ascii="Calibri" w:hAnsi="Calibri"/>
+          <w:color w:val="17202A"/>
+          <w:sz w:val="22"/>
+        </w:rPr>
+        <w:t xml:space="preserve">•  </w:t>
+      </w:r>
+      <w:r>
+        <w:rPr>
+          <w:rFonts w:ascii="Calibri" w:hAnsi="Calibri"/>
+          <w:b w:val="0"/>
+          <w:color w:val="17202A"/>
+          <w:sz w:val="22"/>
+        </w:rPr>
+        <w:t>документы разрешённых форматов.</w:t>
+      </w:r>
+    </w:p>
+    <w:p>
+      <w:r>
+        <w:rPr>
+          <w:rFonts w:ascii="Calibri" w:hAnsi="Calibri"/>
+          <w:b w:val="0"/>
+          <w:color w:val="17202A"/>
+          <w:sz w:val="22"/>
+        </w:rPr>
+        <w:t>Аудио, видео и произвольные файлы запрещены. Переименование расширения не делает файл разрешённым. Изображение или документ доставляется только после применимых проверок формата, размера, безопасности и защищённых данных.</w:t>
+      </w:r>
+    </w:p>
+    <w:p>
+      <w:r>
+        <w:rPr>
+          <w:rFonts w:ascii="Calibri" w:hAnsi="Calibri"/>
+          <w:b w:val="0"/>
+          <w:color w:val="17202A"/>
+          <w:sz w:val="22"/>
+        </w:rPr>
+        <w:t xml:space="preserve">Клиент и Агент видят понятные состояния </w:t>
       </w:r>
       <w:r>
         <w:rPr>
@@ -1926,7 +1949,7 @@
           <w:color w:val="31445A"/>
           <w:sz w:val="21"/>
         </w:rPr>
-        <w:t>доставлено</w:t>
+        <w:t>отправляется</w:t>
       </w:r>
       <w:r>
         <w:rPr>
@@ -1943,7 +1966,7 @@
           <w:color w:val="31445A"/>
           <w:sz w:val="21"/>
         </w:rPr>
-        <w:t>прочитано</w:t>
+        <w:t>доставлено</w:t>
       </w:r>
       <w:r>
         <w:rPr>
@@ -1960,7 +1983,7 @@
           <w:color w:val="31445A"/>
           <w:sz w:val="21"/>
         </w:rPr>
-        <w:t>не отправлено</w:t>
+        <w:t>прочитано</w:t>
       </w:r>
       <w:r>
         <w:rPr>
@@ -1977,7 +2000,7 @@
           <w:color w:val="31445A"/>
           <w:sz w:val="21"/>
         </w:rPr>
-        <w:t>повторить</w:t>
+        <w:t>не отправлено</w:t>
       </w:r>
       <w:r>
         <w:rPr>
@@ -1986,509 +2009,7 @@
           <w:color w:val="17202A"/>
           <w:sz w:val="22"/>
         </w:rPr>
-        <w:t>. Typing, delivered и read не запускают, не останавливают и не продлевают списание credits.</w:t>
-      </w:r>
-    </w:p>
-    <w:p>
-      <w:r>
-        <w:rPr>
-          <w:rFonts w:ascii="Calibri" w:hAnsi="Calibri"/>
-          <w:b w:val="0"/>
-          <w:color w:val="17202A"/>
-          <w:sz w:val="22"/>
-        </w:rPr>
-        <w:t>Агент может редактировать уже отправленное сообщение Эксперта. Клиент видит пометку «изменено», а audit сохраняет прежнюю версию, автора изменения и время. Политика редактирования отправленных сообщений клиента не входит в текущий этап и не должна появиться неявно.</w:t>
-      </w:r>
-    </w:p>
-    <w:p>
-      <w:r>
-        <w:rPr>
-          <w:rFonts w:ascii="Calibri" w:hAnsi="Calibri"/>
-          <w:b w:val="0"/>
-          <w:color w:val="17202A"/>
-          <w:sz w:val="22"/>
-        </w:rPr>
-        <w:t>Клиент и Агент не могут физически удалить отправленное сообщение. Staff может скрыть запрещённый контент только с обязательной причиной; audit-факт и закрытая история сохраняются.</w:t>
-      </w:r>
-    </w:p>
-    <w:p>
-      <w:r>
-        <w:rPr>
-          <w:rFonts w:ascii="Calibri" w:hAnsi="Calibri"/>
-          <w:b w:val="0"/>
-          <w:color w:val="17202A"/>
-          <w:sz w:val="22"/>
-        </w:rPr>
-        <w:t>Шаблоны ответов являются необязательными редактируемыми подсказками. Агент самостоятельно выбирает или изменяет текст и явно отправляет его. Автоматическая отправка шаблона, AI-подсказки или подготовленного ответа запрещена.</w:t>
-      </w:r>
-    </w:p>
-    <w:p>
-      <w:pPr>
-        <w:pStyle w:val="Heading1"/>
-      </w:pPr>
-      <w:r>
-        <w:t>8. Цензура контактов и защищённых данных</w:t>
-      </w:r>
-    </w:p>
-    <w:p>
-      <w:pPr>
-        <w:pStyle w:val="Heading2"/>
-      </w:pPr>
-      <w:r>
-        <w:t>8.1. Что проверяется</w:t>
-      </w:r>
-    </w:p>
-    <w:p>
-      <w:pPr>
-        <w:keepNext/>
-      </w:pPr>
-      <w:r>
-        <w:rPr>
-          <w:rFonts w:ascii="Calibri" w:hAnsi="Calibri"/>
-          <w:b w:val="0"/>
-          <w:color w:val="17202A"/>
-          <w:sz w:val="22"/>
-        </w:rPr>
-        <w:t>Проверка работает в обе стороны — для клиента и Агента. В админ-панели отдельно включаются и выключаются категории:</w:t>
-      </w:r>
-    </w:p>
-    <w:p>
-      <w:pPr>
-        <w:spacing w:after="80" w:line="300" w:lineRule="exact"/>
-        <w:ind w:left="605" w:hanging="374"/>
-      </w:pPr>
-      <w:r>
-        <w:rPr>
-          <w:rFonts w:ascii="Calibri" w:hAnsi="Calibri"/>
-          <w:color w:val="17202A"/>
-          <w:sz w:val="22"/>
-        </w:rPr>
-        <w:t xml:space="preserve">•  </w:t>
-      </w:r>
-      <w:r>
-        <w:rPr>
-          <w:rFonts w:ascii="Calibri" w:hAnsi="Calibri"/>
-          <w:b w:val="0"/>
-          <w:color w:val="17202A"/>
-          <w:sz w:val="22"/>
-        </w:rPr>
-        <w:t>телефон;</w:t>
-      </w:r>
-    </w:p>
-    <w:p>
-      <w:pPr>
-        <w:spacing w:after="80" w:line="300" w:lineRule="exact"/>
-        <w:ind w:left="605" w:hanging="374"/>
-      </w:pPr>
-      <w:r>
-        <w:rPr>
-          <w:rFonts w:ascii="Calibri" w:hAnsi="Calibri"/>
-          <w:color w:val="17202A"/>
-          <w:sz w:val="22"/>
-        </w:rPr>
-        <w:t xml:space="preserve">•  </w:t>
-      </w:r>
-      <w:r>
-        <w:rPr>
-          <w:rFonts w:ascii="Calibri" w:hAnsi="Calibri"/>
-          <w:b w:val="0"/>
-          <w:color w:val="17202A"/>
-          <w:sz w:val="22"/>
-        </w:rPr>
-        <w:t>email;</w:t>
-      </w:r>
-    </w:p>
-    <w:p>
-      <w:pPr>
-        <w:spacing w:after="80" w:line="300" w:lineRule="exact"/>
-        <w:ind w:left="605" w:hanging="374"/>
-      </w:pPr>
-      <w:r>
-        <w:rPr>
-          <w:rFonts w:ascii="Calibri" w:hAnsi="Calibri"/>
-          <w:color w:val="17202A"/>
-          <w:sz w:val="22"/>
-        </w:rPr>
-        <w:t xml:space="preserve">•  </w:t>
-      </w:r>
-      <w:r>
-        <w:rPr>
-          <w:rFonts w:ascii="Calibri" w:hAnsi="Calibri"/>
-          <w:b w:val="0"/>
-          <w:color w:val="17202A"/>
-          <w:sz w:val="22"/>
-        </w:rPr>
-        <w:t>username или ссылка мессенджера/социальной сети;</w:t>
-      </w:r>
-    </w:p>
-    <w:p>
-      <w:pPr>
-        <w:spacing w:after="80" w:line="300" w:lineRule="exact"/>
-        <w:ind w:left="605" w:hanging="374"/>
-      </w:pPr>
-      <w:r>
-        <w:rPr>
-          <w:rFonts w:ascii="Calibri" w:hAnsi="Calibri"/>
-          <w:color w:val="17202A"/>
-          <w:sz w:val="22"/>
-        </w:rPr>
-        <w:t xml:space="preserve">•  </w:t>
-      </w:r>
-      <w:r>
-        <w:rPr>
-          <w:rFonts w:ascii="Calibri" w:hAnsi="Calibri"/>
-          <w:b w:val="0"/>
-          <w:color w:val="17202A"/>
-          <w:sz w:val="22"/>
-        </w:rPr>
-        <w:t>внешняя ссылка или домен;</w:t>
-      </w:r>
-    </w:p>
-    <w:p>
-      <w:pPr>
-        <w:spacing w:after="80" w:line="300" w:lineRule="exact"/>
-        <w:ind w:left="605" w:hanging="374"/>
-      </w:pPr>
-      <w:r>
-        <w:rPr>
-          <w:rFonts w:ascii="Calibri" w:hAnsi="Calibri"/>
-          <w:color w:val="17202A"/>
-          <w:sz w:val="22"/>
-        </w:rPr>
-        <w:t xml:space="preserve">•  </w:t>
-      </w:r>
-      <w:r>
-        <w:rPr>
-          <w:rFonts w:ascii="Calibri" w:hAnsi="Calibri"/>
-          <w:b w:val="0"/>
-          <w:color w:val="17202A"/>
-          <w:sz w:val="22"/>
-        </w:rPr>
-        <w:t>точный почтовый или контактный адрес;</w:t>
-      </w:r>
-    </w:p>
-    <w:p>
-      <w:pPr>
-        <w:spacing w:after="80" w:line="300" w:lineRule="exact"/>
-        <w:ind w:left="605" w:hanging="374"/>
-      </w:pPr>
-      <w:r>
-        <w:rPr>
-          <w:rFonts w:ascii="Calibri" w:hAnsi="Calibri"/>
-          <w:color w:val="17202A"/>
-          <w:sz w:val="22"/>
-        </w:rPr>
-        <w:t xml:space="preserve">•  </w:t>
-      </w:r>
-      <w:r>
-        <w:rPr>
-          <w:rFonts w:ascii="Calibri" w:hAnsi="Calibri"/>
-          <w:b w:val="0"/>
-          <w:color w:val="17202A"/>
-          <w:sz w:val="22"/>
-        </w:rPr>
-        <w:t>номер документа;</w:t>
-      </w:r>
-    </w:p>
-    <w:p>
-      <w:pPr>
-        <w:spacing w:after="80" w:line="300" w:lineRule="exact"/>
-        <w:ind w:left="605" w:hanging="374"/>
-      </w:pPr>
-      <w:r>
-        <w:rPr>
-          <w:rFonts w:ascii="Calibri" w:hAnsi="Calibri"/>
-          <w:color w:val="17202A"/>
-          <w:sz w:val="22"/>
-        </w:rPr>
-        <w:t xml:space="preserve">•  </w:t>
-      </w:r>
-      <w:r>
-        <w:rPr>
-          <w:rFonts w:ascii="Calibri" w:hAnsi="Calibri"/>
-          <w:b w:val="0"/>
-          <w:color w:val="17202A"/>
-          <w:sz w:val="22"/>
-        </w:rPr>
-        <w:t>банковские и платёжные данные;</w:t>
-      </w:r>
-    </w:p>
-    <w:p>
-      <w:pPr>
-        <w:spacing w:after="80" w:line="300" w:lineRule="exact"/>
-        <w:ind w:left="605" w:hanging="374"/>
-      </w:pPr>
-      <w:r>
-        <w:rPr>
-          <w:rFonts w:ascii="Calibri" w:hAnsi="Calibri"/>
-          <w:color w:val="17202A"/>
-          <w:sz w:val="22"/>
-        </w:rPr>
-        <w:t xml:space="preserve">•  </w:t>
-      </w:r>
-      <w:r>
-        <w:rPr>
-          <w:rFonts w:ascii="Calibri" w:hAnsi="Calibri"/>
-          <w:b w:val="0"/>
-          <w:color w:val="17202A"/>
-          <w:sz w:val="22"/>
-        </w:rPr>
-        <w:t>пароль, код, token и другие authentication/secret данные;</w:t>
-      </w:r>
-    </w:p>
-    <w:p>
-      <w:pPr>
-        <w:spacing w:after="80" w:line="300" w:lineRule="exact"/>
-        <w:ind w:left="605" w:hanging="374"/>
-      </w:pPr>
-      <w:r>
-        <w:rPr>
-          <w:rFonts w:ascii="Calibri" w:hAnsi="Calibri"/>
-          <w:color w:val="17202A"/>
-          <w:sz w:val="22"/>
-        </w:rPr>
-        <w:t xml:space="preserve">•  </w:t>
-      </w:r>
-      <w:r>
-        <w:rPr>
-          <w:rFonts w:ascii="Calibri" w:hAnsi="Calibri"/>
-          <w:b w:val="0"/>
-          <w:color w:val="17202A"/>
-          <w:sz w:val="22"/>
-        </w:rPr>
-        <w:t>способы маскировки и обхода правил.</w:t>
-      </w:r>
-    </w:p>
-    <w:p>
-      <w:r>
-        <w:rPr>
-          <w:rFonts w:ascii="Calibri" w:hAnsi="Calibri"/>
-          <w:b w:val="0"/>
-          <w:color w:val="17202A"/>
-          <w:sz w:val="22"/>
-        </w:rPr>
-        <w:t>Дата, время и место рождения разрешены как консультационные данные. Их можно передавать в структурированных полях или свободном тексте. Исключение не разрешает точный адрес проживания или другие защищённые идентификаторы.</w:t>
-      </w:r>
-    </w:p>
-    <w:p>
-      <w:pPr>
-        <w:pStyle w:val="Heading2"/>
-      </w:pPr>
-      <w:r>
-        <w:t>8.2. Что видят стороны</w:t>
-      </w:r>
-    </w:p>
-    <w:p>
-      <w:pPr>
-        <w:keepNext/>
-      </w:pPr>
-      <w:r>
-        <w:rPr>
-          <w:rFonts w:ascii="Calibri" w:hAnsi="Calibri"/>
-          <w:b w:val="0"/>
-          <w:color w:val="17202A"/>
-          <w:sz w:val="22"/>
-        </w:rPr>
-        <w:t>Если в сообщении найден запрещённый фрагмент:</w:t>
-      </w:r>
-    </w:p>
-    <w:p>
-      <w:pPr>
-        <w:spacing w:after="80" w:line="300" w:lineRule="exact"/>
-        <w:ind w:left="605" w:hanging="374"/>
-      </w:pPr>
-      <w:r>
-        <w:rPr>
-          <w:rFonts w:ascii="Calibri" w:hAnsi="Calibri"/>
-          <w:color w:val="17202A"/>
-          <w:sz w:val="22"/>
-        </w:rPr>
-        <w:t xml:space="preserve">•  </w:t>
-      </w:r>
-      <w:r>
-        <w:rPr>
-          <w:rFonts w:ascii="Calibri" w:hAnsi="Calibri"/>
-          <w:b w:val="0"/>
-          <w:color w:val="17202A"/>
-          <w:sz w:val="22"/>
-        </w:rPr>
-        <w:t>отправитель продолжает видеть свой исходный текст;</w:t>
-      </w:r>
-    </w:p>
-    <w:p>
-      <w:pPr>
-        <w:spacing w:after="80" w:line="300" w:lineRule="exact"/>
-        <w:ind w:left="605" w:hanging="374"/>
-      </w:pPr>
-      <w:r>
-        <w:rPr>
-          <w:rFonts w:ascii="Calibri" w:hAnsi="Calibri"/>
-          <w:color w:val="17202A"/>
-          <w:sz w:val="22"/>
-        </w:rPr>
-        <w:t xml:space="preserve">•  </w:t>
-      </w:r>
-      <w:r>
-        <w:rPr>
-          <w:rFonts w:ascii="Calibri" w:hAnsi="Calibri"/>
-          <w:b w:val="0"/>
-          <w:color w:val="17202A"/>
-          <w:sz w:val="22"/>
-        </w:rPr>
-        <w:t>отправитель получает отдельное системное предупреждение о нарушении;</w:t>
-      </w:r>
-    </w:p>
-    <w:p>
-      <w:pPr>
-        <w:spacing w:after="80" w:line="300" w:lineRule="exact"/>
-        <w:ind w:left="605" w:hanging="374"/>
-      </w:pPr>
-      <w:r>
-        <w:rPr>
-          <w:rFonts w:ascii="Calibri" w:hAnsi="Calibri"/>
-          <w:color w:val="17202A"/>
-          <w:sz w:val="22"/>
-        </w:rPr>
-        <w:t xml:space="preserve">•  </w:t>
-      </w:r>
-      <w:r>
-        <w:rPr>
-          <w:rFonts w:ascii="Calibri" w:hAnsi="Calibri"/>
-          <w:b w:val="0"/>
-          <w:color w:val="17202A"/>
-          <w:sz w:val="22"/>
-        </w:rPr>
-        <w:t xml:space="preserve">получатель видит каждый запрещённый фрагмент заменённым на слово </w:t>
-      </w:r>
-      <w:r>
-        <w:rPr>
-          <w:rFonts w:ascii="Calibri" w:hAnsi="Calibri"/>
-          <w:b/>
-          <w:color w:val="17202A"/>
-          <w:sz w:val="22"/>
-        </w:rPr>
-        <w:t>«ЦЕНЗУРА»</w:t>
-      </w:r>
-      <w:r>
-        <w:rPr>
-          <w:rFonts w:ascii="Calibri" w:hAnsi="Calibri"/>
-          <w:b w:val="0"/>
-          <w:color w:val="17202A"/>
-          <w:sz w:val="22"/>
-        </w:rPr>
-        <w:t>;</w:t>
-      </w:r>
-    </w:p>
-    <w:p>
-      <w:pPr>
-        <w:spacing w:after="80" w:line="300" w:lineRule="exact"/>
-        <w:ind w:left="605" w:hanging="374"/>
-      </w:pPr>
-      <w:r>
-        <w:rPr>
-          <w:rFonts w:ascii="Calibri" w:hAnsi="Calibri"/>
-          <w:color w:val="17202A"/>
-          <w:sz w:val="22"/>
-        </w:rPr>
-        <w:t xml:space="preserve">•  </w:t>
-      </w:r>
-      <w:r>
-        <w:rPr>
-          <w:rFonts w:ascii="Calibri" w:hAnsi="Calibri"/>
-          <w:b w:val="0"/>
-          <w:color w:val="17202A"/>
-          <w:sz w:val="22"/>
-        </w:rPr>
-        <w:t>исходный фрагмент не раскрывается получателю через reply/quote, уведомления, поиск, историю или другую доступную поверхность.</w:t>
-      </w:r>
-    </w:p>
-    <w:p>
-      <w:r>
-        <w:rPr>
-          <w:rFonts w:ascii="Calibri" w:hAnsi="Calibri"/>
-          <w:b w:val="0"/>
-          <w:color w:val="17202A"/>
-          <w:sz w:val="22"/>
-        </w:rPr>
-        <w:t>Разрешённая часть сообщения доставляется. Повторная обработка того же сообщения не создаёт дубль сообщения, предупреждения или incident.</w:t>
-      </w:r>
-    </w:p>
-    <w:p>
-      <w:pPr>
-        <w:pStyle w:val="Heading2"/>
-      </w:pPr>
-      <w:r>
-        <w:t>8.3. Мониторинг попыток</w:t>
-      </w:r>
-    </w:p>
-    <w:p>
-      <w:r>
-        <w:rPr>
-          <w:rFonts w:ascii="Calibri" w:hAnsi="Calibri"/>
-          <w:b w:val="0"/>
-          <w:color w:val="17202A"/>
-          <w:sz w:val="22"/>
-        </w:rPr>
-        <w:t xml:space="preserve">Каждая попытка фиксируется в существующем разделе админ-панели </w:t>
-      </w:r>
-      <w:r>
-        <w:rPr>
-          <w:rFonts w:ascii="Calibri" w:hAnsi="Calibri"/>
-          <w:b/>
-          <w:color w:val="17202A"/>
-          <w:sz w:val="22"/>
-        </w:rPr>
-        <w:t>«Сообщения»</w:t>
-      </w:r>
-      <w:r>
-        <w:rPr>
-          <w:rFonts w:ascii="Calibri" w:hAnsi="Calibri"/>
-          <w:b w:val="0"/>
-          <w:color w:val="17202A"/>
-          <w:sz w:val="22"/>
-        </w:rPr>
-        <w:t xml:space="preserve"> как фильтр или дочерняя страница. Для каждой записи видны actor и роль, клиент, Эксперт, диалог/session, время, категории, версия правила, число попыток и принятое действие.</w:t>
-      </w:r>
-    </w:p>
-    <w:p>
-      <w:r>
-        <w:rPr>
-          <w:rFonts w:ascii="Calibri" w:hAnsi="Calibri"/>
-          <w:b w:val="0"/>
-          <w:color w:val="17202A"/>
-          <w:sz w:val="22"/>
-        </w:rPr>
-        <w:t>В MVP список попыток и ограниченный просмотр оригинала доступны только super-admin. Просмотр оригинала также попадает в audit. Обычная история и аналитика используют только безопасный для получателя текст.</w:t>
-      </w:r>
-    </w:p>
-    <w:p>
-      <w:pPr>
-        <w:pStyle w:val="Heading1"/>
-      </w:pPr>
-      <w:r>
-        <w:t>9. Потеря связи и повторная доставка</w:t>
-      </w:r>
-    </w:p>
-    <w:p>
-      <w:pPr>
-        <w:pStyle w:val="Heading2"/>
-      </w:pPr>
-      <w:r>
-        <w:t>9.1. Клиент потерял связь</w:t>
-      </w:r>
-    </w:p>
-    <w:p>
-      <w:pPr>
-        <w:keepNext/>
-      </w:pPr>
-      <w:r>
-        <w:rPr>
-          <w:rFonts w:ascii="Calibri" w:hAnsi="Calibri"/>
-          <w:b w:val="0"/>
-          <w:color w:val="17202A"/>
-          <w:sz w:val="22"/>
-        </w:rPr>
-        <w:t xml:space="preserve">Во время paid session запускается отдельный </w:t>
+        <w:t xml:space="preserve">, </w:t>
       </w:r>
       <w:r>
         <w:rPr>
@@ -2496,7 +2017,7 @@
           <w:color w:val="31445A"/>
           <w:sz w:val="21"/>
         </w:rPr>
-        <w:t>client reconnect grace</w:t>
+        <w:t>повторить</w:t>
       </w:r>
       <w:r>
         <w:rPr>
@@ -2505,28 +2026,73 @@
           <w:color w:val="17202A"/>
           <w:sz w:val="22"/>
         </w:rPr>
-        <w:t xml:space="preserve">. Начальное значение — </w:t>
-      </w:r>
-      <w:r>
-        <w:rPr>
-          <w:rFonts w:ascii="Calibri" w:hAnsi="Calibri"/>
-          <w:b/>
-          <w:color w:val="17202A"/>
-          <w:sz w:val="22"/>
-        </w:rPr>
-        <w:t>60 секунд</w:t>
-      </w:r>
-      <w:r>
-        <w:rPr>
-          <w:rFonts w:ascii="Calibri" w:hAnsi="Calibri"/>
-          <w:b w:val="0"/>
-          <w:color w:val="17202A"/>
-          <w:sz w:val="22"/>
-        </w:rPr>
-        <w:t>, оно управляется в админ-панели и не связано с grace Агента.</w:t>
+        <w:t>. Typing, delivered и read не запускают, не останавливают и не продлевают списание credits.</w:t>
       </w:r>
     </w:p>
     <w:p>
+      <w:r>
+        <w:rPr>
+          <w:rFonts w:ascii="Calibri" w:hAnsi="Calibri"/>
+          <w:b w:val="0"/>
+          <w:color w:val="17202A"/>
+          <w:sz w:val="22"/>
+        </w:rPr>
+        <w:t>Агент может редактировать уже отправленное сообщение Эксперта. Клиент видит пометку «изменено», а audit сохраняет прежнюю версию, автора изменения и время. Политика редактирования отправленных сообщений клиента не входит в текущий этап и не должна появиться неявно.</w:t>
+      </w:r>
+    </w:p>
+    <w:p>
+      <w:r>
+        <w:rPr>
+          <w:rFonts w:ascii="Calibri" w:hAnsi="Calibri"/>
+          <w:b w:val="0"/>
+          <w:color w:val="17202A"/>
+          <w:sz w:val="22"/>
+        </w:rPr>
+        <w:t>Клиент и Агент не могут физически удалить отправленное сообщение. Staff может скрыть запрещённый контент только с обязательной причиной; audit-факт и закрытая история сохраняются.</w:t>
+      </w:r>
+    </w:p>
+    <w:p>
+      <w:r>
+        <w:rPr>
+          <w:rFonts w:ascii="Calibri" w:hAnsi="Calibri"/>
+          <w:b w:val="0"/>
+          <w:color w:val="17202A"/>
+          <w:sz w:val="22"/>
+        </w:rPr>
+        <w:t>Шаблоны ответов являются необязательными редактируемыми подсказками. Агент самостоятельно выбирает или изменяет текст и явно отправляет его. Автоматическая отправка шаблона, AI-подсказки или подготовленного ответа запрещена.</w:t>
+      </w:r>
+    </w:p>
+    <w:p>
+      <w:pPr>
+        <w:pStyle w:val="Heading1"/>
+      </w:pPr>
+      <w:r>
+        <w:t>8. Цензура контактов и защищённых данных</w:t>
+      </w:r>
+    </w:p>
+    <w:p>
+      <w:pPr>
+        <w:pStyle w:val="Heading2"/>
+      </w:pPr>
+      <w:r>
+        <w:t>8.1. Что проверяется</w:t>
+      </w:r>
+    </w:p>
+    <w:p>
+      <w:pPr>
+        <w:keepNext/>
+      </w:pPr>
+      <w:r>
+        <w:rPr>
+          <w:rFonts w:ascii="Calibri" w:hAnsi="Calibri"/>
+          <w:b w:val="0"/>
+          <w:color w:val="17202A"/>
+          <w:sz w:val="22"/>
+        </w:rPr>
+        <w:t>Проверка работает в обе стороны — для клиента и Агента. В админ-панели отдельно включаются и выключаются категории:</w:t>
+      </w:r>
+    </w:p>
+    <w:p>
       <w:pPr>
         <w:spacing w:after="80" w:line="300" w:lineRule="exact"/>
         <w:ind w:left="605" w:hanging="374"/>
@@ -2546,7 +2112,7 @@
           <w:color w:val="17202A"/>
           <w:sz w:val="22"/>
         </w:rPr>
-        <w:t>новая paid-минута во время grace не начинается;</w:t>
+        <w:t>телефон;</w:t>
       </w:r>
     </w:p>
     <w:p>
@@ -2569,7 +2135,7 @@
           <w:color w:val="17202A"/>
           <w:sz w:val="22"/>
         </w:rPr>
-        <w:t>возврат до timeout продолжает ту же session;</w:t>
+        <w:t>email;</w:t>
       </w:r>
     </w:p>
     <w:p>
@@ -2592,7 +2158,7 @@
           <w:color w:val="17202A"/>
           <w:sz w:val="22"/>
         </w:rPr>
-        <w:t>timeout завершает session как technical end и показывает route в поддержку;</w:t>
+        <w:t>username или ссылка мессенджера/социальной сети;</w:t>
       </w:r>
     </w:p>
     <w:p>
@@ -2615,21 +2181,45 @@
           <w:color w:val="17202A"/>
           <w:sz w:val="22"/>
         </w:rPr>
-        <w:t>автоматическая компенсация не выдаётся: Эксперт решает вопрос купона по отдельному регламенту.</w:t>
+        <w:t>внешняя ссылка или домен;</w:t>
       </w:r>
     </w:p>
     <w:p>
       <w:pPr>
-        <w:pStyle w:val="Heading2"/>
-      </w:pPr>
-      <w:r>
-        <w:t>9.2. Агент или Эксперт стал недоступен</w:t>
+        <w:spacing w:after="80" w:line="300" w:lineRule="exact"/>
+        <w:ind w:left="605" w:hanging="374"/>
+      </w:pPr>
+      <w:r>
+        <w:rPr>
+          <w:rFonts w:ascii="Calibri" w:hAnsi="Calibri"/>
+          <w:color w:val="17202A"/>
+          <w:sz w:val="22"/>
+        </w:rPr>
+        <w:t xml:space="preserve">•  </w:t>
+      </w:r>
+      <w:r>
+        <w:rPr>
+          <w:rFonts w:ascii="Calibri" w:hAnsi="Calibri"/>
+          <w:b w:val="0"/>
+          <w:color w:val="17202A"/>
+          <w:sz w:val="22"/>
+        </w:rPr>
+        <w:t>точный почтовый или контактный адрес;</w:t>
       </w:r>
     </w:p>
     <w:p>
       <w:pPr>
-        <w:keepNext/>
-      </w:pPr>
+        <w:spacing w:after="80" w:line="300" w:lineRule="exact"/>
+        <w:ind w:left="605" w:hanging="374"/>
+      </w:pPr>
+      <w:r>
+        <w:rPr>
+          <w:rFonts w:ascii="Calibri" w:hAnsi="Calibri"/>
+          <w:color w:val="17202A"/>
+          <w:sz w:val="22"/>
+        </w:rPr>
+        <w:t xml:space="preserve">•  </w:t>
+      </w:r>
       <w:r>
         <w:rPr>
           <w:rFonts w:ascii="Calibri" w:hAnsi="Calibri"/>
@@ -2637,7 +2227,7 @@
           <w:color w:val="17202A"/>
           <w:sz w:val="22"/>
         </w:rPr>
-        <w:t>При нарушении paid-response SLA:</w:t>
+        <w:t>номер документа;</w:t>
       </w:r>
     </w:p>
     <w:p>
@@ -2660,7 +2250,7 @@
           <w:color w:val="17202A"/>
           <w:sz w:val="22"/>
         </w:rPr>
-        <w:t>текущая начатая минута завершается;</w:t>
+        <w:t>банковские и платёжные данные;</w:t>
       </w:r>
     </w:p>
     <w:p>
@@ -2683,7 +2273,7 @@
           <w:color w:val="17202A"/>
           <w:sz w:val="22"/>
         </w:rPr>
-        <w:t>следующая минута не начинается;</w:t>
+        <w:t>пароль, код, token и другие authentication/secret данные;</w:t>
       </w:r>
     </w:p>
     <w:p>
@@ -2706,10 +2296,43 @@
           <w:color w:val="17202A"/>
           <w:sz w:val="22"/>
         </w:rPr>
-        <w:t>создаётся один связанный quality/support incident;</w:t>
+        <w:t>способы маскировки и обхода правил.</w:t>
       </w:r>
     </w:p>
     <w:p>
+      <w:r>
+        <w:rPr>
+          <w:rFonts w:ascii="Calibri" w:hAnsi="Calibri"/>
+          <w:b w:val="0"/>
+          <w:color w:val="17202A"/>
+          <w:sz w:val="22"/>
+        </w:rPr>
+        <w:t>Дата, время и место рождения разрешены как консультационные данные. Их можно передавать в структурированных полях или свободном тексте. Исключение не разрешает точный адрес проживания или другие защищённые идентификаторы.</w:t>
+      </w:r>
+    </w:p>
+    <w:p>
+      <w:pPr>
+        <w:pStyle w:val="Heading2"/>
+      </w:pPr>
+      <w:r>
+        <w:t>8.2. Что видят стороны</w:t>
+      </w:r>
+    </w:p>
+    <w:p>
+      <w:pPr>
+        <w:keepNext/>
+      </w:pPr>
+      <w:r>
+        <w:rPr>
+          <w:rFonts w:ascii="Calibri" w:hAnsi="Calibri"/>
+          <w:b w:val="0"/>
+          <w:color w:val="17202A"/>
+          <w:sz w:val="22"/>
+        </w:rPr>
+        <w:t>Если в сообщении найден запрещённый фрагмент:</w:t>
+      </w:r>
+    </w:p>
+    <w:p>
       <w:pPr>
         <w:spacing w:after="80" w:line="300" w:lineRule="exact"/>
         <w:ind w:left="605" w:hanging="374"/>
@@ -2729,10 +2352,22 @@
           <w:color w:val="17202A"/>
           <w:sz w:val="22"/>
         </w:rPr>
-        <w:t>клиент получает понятное сообщение о технической ошибке и недоступности Эксперта.</w:t>
+        <w:t>отправитель продолжает видеть свой исходный текст;</w:t>
       </w:r>
     </w:p>
     <w:p>
+      <w:pPr>
+        <w:spacing w:after="80" w:line="300" w:lineRule="exact"/>
+        <w:ind w:left="605" w:hanging="374"/>
+      </w:pPr>
+      <w:r>
+        <w:rPr>
+          <w:rFonts w:ascii="Calibri" w:hAnsi="Calibri"/>
+          <w:color w:val="17202A"/>
+          <w:sz w:val="22"/>
+        </w:rPr>
+        <w:t xml:space="preserve">•  </w:t>
+      </w:r>
       <w:r>
         <w:rPr>
           <w:rFonts w:ascii="Calibri" w:hAnsi="Calibri"/>
@@ -2740,7 +2375,171 @@
           <w:color w:val="17202A"/>
           <w:sz w:val="22"/>
         </w:rPr>
-        <w:t xml:space="preserve">Сообщение может обещать </w:t>
+        <w:t>отправитель получает отдельное системное предупреждение о нарушении;</w:t>
+      </w:r>
+    </w:p>
+    <w:p>
+      <w:pPr>
+        <w:spacing w:after="80" w:line="300" w:lineRule="exact"/>
+        <w:ind w:left="605" w:hanging="374"/>
+      </w:pPr>
+      <w:r>
+        <w:rPr>
+          <w:rFonts w:ascii="Calibri" w:hAnsi="Calibri"/>
+          <w:color w:val="17202A"/>
+          <w:sz w:val="22"/>
+        </w:rPr>
+        <w:t xml:space="preserve">•  </w:t>
+      </w:r>
+      <w:r>
+        <w:rPr>
+          <w:rFonts w:ascii="Calibri" w:hAnsi="Calibri"/>
+          <w:b w:val="0"/>
+          <w:color w:val="17202A"/>
+          <w:sz w:val="22"/>
+        </w:rPr>
+        <w:t xml:space="preserve">получатель видит каждый запрещённый фрагмент заменённым на слово </w:t>
+      </w:r>
+      <w:r>
+        <w:rPr>
+          <w:rFonts w:ascii="Calibri" w:hAnsi="Calibri"/>
+          <w:b/>
+          <w:color w:val="17202A"/>
+          <w:sz w:val="22"/>
+        </w:rPr>
+        <w:t>«ЦЕНЗУРА»</w:t>
+      </w:r>
+      <w:r>
+        <w:rPr>
+          <w:rFonts w:ascii="Calibri" w:hAnsi="Calibri"/>
+          <w:b w:val="0"/>
+          <w:color w:val="17202A"/>
+          <w:sz w:val="22"/>
+        </w:rPr>
+        <w:t>;</w:t>
+      </w:r>
+    </w:p>
+    <w:p>
+      <w:pPr>
+        <w:spacing w:after="80" w:line="300" w:lineRule="exact"/>
+        <w:ind w:left="605" w:hanging="374"/>
+      </w:pPr>
+      <w:r>
+        <w:rPr>
+          <w:rFonts w:ascii="Calibri" w:hAnsi="Calibri"/>
+          <w:color w:val="17202A"/>
+          <w:sz w:val="22"/>
+        </w:rPr>
+        <w:t xml:space="preserve">•  </w:t>
+      </w:r>
+      <w:r>
+        <w:rPr>
+          <w:rFonts w:ascii="Calibri" w:hAnsi="Calibri"/>
+          <w:b w:val="0"/>
+          <w:color w:val="17202A"/>
+          <w:sz w:val="22"/>
+        </w:rPr>
+        <w:t>исходный фрагмент не раскрывается получателю через reply/quote, уведомления, поиск, историю или другую доступную поверхность.</w:t>
+      </w:r>
+    </w:p>
+    <w:p>
+      <w:r>
+        <w:rPr>
+          <w:rFonts w:ascii="Calibri" w:hAnsi="Calibri"/>
+          <w:b w:val="0"/>
+          <w:color w:val="17202A"/>
+          <w:sz w:val="22"/>
+        </w:rPr>
+        <w:t>Разрешённая часть сообщения доставляется. Повторная обработка того же сообщения не создаёт дубль сообщения, предупреждения или incident.</w:t>
+      </w:r>
+    </w:p>
+    <w:p>
+      <w:pPr>
+        <w:pStyle w:val="Heading2"/>
+      </w:pPr>
+      <w:r>
+        <w:t>8.3. Мониторинг попыток</w:t>
+      </w:r>
+    </w:p>
+    <w:p>
+      <w:r>
+        <w:rPr>
+          <w:rFonts w:ascii="Calibri" w:hAnsi="Calibri"/>
+          <w:b w:val="0"/>
+          <w:color w:val="17202A"/>
+          <w:sz w:val="22"/>
+        </w:rPr>
+        <w:t xml:space="preserve">Каждая попытка фиксируется в существующем разделе админ-панели </w:t>
+      </w:r>
+      <w:r>
+        <w:rPr>
+          <w:rFonts w:ascii="Calibri" w:hAnsi="Calibri"/>
+          <w:b/>
+          <w:color w:val="17202A"/>
+          <w:sz w:val="22"/>
+        </w:rPr>
+        <w:t>«Сообщения»</w:t>
+      </w:r>
+      <w:r>
+        <w:rPr>
+          <w:rFonts w:ascii="Calibri" w:hAnsi="Calibri"/>
+          <w:b w:val="0"/>
+          <w:color w:val="17202A"/>
+          <w:sz w:val="22"/>
+        </w:rPr>
+        <w:t xml:space="preserve"> как фильтр или дочерняя страница. Для каждой записи видны actor и роль, клиент, Эксперт, диалог/session, время, категории, версия правила, число попыток и принятое действие.</w:t>
+      </w:r>
+    </w:p>
+    <w:p>
+      <w:r>
+        <w:rPr>
+          <w:rFonts w:ascii="Calibri" w:hAnsi="Calibri"/>
+          <w:b w:val="0"/>
+          <w:color w:val="17202A"/>
+          <w:sz w:val="22"/>
+        </w:rPr>
+        <w:t>В MVP список попыток и ограниченный просмотр оригинала доступны только super-admin. Просмотр оригинала также попадает в audit. Обычная история и аналитика используют только безопасный для получателя текст.</w:t>
+      </w:r>
+    </w:p>
+    <w:p>
+      <w:pPr>
+        <w:pStyle w:val="Heading1"/>
+      </w:pPr>
+      <w:r>
+        <w:t>9. Потеря связи и повторная доставка</w:t>
+      </w:r>
+    </w:p>
+    <w:p>
+      <w:r>
+        <w:rPr>
+          <w:rFonts w:ascii="Calibri" w:hAnsi="Calibri"/>
+          <w:b w:val="0"/>
+          <w:color w:val="17202A"/>
+          <w:sz w:val="22"/>
+        </w:rPr>
+        <w:t>Таймеры reconnect, финансовые последствия, technical end и правила компенсации принадлежат G1.3/G2/G6. G1.2 получает их состояние и результат как входные данные, отображает их в чате и обеспечивает надёжную доставку сообщений, но не запускает lifecycle-таймер, не завершает session и не начисляет компенсацию самостоятельно.</w:t>
+      </w:r>
+    </w:p>
+    <w:p>
+      <w:pPr>
+        <w:pStyle w:val="Heading2"/>
+      </w:pPr>
+      <w:r>
+        <w:t>9.1. Клиент потерял связь</w:t>
+      </w:r>
+    </w:p>
+    <w:p>
+      <w:pPr>
+        <w:keepNext/>
+      </w:pPr>
+      <w:r>
+        <w:rPr>
+          <w:rFonts w:ascii="Calibri" w:hAnsi="Calibri"/>
+          <w:b w:val="0"/>
+          <w:color w:val="17202A"/>
+          <w:sz w:val="22"/>
+        </w:rPr>
+        <w:t xml:space="preserve">Во время paid session G1.3 может передать в чат состояние отдельного </w:t>
       </w:r>
       <w:r>
         <w:rPr>
@@ -2748,7 +2547,7 @@
           <w:color w:val="31445A"/>
           <w:sz w:val="21"/>
         </w:rPr>
-        <w:t>N</w:t>
+        <w:t>client reconnect grace</w:t>
       </w:r>
       <w:r>
         <w:rPr>
@@ -2757,21 +2556,63 @@
           <w:color w:val="17202A"/>
           <w:sz w:val="22"/>
         </w:rPr>
-        <w:t xml:space="preserve"> компенсационных минут только после фактического создания купона. Если купон не создан, клиент видит, что поддержку попросили проверить компенсацию.</w:t>
+        <w:t xml:space="preserve">. Его начальное значение — </w:t>
+      </w:r>
+      <w:r>
+        <w:rPr>
+          <w:rFonts w:ascii="Calibri" w:hAnsi="Calibri"/>
+          <w:b/>
+          <w:color w:val="17202A"/>
+          <w:sz w:val="22"/>
+        </w:rPr>
+        <w:t>60 секунд</w:t>
+      </w:r>
+      <w:r>
+        <w:rPr>
+          <w:rFonts w:ascii="Calibri" w:hAnsi="Calibri"/>
+          <w:b w:val="0"/>
+          <w:color w:val="17202A"/>
+          <w:sz w:val="22"/>
+        </w:rPr>
+        <w:t>, оно управляется в «Настройках консультаций» и не связано с grace Агента.</w:t>
       </w:r>
     </w:p>
     <w:p>
       <w:pPr>
-        <w:pStyle w:val="Heading2"/>
-      </w:pPr>
-      <w:r>
-        <w:t>9.3. Идемпотентность</w:t>
+        <w:spacing w:after="80" w:line="300" w:lineRule="exact"/>
+        <w:ind w:left="605" w:hanging="374"/>
+      </w:pPr>
+      <w:r>
+        <w:rPr>
+          <w:rFonts w:ascii="Calibri" w:hAnsi="Calibri"/>
+          <w:color w:val="17202A"/>
+          <w:sz w:val="22"/>
+        </w:rPr>
+        <w:t xml:space="preserve">•  </w:t>
+      </w:r>
+      <w:r>
+        <w:rPr>
+          <w:rFonts w:ascii="Calibri" w:hAnsi="Calibri"/>
+          <w:b w:val="0"/>
+          <w:color w:val="17202A"/>
+          <w:sz w:val="22"/>
+        </w:rPr>
+        <w:t>новая paid-минута во время grace не начинается;</w:t>
       </w:r>
     </w:p>
     <w:p>
       <w:pPr>
-        <w:keepNext/>
-      </w:pPr>
+        <w:spacing w:after="80" w:line="300" w:lineRule="exact"/>
+        <w:ind w:left="605" w:hanging="374"/>
+      </w:pPr>
+      <w:r>
+        <w:rPr>
+          <w:rFonts w:ascii="Calibri" w:hAnsi="Calibri"/>
+          <w:color w:val="17202A"/>
+          <w:sz w:val="22"/>
+        </w:rPr>
+        <w:t xml:space="preserve">•  </w:t>
+      </w:r>
       <w:r>
         <w:rPr>
           <w:rFonts w:ascii="Calibri" w:hAnsi="Calibri"/>
@@ -2779,7 +2620,7 @@
           <w:color w:val="17202A"/>
           <w:sz w:val="22"/>
         </w:rPr>
-        <w:t>Повторная доставка, reconnect или повторное нажатие не должны создавать дубликаты:</w:t>
+        <w:t>возврат до timeout продолжает ту же session;</w:t>
       </w:r>
     </w:p>
     <w:p>
@@ -2802,7 +2643,7 @@
           <w:color w:val="17202A"/>
           <w:sz w:val="22"/>
         </w:rPr>
-        <w:t>сообщения получателю;</w:t>
+        <w:t>timeout завершает session как technical end и показывает route в поддержку;</w:t>
       </w:r>
     </w:p>
     <w:p>
@@ -2825,11 +2666,33 @@
           <w:color w:val="17202A"/>
           <w:sz w:val="22"/>
         </w:rPr>
-        <w:t>системного предупреждения;</w:t>
+        <w:t>автоматическая компенсация не выдаётся: Эксперт решает вопрос купона по отдельному регламенту.</w:t>
       </w:r>
     </w:p>
     <w:p>
       <w:pPr>
+        <w:pStyle w:val="Heading2"/>
+      </w:pPr>
+      <w:r>
+        <w:t>9.2. Агент или Эксперт стал недоступен</w:t>
+      </w:r>
+    </w:p>
+    <w:p>
+      <w:pPr>
+        <w:keepNext/>
+      </w:pPr>
+      <w:r>
+        <w:rPr>
+          <w:rFonts w:ascii="Calibri" w:hAnsi="Calibri"/>
+          <w:b w:val="0"/>
+          <w:color w:val="17202A"/>
+          <w:sz w:val="22"/>
+        </w:rPr>
+        <w:t>При нарушении paid-response SLA:</w:t>
+      </w:r>
+    </w:p>
+    <w:p>
+      <w:pPr>
         <w:spacing w:after="80" w:line="300" w:lineRule="exact"/>
         <w:ind w:left="605" w:hanging="374"/>
       </w:pPr>
@@ -2848,7 +2711,7 @@
           <w:color w:val="17202A"/>
           <w:sz w:val="22"/>
         </w:rPr>
-        <w:t>incident;</w:t>
+        <w:t>текущая начатая минута завершается;</w:t>
       </w:r>
     </w:p>
     <w:p>
@@ -2871,7 +2734,7 @@
           <w:color w:val="17202A"/>
           <w:sz w:val="22"/>
         </w:rPr>
-        <w:t>coupon;</w:t>
+        <w:t>следующая минута не начинается;</w:t>
       </w:r>
     </w:p>
     <w:p>
@@ -2894,7 +2757,7 @@
           <w:color w:val="17202A"/>
           <w:sz w:val="22"/>
         </w:rPr>
-        <w:t>финансового события;</w:t>
+        <w:t>создаётся один связанный quality/support incident;</w:t>
       </w:r>
     </w:p>
     <w:p>
@@ -2917,21 +2780,10 @@
           <w:color w:val="17202A"/>
           <w:sz w:val="22"/>
         </w:rPr>
-        <w:t>consultation session.</w:t>
+        <w:t>клиент получает понятное сообщение о технической ошибке и недоступности Эксперта.</w:t>
       </w:r>
     </w:p>
     <w:p>
-      <w:pPr>
-        <w:pStyle w:val="Heading1"/>
-      </w:pPr>
-      <w:r>
-        <w:t>10. «История консультации»</w:t>
-      </w:r>
-    </w:p>
-    <w:p>
-      <w:pPr>
-        <w:keepNext/>
-      </w:pPr>
       <w:r>
         <w:rPr>
           <w:rFonts w:ascii="Calibri" w:hAnsi="Calibri"/>
@@ -2939,718 +2791,7 @@
           <w:color w:val="17202A"/>
           <w:sz w:val="22"/>
         </w:rPr>
-        <w:t>После завершения клиент видит:</w:t>
-      </w:r>
-    </w:p>
-    <w:p>
-      <w:pPr>
-        <w:spacing w:after="80" w:line="300" w:lineRule="exact"/>
-        <w:ind w:left="605" w:hanging="374"/>
-      </w:pPr>
-      <w:r>
-        <w:rPr>
-          <w:rFonts w:ascii="Calibri" w:hAnsi="Calibri"/>
-          <w:color w:val="17202A"/>
-          <w:sz w:val="22"/>
-        </w:rPr>
-        <w:t xml:space="preserve">•  </w:t>
-      </w:r>
-      <w:r>
-        <w:rPr>
-          <w:rFonts w:ascii="Calibri" w:hAnsi="Calibri"/>
-          <w:b w:val="0"/>
-          <w:color w:val="17202A"/>
-          <w:sz w:val="22"/>
-        </w:rPr>
-        <w:t>общую длительность;</w:t>
-      </w:r>
-    </w:p>
-    <w:p>
-      <w:pPr>
-        <w:spacing w:after="80" w:line="300" w:lineRule="exact"/>
-        <w:ind w:left="605" w:hanging="374"/>
-      </w:pPr>
-      <w:r>
-        <w:rPr>
-          <w:rFonts w:ascii="Calibri" w:hAnsi="Calibri"/>
-          <w:color w:val="17202A"/>
-          <w:sz w:val="22"/>
-        </w:rPr>
-        <w:t xml:space="preserve">•  </w:t>
-      </w:r>
-      <w:r>
-        <w:rPr>
-          <w:rFonts w:ascii="Calibri" w:hAnsi="Calibri"/>
-          <w:b w:val="0"/>
-          <w:color w:val="17202A"/>
-          <w:sz w:val="22"/>
-        </w:rPr>
-        <w:t>списанные credits;</w:t>
-      </w:r>
-    </w:p>
-    <w:p>
-      <w:pPr>
-        <w:spacing w:after="80" w:line="300" w:lineRule="exact"/>
-        <w:ind w:left="605" w:hanging="374"/>
-      </w:pPr>
-      <w:r>
-        <w:rPr>
-          <w:rFonts w:ascii="Calibri" w:hAnsi="Calibri"/>
-          <w:color w:val="17202A"/>
-          <w:sz w:val="22"/>
-        </w:rPr>
-        <w:t xml:space="preserve">•  </w:t>
-      </w:r>
-      <w:r>
-        <w:rPr>
-          <w:rFonts w:ascii="Calibri" w:hAnsi="Calibri"/>
-          <w:b w:val="0"/>
-          <w:color w:val="17202A"/>
-          <w:sz w:val="22"/>
-        </w:rPr>
-        <w:t>применённую цену;</w:t>
-      </w:r>
-    </w:p>
-    <w:p>
-      <w:pPr>
-        <w:spacing w:after="80" w:line="300" w:lineRule="exact"/>
-        <w:ind w:left="605" w:hanging="374"/>
-      </w:pPr>
-      <w:r>
-        <w:rPr>
-          <w:rFonts w:ascii="Calibri" w:hAnsi="Calibri"/>
-          <w:color w:val="17202A"/>
-          <w:sz w:val="22"/>
-        </w:rPr>
-        <w:t xml:space="preserve">•  </w:t>
-      </w:r>
-      <w:r>
-        <w:rPr>
-          <w:rFonts w:ascii="Calibri" w:hAnsi="Calibri"/>
-          <w:b w:val="0"/>
-          <w:color w:val="17202A"/>
-          <w:sz w:val="22"/>
-        </w:rPr>
-        <w:t>понятную клиенту причину завершения;</w:t>
-      </w:r>
-    </w:p>
-    <w:p>
-      <w:pPr>
-        <w:spacing w:after="80" w:line="300" w:lineRule="exact"/>
-        <w:ind w:left="605" w:hanging="374"/>
-      </w:pPr>
-      <w:r>
-        <w:rPr>
-          <w:rFonts w:ascii="Calibri" w:hAnsi="Calibri"/>
-          <w:color w:val="17202A"/>
-          <w:sz w:val="22"/>
-        </w:rPr>
-        <w:t xml:space="preserve">•  </w:t>
-      </w:r>
-      <w:r>
-        <w:rPr>
-          <w:rFonts w:ascii="Calibri" w:hAnsi="Calibri"/>
-          <w:b w:val="0"/>
-          <w:color w:val="17202A"/>
-          <w:sz w:val="22"/>
-        </w:rPr>
-        <w:t>действие «Запросить новую консультацию»;</w:t>
-      </w:r>
-    </w:p>
-    <w:p>
-      <w:pPr>
-        <w:spacing w:after="80" w:line="300" w:lineRule="exact"/>
-        <w:ind w:left="605" w:hanging="374"/>
-      </w:pPr>
-      <w:r>
-        <w:rPr>
-          <w:rFonts w:ascii="Calibri" w:hAnsi="Calibri"/>
-          <w:color w:val="17202A"/>
-          <w:sz w:val="22"/>
-        </w:rPr>
-        <w:t xml:space="preserve">•  </w:t>
-      </w:r>
-      <w:r>
-        <w:rPr>
-          <w:rFonts w:ascii="Calibri" w:hAnsi="Calibri"/>
-          <w:b w:val="0"/>
-          <w:color w:val="17202A"/>
-          <w:sz w:val="22"/>
-        </w:rPr>
-        <w:t>оценку;</w:t>
-      </w:r>
-    </w:p>
-    <w:p>
-      <w:pPr>
-        <w:spacing w:after="80" w:line="300" w:lineRule="exact"/>
-        <w:ind w:left="605" w:hanging="374"/>
-      </w:pPr>
-      <w:r>
-        <w:rPr>
-          <w:rFonts w:ascii="Calibri" w:hAnsi="Calibri"/>
-          <w:color w:val="17202A"/>
-          <w:sz w:val="22"/>
-        </w:rPr>
-        <w:t xml:space="preserve">•  </w:t>
-      </w:r>
-      <w:r>
-        <w:rPr>
-          <w:rFonts w:ascii="Calibri" w:hAnsi="Calibri"/>
-          <w:b w:val="0"/>
-          <w:color w:val="17202A"/>
-          <w:sz w:val="22"/>
-        </w:rPr>
-        <w:t>route «Поддержка Nebula» / жалоба;</w:t>
-      </w:r>
-    </w:p>
-    <w:p>
-      <w:pPr>
-        <w:spacing w:after="80" w:line="300" w:lineRule="exact"/>
-        <w:ind w:left="605" w:hanging="374"/>
-      </w:pPr>
-      <w:r>
-        <w:rPr>
-          <w:rFonts w:ascii="Calibri" w:hAnsi="Calibri"/>
-          <w:color w:val="17202A"/>
-          <w:sz w:val="22"/>
-        </w:rPr>
-        <w:t xml:space="preserve">•  </w:t>
-      </w:r>
-      <w:r>
-        <w:rPr>
-          <w:rFonts w:ascii="Calibri" w:hAnsi="Calibri"/>
-          <w:b w:val="0"/>
-          <w:color w:val="17202A"/>
-          <w:sz w:val="22"/>
-        </w:rPr>
-        <w:t>читаемую «Историю консультации».</w:t>
-      </w:r>
-    </w:p>
-    <w:p>
-      <w:r>
-        <w:rPr>
-          <w:rFonts w:ascii="Calibri" w:hAnsi="Calibri"/>
-          <w:b w:val="0"/>
-          <w:color w:val="17202A"/>
-          <w:sz w:val="22"/>
-        </w:rPr>
-        <w:t>«История консультации» — это сообщения, видимые клиенту системные события, timestamps, пометки об изменении и границы session. Это не аудио- или видеотранскрипт.</w:t>
-      </w:r>
-    </w:p>
-    <w:p>
-      <w:r>
-        <w:rPr>
-          <w:rFonts w:ascii="Calibri" w:hAnsi="Calibri"/>
-          <w:b w:val="0"/>
-          <w:color w:val="17202A"/>
-          <w:sz w:val="22"/>
-        </w:rPr>
-        <w:t>В MVP история доступна только для чтения в личном кабинете. Скачивание и экспорт относятся к следующему этапу.</w:t>
-      </w:r>
-    </w:p>
-    <w:p>
-      <w:r>
-        <w:rPr>
-          <w:rFonts w:ascii="Calibri" w:hAnsi="Calibri"/>
-          <w:b w:val="0"/>
-          <w:color w:val="17202A"/>
-          <w:sz w:val="22"/>
-        </w:rPr>
-        <w:t xml:space="preserve">Начальный срок хранения — </w:t>
-      </w:r>
-      <w:r>
-        <w:rPr>
-          <w:rFonts w:ascii="Calibri" w:hAnsi="Calibri"/>
-          <w:b/>
-          <w:color w:val="17202A"/>
-          <w:sz w:val="22"/>
-        </w:rPr>
-        <w:t>24 месяца после завершения</w:t>
-      </w:r>
-      <w:r>
-        <w:rPr>
-          <w:rFonts w:ascii="Calibri" w:hAnsi="Calibri"/>
-          <w:b w:val="0"/>
-          <w:color w:val="17202A"/>
-          <w:sz w:val="22"/>
-        </w:rPr>
-        <w:t>, значение управляется в админ-панели и должно быть подтверждено legal/privacy review. Активная жалоба, refund, safety case или legal hold может приостановить удаление только связанных материалов; причина и снятие hold фиксируются.</w:t>
-      </w:r>
-    </w:p>
-    <w:p>
-      <w:pPr>
-        <w:pStyle w:val="Heading1"/>
-      </w:pPr>
-      <w:r>
-        <w:t>11. Что видно Агенту</w:t>
-      </w:r>
-    </w:p>
-    <w:p>
-      <w:pPr>
-        <w:keepNext/>
-      </w:pPr>
-      <w:r>
-        <w:rPr>
-          <w:rFonts w:ascii="Calibri" w:hAnsi="Calibri"/>
-          <w:b w:val="0"/>
-          <w:color w:val="17202A"/>
-          <w:sz w:val="22"/>
-        </w:rPr>
-        <w:t>В одном рабочем контуре Агент должен понимать:</w:t>
-      </w:r>
-    </w:p>
-    <w:p>
-      <w:pPr>
-        <w:spacing w:after="80" w:line="300" w:lineRule="exact"/>
-        <w:ind w:left="605" w:hanging="374"/>
-      </w:pPr>
-      <w:r>
-        <w:rPr>
-          <w:rFonts w:ascii="Calibri" w:hAnsi="Calibri"/>
-          <w:color w:val="17202A"/>
-          <w:sz w:val="22"/>
-        </w:rPr>
-        <w:t xml:space="preserve">•  </w:t>
-      </w:r>
-      <w:r>
-        <w:rPr>
-          <w:rFonts w:ascii="Calibri" w:hAnsi="Calibri"/>
-          <w:b w:val="0"/>
-          <w:color w:val="17202A"/>
-          <w:sz w:val="22"/>
-        </w:rPr>
-        <w:t>от какой экспертной анкеты он отвечает;</w:t>
-      </w:r>
-    </w:p>
-    <w:p>
-      <w:pPr>
-        <w:spacing w:after="80" w:line="300" w:lineRule="exact"/>
-        <w:ind w:left="605" w:hanging="374"/>
-      </w:pPr>
-      <w:r>
-        <w:rPr>
-          <w:rFonts w:ascii="Calibri" w:hAnsi="Calibri"/>
-          <w:color w:val="17202A"/>
-          <w:sz w:val="22"/>
-        </w:rPr>
-        <w:t xml:space="preserve">•  </w:t>
-      </w:r>
-      <w:r>
-        <w:rPr>
-          <w:rFonts w:ascii="Calibri" w:hAnsi="Calibri"/>
-          <w:b w:val="0"/>
-          <w:color w:val="17202A"/>
-          <w:sz w:val="22"/>
-        </w:rPr>
-        <w:t>какой клиент, кейс, диалог и session активны;</w:t>
-      </w:r>
-    </w:p>
-    <w:p>
-      <w:pPr>
-        <w:spacing w:after="80" w:line="300" w:lineRule="exact"/>
-        <w:ind w:left="605" w:hanging="374"/>
-      </w:pPr>
-      <w:r>
-        <w:rPr>
-          <w:rFonts w:ascii="Calibri" w:hAnsi="Calibri"/>
-          <w:color w:val="17202A"/>
-          <w:sz w:val="22"/>
-        </w:rPr>
-        <w:t xml:space="preserve">•  </w:t>
-      </w:r>
-      <w:r>
-        <w:rPr>
-          <w:rFonts w:ascii="Calibri" w:hAnsi="Calibri"/>
-          <w:b w:val="0"/>
-          <w:color w:val="17202A"/>
-          <w:sz w:val="22"/>
-        </w:rPr>
-        <w:t>free/trial/paid/pause/end состояние;</w:t>
-      </w:r>
-    </w:p>
-    <w:p>
-      <w:pPr>
-        <w:spacing w:after="80" w:line="300" w:lineRule="exact"/>
-        <w:ind w:left="605" w:hanging="374"/>
-      </w:pPr>
-      <w:r>
-        <w:rPr>
-          <w:rFonts w:ascii="Calibri" w:hAnsi="Calibri"/>
-          <w:color w:val="17202A"/>
-          <w:sz w:val="22"/>
-        </w:rPr>
-        <w:t xml:space="preserve">•  </w:t>
-      </w:r>
-      <w:r>
-        <w:rPr>
-          <w:rFonts w:ascii="Calibri" w:hAnsi="Calibri"/>
-          <w:b w:val="0"/>
-          <w:color w:val="17202A"/>
-          <w:sz w:val="22"/>
-        </w:rPr>
-        <w:t>разрешена ли отправка;</w:t>
-      </w:r>
-    </w:p>
-    <w:p>
-      <w:pPr>
-        <w:spacing w:after="80" w:line="300" w:lineRule="exact"/>
-        <w:ind w:left="605" w:hanging="374"/>
-      </w:pPr>
-      <w:r>
-        <w:rPr>
-          <w:rFonts w:ascii="Calibri" w:hAnsi="Calibri"/>
-          <w:color w:val="17202A"/>
-          <w:sz w:val="22"/>
-        </w:rPr>
-        <w:t xml:space="preserve">•  </w:t>
-      </w:r>
-      <w:r>
-        <w:rPr>
-          <w:rFonts w:ascii="Calibri" w:hAnsi="Calibri"/>
-          <w:b w:val="0"/>
-          <w:color w:val="17202A"/>
-          <w:sz w:val="22"/>
-        </w:rPr>
-        <w:t>актуальную версию правил;</w:t>
-      </w:r>
-    </w:p>
-    <w:p>
-      <w:pPr>
-        <w:spacing w:after="80" w:line="300" w:lineRule="exact"/>
-        <w:ind w:left="605" w:hanging="374"/>
-      </w:pPr>
-      <w:r>
-        <w:rPr>
-          <w:rFonts w:ascii="Calibri" w:hAnsi="Calibri"/>
-          <w:color w:val="17202A"/>
-          <w:sz w:val="22"/>
-        </w:rPr>
-        <w:t xml:space="preserve">•  </w:t>
-      </w:r>
-      <w:r>
-        <w:rPr>
-          <w:rFonts w:ascii="Calibri" w:hAnsi="Calibri"/>
-          <w:b w:val="0"/>
-          <w:color w:val="17202A"/>
-          <w:sz w:val="22"/>
-        </w:rPr>
-        <w:t>применимые quality/support/safety flags;</w:t>
-      </w:r>
-    </w:p>
-    <w:p>
-      <w:pPr>
-        <w:spacing w:after="80" w:line="300" w:lineRule="exact"/>
-        <w:ind w:left="605" w:hanging="374"/>
-      </w:pPr>
-      <w:r>
-        <w:rPr>
-          <w:rFonts w:ascii="Calibri" w:hAnsi="Calibri"/>
-          <w:color w:val="17202A"/>
-          <w:sz w:val="22"/>
-        </w:rPr>
-        <w:t xml:space="preserve">•  </w:t>
-      </w:r>
-      <w:r>
-        <w:rPr>
-          <w:rFonts w:ascii="Calibri" w:hAnsi="Calibri"/>
-          <w:b w:val="0"/>
-          <w:color w:val="17202A"/>
-          <w:sz w:val="22"/>
-        </w:rPr>
-        <w:t>требуется ли top-up, продолжение, завершение или передача в поддержку.</w:t>
-      </w:r>
-    </w:p>
-    <w:p>
-      <w:r>
-        <w:rPr>
-          <w:rFonts w:ascii="Calibri" w:hAnsi="Calibri"/>
-          <w:b w:val="0"/>
-          <w:color w:val="17202A"/>
-          <w:sz w:val="22"/>
-        </w:rPr>
-        <w:t>Деньги и состояние session не должны угадываться по разрозненным экранам.</w:t>
-      </w:r>
-    </w:p>
-    <w:p>
-      <w:pPr>
-        <w:pStyle w:val="Heading1"/>
-      </w:pPr>
-      <w:r>
-        <w:t>12. Что видно super-admin</w:t>
-      </w:r>
-    </w:p>
-    <w:p>
-      <w:pPr>
-        <w:keepNext/>
-      </w:pPr>
-      <w:r>
-        <w:rPr>
-          <w:rFonts w:ascii="Calibri" w:hAnsi="Calibri"/>
-          <w:b w:val="0"/>
-          <w:color w:val="17202A"/>
-          <w:sz w:val="22"/>
-        </w:rPr>
-        <w:t>Super-admin должен иметь возможность восстановить:</w:t>
-      </w:r>
-    </w:p>
-    <w:p>
-      <w:pPr>
-        <w:spacing w:after="80" w:line="300" w:lineRule="exact"/>
-        <w:ind w:left="605" w:hanging="374"/>
-      </w:pPr>
-      <w:r>
-        <w:rPr>
-          <w:rFonts w:ascii="Calibri" w:hAnsi="Calibri"/>
-          <w:color w:val="17202A"/>
-          <w:sz w:val="22"/>
-        </w:rPr>
-        <w:t xml:space="preserve">•  </w:t>
-      </w:r>
-      <w:r>
-        <w:rPr>
-          <w:rFonts w:ascii="Calibri" w:hAnsi="Calibri"/>
-          <w:b w:val="0"/>
-          <w:color w:val="17202A"/>
-          <w:sz w:val="22"/>
-        </w:rPr>
-        <w:t>выбранную публичную экспертную анкету;</w:t>
-      </w:r>
-    </w:p>
-    <w:p>
-      <w:pPr>
-        <w:spacing w:after="80" w:line="300" w:lineRule="exact"/>
-        <w:ind w:left="605" w:hanging="374"/>
-      </w:pPr>
-      <w:r>
-        <w:rPr>
-          <w:rFonts w:ascii="Calibri" w:hAnsi="Calibri"/>
-          <w:color w:val="17202A"/>
-          <w:sz w:val="22"/>
-        </w:rPr>
-        <w:t xml:space="preserve">•  </w:t>
-      </w:r>
-      <w:r>
-        <w:rPr>
-          <w:rFonts w:ascii="Calibri" w:hAnsi="Calibri"/>
-          <w:b w:val="0"/>
-          <w:color w:val="17202A"/>
-          <w:sz w:val="22"/>
-        </w:rPr>
-        <w:t>назначенного Агента в момент события;</w:t>
-      </w:r>
-    </w:p>
-    <w:p>
-      <w:pPr>
-        <w:spacing w:after="80" w:line="300" w:lineRule="exact"/>
-        <w:ind w:left="605" w:hanging="374"/>
-      </w:pPr>
-      <w:r>
-        <w:rPr>
-          <w:rFonts w:ascii="Calibri" w:hAnsi="Calibri"/>
-          <w:color w:val="17202A"/>
-          <w:sz w:val="22"/>
-        </w:rPr>
-        <w:t xml:space="preserve">•  </w:t>
-      </w:r>
-      <w:r>
-        <w:rPr>
-          <w:rFonts w:ascii="Calibri" w:hAnsi="Calibri"/>
-          <w:b w:val="0"/>
-          <w:color w:val="17202A"/>
-          <w:sz w:val="22"/>
-        </w:rPr>
-        <w:t>фактического автора и редактора;</w:t>
-      </w:r>
-    </w:p>
-    <w:p>
-      <w:pPr>
-        <w:spacing w:after="80" w:line="300" w:lineRule="exact"/>
-        <w:ind w:left="605" w:hanging="374"/>
-      </w:pPr>
-      <w:r>
-        <w:rPr>
-          <w:rFonts w:ascii="Calibri" w:hAnsi="Calibri"/>
-          <w:color w:val="17202A"/>
-          <w:sz w:val="22"/>
-        </w:rPr>
-        <w:t xml:space="preserve">•  </w:t>
-      </w:r>
-      <w:r>
-        <w:rPr>
-          <w:rFonts w:ascii="Calibri" w:hAnsi="Calibri"/>
-          <w:b w:val="0"/>
-          <w:color w:val="17202A"/>
-          <w:sz w:val="22"/>
-        </w:rPr>
-        <w:t>последовательность клиентских состояний;</w:t>
-      </w:r>
-    </w:p>
-    <w:p>
-      <w:pPr>
-        <w:spacing w:after="80" w:line="300" w:lineRule="exact"/>
-        <w:ind w:left="605" w:hanging="374"/>
-      </w:pPr>
-      <w:r>
-        <w:rPr>
-          <w:rFonts w:ascii="Calibri" w:hAnsi="Calibri"/>
-          <w:color w:val="17202A"/>
-          <w:sz w:val="22"/>
-        </w:rPr>
-        <w:t xml:space="preserve">•  </w:t>
-      </w:r>
-      <w:r>
-        <w:rPr>
-          <w:rFonts w:ascii="Calibri" w:hAnsi="Calibri"/>
-          <w:b w:val="0"/>
-          <w:color w:val="17202A"/>
-          <w:sz w:val="22"/>
-        </w:rPr>
-        <w:t>free/trial/paid переход;</w:t>
-      </w:r>
-    </w:p>
-    <w:p>
-      <w:pPr>
-        <w:spacing w:after="80" w:line="300" w:lineRule="exact"/>
-        <w:ind w:left="605" w:hanging="374"/>
-      </w:pPr>
-      <w:r>
-        <w:rPr>
-          <w:rFonts w:ascii="Calibri" w:hAnsi="Calibri"/>
-          <w:color w:val="17202A"/>
-          <w:sz w:val="22"/>
-        </w:rPr>
-        <w:t xml:space="preserve">•  </w:t>
-      </w:r>
-      <w:r>
-        <w:rPr>
-          <w:rFonts w:ascii="Calibri" w:hAnsi="Calibri"/>
-          <w:b w:val="0"/>
-          <w:color w:val="17202A"/>
-          <w:sz w:val="22"/>
-        </w:rPr>
-        <w:t>применённую цену и версию правил;</w:t>
-      </w:r>
-    </w:p>
-    <w:p>
-      <w:pPr>
-        <w:spacing w:after="80" w:line="300" w:lineRule="exact"/>
-        <w:ind w:left="605" w:hanging="374"/>
-      </w:pPr>
-      <w:r>
-        <w:rPr>
-          <w:rFonts w:ascii="Calibri" w:hAnsi="Calibri"/>
-          <w:color w:val="17202A"/>
-          <w:sz w:val="22"/>
-        </w:rPr>
-        <w:t xml:space="preserve">•  </w:t>
-      </w:r>
-      <w:r>
-        <w:rPr>
-          <w:rFonts w:ascii="Calibri" w:hAnsi="Calibri"/>
-          <w:b w:val="0"/>
-          <w:color w:val="17202A"/>
-          <w:sz w:val="22"/>
-        </w:rPr>
-        <w:t>censored attempts и действия по ним;</w:t>
-      </w:r>
-    </w:p>
-    <w:p>
-      <w:pPr>
-        <w:spacing w:after="80" w:line="300" w:lineRule="exact"/>
-        <w:ind w:left="605" w:hanging="374"/>
-      </w:pPr>
-      <w:r>
-        <w:rPr>
-          <w:rFonts w:ascii="Calibri" w:hAnsi="Calibri"/>
-          <w:color w:val="17202A"/>
-          <w:sz w:val="22"/>
-        </w:rPr>
-        <w:t xml:space="preserve">•  </w:t>
-      </w:r>
-      <w:r>
-        <w:rPr>
-          <w:rFonts w:ascii="Calibri" w:hAnsi="Calibri"/>
-          <w:b w:val="0"/>
-          <w:color w:val="17202A"/>
-          <w:sz w:val="22"/>
-        </w:rPr>
-        <w:t>ошибки доставки, abnormal end и reconnect;</w:t>
-      </w:r>
-    </w:p>
-    <w:p>
-      <w:pPr>
-        <w:spacing w:after="80" w:line="300" w:lineRule="exact"/>
-        <w:ind w:left="605" w:hanging="374"/>
-      </w:pPr>
-      <w:r>
-        <w:rPr>
-          <w:rFonts w:ascii="Calibri" w:hAnsi="Calibri"/>
-          <w:color w:val="17202A"/>
-          <w:sz w:val="22"/>
-        </w:rPr>
-        <w:t xml:space="preserve">•  </w:t>
-      </w:r>
-      <w:r>
-        <w:rPr>
-          <w:rFonts w:ascii="Calibri" w:hAnsi="Calibri"/>
-          <w:b w:val="0"/>
-          <w:color w:val="17202A"/>
-          <w:sz w:val="22"/>
-        </w:rPr>
-        <w:t>complaint/support/refund/QA контекст;</w:t>
-      </w:r>
-    </w:p>
-    <w:p>
-      <w:pPr>
-        <w:spacing w:after="80" w:line="300" w:lineRule="exact"/>
-        <w:ind w:left="605" w:hanging="374"/>
-      </w:pPr>
-      <w:r>
-        <w:rPr>
-          <w:rFonts w:ascii="Calibri" w:hAnsi="Calibri"/>
-          <w:color w:val="17202A"/>
-          <w:sz w:val="22"/>
-        </w:rPr>
-        <w:t xml:space="preserve">•  </w:t>
-      </w:r>
-      <w:r>
-        <w:rPr>
-          <w:rFonts w:ascii="Calibri" w:hAnsi="Calibri"/>
-          <w:b w:val="0"/>
-          <w:color w:val="17202A"/>
-          <w:sz w:val="22"/>
-        </w:rPr>
-        <w:t>историю переназначений и аварийных вмешательств.</w:t>
-      </w:r>
-    </w:p>
-    <w:p>
-      <w:pPr>
-        <w:pStyle w:val="Heading1"/>
-      </w:pPr>
-      <w:r>
-        <w:t>13. Настройки через админ-панель</w:t>
-      </w:r>
-    </w:p>
-    <w:p>
-      <w:pPr>
-        <w:pStyle w:val="Heading2"/>
-      </w:pPr>
-      <w:r>
-        <w:t>13.1. Место и название страницы</w:t>
-      </w:r>
-    </w:p>
-    <w:p>
-      <w:pPr>
-        <w:keepNext/>
-      </w:pPr>
-      <w:r>
-        <w:rPr>
-          <w:rFonts w:ascii="Calibri" w:hAnsi="Calibri"/>
-          <w:b w:val="0"/>
-          <w:color w:val="17202A"/>
-          <w:sz w:val="22"/>
-        </w:rPr>
-        <w:t xml:space="preserve">В существующем </w:t>
+        <w:t xml:space="preserve">Сообщение может обещать </w:t>
       </w:r>
       <w:r>
         <w:rPr>
@@ -3658,7 +2799,7 @@
           <w:color w:val="31445A"/>
           <w:sz w:val="21"/>
         </w:rPr>
-        <w:t>/ru/admin/settings/index</w:t>
+        <w:t>N</w:t>
       </w:r>
       <w:r>
         <w:rPr>
@@ -3667,11 +2808,33 @@
           <w:color w:val="17202A"/>
           <w:sz w:val="22"/>
         </w:rPr>
-        <w:t xml:space="preserve"> добавить страницу:</w:t>
+        <w:t xml:space="preserve"> компенсационных минут только после фактического создания купона. Если купон не создан, клиент видит, что поддержку попросили проверить компенсацию.</w:t>
       </w:r>
     </w:p>
     <w:p>
       <w:pPr>
+        <w:pStyle w:val="Heading2"/>
+      </w:pPr>
+      <w:r>
+        <w:t>9.3. Идемпотентность</w:t>
+      </w:r>
+    </w:p>
+    <w:p>
+      <w:pPr>
+        <w:keepNext/>
+      </w:pPr>
+      <w:r>
+        <w:rPr>
+          <w:rFonts w:ascii="Calibri" w:hAnsi="Calibri"/>
+          <w:b w:val="0"/>
+          <w:color w:val="17202A"/>
+          <w:sz w:val="22"/>
+        </w:rPr>
+        <w:t>Повторная доставка, reconnect или повторное нажатие не должны создавать дубликаты:</w:t>
+      </w:r>
+    </w:p>
+    <w:p>
+      <w:pPr>
         <w:spacing w:after="80" w:line="300" w:lineRule="exact"/>
         <w:ind w:left="605" w:hanging="374"/>
       </w:pPr>
@@ -3690,25 +2853,7 @@
           <w:color w:val="17202A"/>
           <w:sz w:val="22"/>
         </w:rPr>
-        <w:t xml:space="preserve">название: </w:t>
-      </w:r>
-      <w:r>
-        <w:rPr>
-          <w:rFonts w:ascii="Calibri" w:hAnsi="Calibri"/>
-          <w:b/>
-          <w:color w:val="17202A"/>
-          <w:sz w:val="22"/>
-        </w:rPr>
-        <w:t>«Настройки чата»</w:t>
-      </w:r>
-      <w:r>
-        <w:rPr>
-          <w:rFonts w:ascii="Calibri" w:hAnsi="Calibri"/>
-          <w:b w:val="0"/>
-          <w:color w:val="17202A"/>
-          <w:sz w:val="22"/>
-        </w:rPr>
-        <w:t>;</w:t>
+        <w:t>сообщения получателю;</w:t>
       </w:r>
     </w:p>
     <w:p>
@@ -3731,7 +2876,825 @@
           <w:color w:val="17202A"/>
           <w:sz w:val="22"/>
         </w:rPr>
-        <w:t xml:space="preserve">route: </w:t>
+        <w:t>системного предупреждения;</w:t>
+      </w:r>
+    </w:p>
+    <w:p>
+      <w:pPr>
+        <w:spacing w:after="80" w:line="300" w:lineRule="exact"/>
+        <w:ind w:left="605" w:hanging="374"/>
+      </w:pPr>
+      <w:r>
+        <w:rPr>
+          <w:rFonts w:ascii="Calibri" w:hAnsi="Calibri"/>
+          <w:color w:val="17202A"/>
+          <w:sz w:val="22"/>
+        </w:rPr>
+        <w:t xml:space="preserve">•  </w:t>
+      </w:r>
+      <w:r>
+        <w:rPr>
+          <w:rFonts w:ascii="Calibri" w:hAnsi="Calibri"/>
+          <w:b w:val="0"/>
+          <w:color w:val="17202A"/>
+          <w:sz w:val="22"/>
+        </w:rPr>
+        <w:t>incident;</w:t>
+      </w:r>
+    </w:p>
+    <w:p>
+      <w:pPr>
+        <w:spacing w:after="80" w:line="300" w:lineRule="exact"/>
+        <w:ind w:left="605" w:hanging="374"/>
+      </w:pPr>
+      <w:r>
+        <w:rPr>
+          <w:rFonts w:ascii="Calibri" w:hAnsi="Calibri"/>
+          <w:color w:val="17202A"/>
+          <w:sz w:val="22"/>
+        </w:rPr>
+        <w:t xml:space="preserve">•  </w:t>
+      </w:r>
+      <w:r>
+        <w:rPr>
+          <w:rFonts w:ascii="Calibri" w:hAnsi="Calibri"/>
+          <w:b w:val="0"/>
+          <w:color w:val="17202A"/>
+          <w:sz w:val="22"/>
+        </w:rPr>
+        <w:t>coupon;</w:t>
+      </w:r>
+    </w:p>
+    <w:p>
+      <w:pPr>
+        <w:spacing w:after="80" w:line="300" w:lineRule="exact"/>
+        <w:ind w:left="605" w:hanging="374"/>
+      </w:pPr>
+      <w:r>
+        <w:rPr>
+          <w:rFonts w:ascii="Calibri" w:hAnsi="Calibri"/>
+          <w:color w:val="17202A"/>
+          <w:sz w:val="22"/>
+        </w:rPr>
+        <w:t xml:space="preserve">•  </w:t>
+      </w:r>
+      <w:r>
+        <w:rPr>
+          <w:rFonts w:ascii="Calibri" w:hAnsi="Calibri"/>
+          <w:b w:val="0"/>
+          <w:color w:val="17202A"/>
+          <w:sz w:val="22"/>
+        </w:rPr>
+        <w:t>финансового события;</w:t>
+      </w:r>
+    </w:p>
+    <w:p>
+      <w:pPr>
+        <w:spacing w:after="80" w:line="300" w:lineRule="exact"/>
+        <w:ind w:left="605" w:hanging="374"/>
+      </w:pPr>
+      <w:r>
+        <w:rPr>
+          <w:rFonts w:ascii="Calibri" w:hAnsi="Calibri"/>
+          <w:color w:val="17202A"/>
+          <w:sz w:val="22"/>
+        </w:rPr>
+        <w:t xml:space="preserve">•  </w:t>
+      </w:r>
+      <w:r>
+        <w:rPr>
+          <w:rFonts w:ascii="Calibri" w:hAnsi="Calibri"/>
+          <w:b w:val="0"/>
+          <w:color w:val="17202A"/>
+          <w:sz w:val="22"/>
+        </w:rPr>
+        <w:t>consultation session.</w:t>
+      </w:r>
+    </w:p>
+    <w:p>
+      <w:pPr>
+        <w:pStyle w:val="Heading1"/>
+      </w:pPr>
+      <w:r>
+        <w:t>10. Отображение «Истории консультации» в чате</w:t>
+      </w:r>
+    </w:p>
+    <w:p>
+      <w:r>
+        <w:rPr>
+          <w:rFonts w:ascii="Calibri" w:hAnsi="Calibri"/>
+          <w:b w:val="0"/>
+          <w:color w:val="17202A"/>
+          <w:sz w:val="22"/>
+        </w:rPr>
+        <w:t>G1.3 отвечает за список «Мои консультации», итоговые данные, доступность и срок хранения истории. G1.2 передаёт в эту историю сообщения, клиентские системные события, timestamps, безопасные версии текста и сведения о редактировании, а в постоянном диалоге показывает ссылку на связанную консультацию.</w:t>
+      </w:r>
+    </w:p>
+    <w:p>
+      <w:pPr>
+        <w:keepNext/>
+      </w:pPr>
+      <w:r>
+        <w:rPr>
+          <w:rFonts w:ascii="Calibri" w:hAnsi="Calibri"/>
+          <w:b w:val="0"/>
+          <w:color w:val="17202A"/>
+          <w:sz w:val="22"/>
+        </w:rPr>
+        <w:t>После завершения в chat/history-представлении клиент видит данные, полученные из G1.3:</w:t>
+      </w:r>
+    </w:p>
+    <w:p>
+      <w:pPr>
+        <w:spacing w:after="80" w:line="300" w:lineRule="exact"/>
+        <w:ind w:left="605" w:hanging="374"/>
+      </w:pPr>
+      <w:r>
+        <w:rPr>
+          <w:rFonts w:ascii="Calibri" w:hAnsi="Calibri"/>
+          <w:color w:val="17202A"/>
+          <w:sz w:val="22"/>
+        </w:rPr>
+        <w:t xml:space="preserve">•  </w:t>
+      </w:r>
+      <w:r>
+        <w:rPr>
+          <w:rFonts w:ascii="Calibri" w:hAnsi="Calibri"/>
+          <w:b w:val="0"/>
+          <w:color w:val="17202A"/>
+          <w:sz w:val="22"/>
+        </w:rPr>
+        <w:t>общую длительность;</w:t>
+      </w:r>
+    </w:p>
+    <w:p>
+      <w:pPr>
+        <w:spacing w:after="80" w:line="300" w:lineRule="exact"/>
+        <w:ind w:left="605" w:hanging="374"/>
+      </w:pPr>
+      <w:r>
+        <w:rPr>
+          <w:rFonts w:ascii="Calibri" w:hAnsi="Calibri"/>
+          <w:color w:val="17202A"/>
+          <w:sz w:val="22"/>
+        </w:rPr>
+        <w:t xml:space="preserve">•  </w:t>
+      </w:r>
+      <w:r>
+        <w:rPr>
+          <w:rFonts w:ascii="Calibri" w:hAnsi="Calibri"/>
+          <w:b w:val="0"/>
+          <w:color w:val="17202A"/>
+          <w:sz w:val="22"/>
+        </w:rPr>
+        <w:t>списанные credits;</w:t>
+      </w:r>
+    </w:p>
+    <w:p>
+      <w:pPr>
+        <w:spacing w:after="80" w:line="300" w:lineRule="exact"/>
+        <w:ind w:left="605" w:hanging="374"/>
+      </w:pPr>
+      <w:r>
+        <w:rPr>
+          <w:rFonts w:ascii="Calibri" w:hAnsi="Calibri"/>
+          <w:color w:val="17202A"/>
+          <w:sz w:val="22"/>
+        </w:rPr>
+        <w:t xml:space="preserve">•  </w:t>
+      </w:r>
+      <w:r>
+        <w:rPr>
+          <w:rFonts w:ascii="Calibri" w:hAnsi="Calibri"/>
+          <w:b w:val="0"/>
+          <w:color w:val="17202A"/>
+          <w:sz w:val="22"/>
+        </w:rPr>
+        <w:t>применённую цену;</w:t>
+      </w:r>
+    </w:p>
+    <w:p>
+      <w:pPr>
+        <w:spacing w:after="80" w:line="300" w:lineRule="exact"/>
+        <w:ind w:left="605" w:hanging="374"/>
+      </w:pPr>
+      <w:r>
+        <w:rPr>
+          <w:rFonts w:ascii="Calibri" w:hAnsi="Calibri"/>
+          <w:color w:val="17202A"/>
+          <w:sz w:val="22"/>
+        </w:rPr>
+        <w:t xml:space="preserve">•  </w:t>
+      </w:r>
+      <w:r>
+        <w:rPr>
+          <w:rFonts w:ascii="Calibri" w:hAnsi="Calibri"/>
+          <w:b w:val="0"/>
+          <w:color w:val="17202A"/>
+          <w:sz w:val="22"/>
+        </w:rPr>
+        <w:t>понятную клиенту причину завершения;</w:t>
+      </w:r>
+    </w:p>
+    <w:p>
+      <w:pPr>
+        <w:spacing w:after="80" w:line="300" w:lineRule="exact"/>
+        <w:ind w:left="605" w:hanging="374"/>
+      </w:pPr>
+      <w:r>
+        <w:rPr>
+          <w:rFonts w:ascii="Calibri" w:hAnsi="Calibri"/>
+          <w:color w:val="17202A"/>
+          <w:sz w:val="22"/>
+        </w:rPr>
+        <w:t xml:space="preserve">•  </w:t>
+      </w:r>
+      <w:r>
+        <w:rPr>
+          <w:rFonts w:ascii="Calibri" w:hAnsi="Calibri"/>
+          <w:b w:val="0"/>
+          <w:color w:val="17202A"/>
+          <w:sz w:val="22"/>
+        </w:rPr>
+        <w:t>действие «Запросить новую консультацию»;</w:t>
+      </w:r>
+    </w:p>
+    <w:p>
+      <w:pPr>
+        <w:spacing w:after="80" w:line="300" w:lineRule="exact"/>
+        <w:ind w:left="605" w:hanging="374"/>
+      </w:pPr>
+      <w:r>
+        <w:rPr>
+          <w:rFonts w:ascii="Calibri" w:hAnsi="Calibri"/>
+          <w:color w:val="17202A"/>
+          <w:sz w:val="22"/>
+        </w:rPr>
+        <w:t xml:space="preserve">•  </w:t>
+      </w:r>
+      <w:r>
+        <w:rPr>
+          <w:rFonts w:ascii="Calibri" w:hAnsi="Calibri"/>
+          <w:b w:val="0"/>
+          <w:color w:val="17202A"/>
+          <w:sz w:val="22"/>
+        </w:rPr>
+        <w:t>оценку;</w:t>
+      </w:r>
+    </w:p>
+    <w:p>
+      <w:pPr>
+        <w:spacing w:after="80" w:line="300" w:lineRule="exact"/>
+        <w:ind w:left="605" w:hanging="374"/>
+      </w:pPr>
+      <w:r>
+        <w:rPr>
+          <w:rFonts w:ascii="Calibri" w:hAnsi="Calibri"/>
+          <w:color w:val="17202A"/>
+          <w:sz w:val="22"/>
+        </w:rPr>
+        <w:t xml:space="preserve">•  </w:t>
+      </w:r>
+      <w:r>
+        <w:rPr>
+          <w:rFonts w:ascii="Calibri" w:hAnsi="Calibri"/>
+          <w:b w:val="0"/>
+          <w:color w:val="17202A"/>
+          <w:sz w:val="22"/>
+        </w:rPr>
+        <w:t>route «Поддержка Nebula» / жалоба;</w:t>
+      </w:r>
+    </w:p>
+    <w:p>
+      <w:pPr>
+        <w:spacing w:after="80" w:line="300" w:lineRule="exact"/>
+        <w:ind w:left="605" w:hanging="374"/>
+      </w:pPr>
+      <w:r>
+        <w:rPr>
+          <w:rFonts w:ascii="Calibri" w:hAnsi="Calibri"/>
+          <w:color w:val="17202A"/>
+          <w:sz w:val="22"/>
+        </w:rPr>
+        <w:t xml:space="preserve">•  </w:t>
+      </w:r>
+      <w:r>
+        <w:rPr>
+          <w:rFonts w:ascii="Calibri" w:hAnsi="Calibri"/>
+          <w:b w:val="0"/>
+          <w:color w:val="17202A"/>
+          <w:sz w:val="22"/>
+        </w:rPr>
+        <w:t>читаемую «Историю консультации».</w:t>
+      </w:r>
+    </w:p>
+    <w:p>
+      <w:r>
+        <w:rPr>
+          <w:rFonts w:ascii="Calibri" w:hAnsi="Calibri"/>
+          <w:b w:val="0"/>
+          <w:color w:val="17202A"/>
+          <w:sz w:val="22"/>
+        </w:rPr>
+        <w:t>В части G1.2 «История консультации» — это сообщения, видимые клиенту системные события, timestamps, пометки об изменении и границы session. Это не аудио- или видеотранскрипт.</w:t>
+      </w:r>
+    </w:p>
+    <w:p>
+      <w:r>
+        <w:rPr>
+          <w:rFonts w:ascii="Calibri" w:hAnsi="Calibri"/>
+          <w:b w:val="0"/>
+          <w:color w:val="17202A"/>
+          <w:sz w:val="22"/>
+        </w:rPr>
+        <w:t>В MVP история доступна только для чтения в личном кабинете. Скачивание и экспорт относятся к следующему этапу.</w:t>
+      </w:r>
+    </w:p>
+    <w:p>
+      <w:r>
+        <w:rPr>
+          <w:rFonts w:ascii="Calibri" w:hAnsi="Calibri"/>
+          <w:b w:val="0"/>
+          <w:color w:val="17202A"/>
+          <w:sz w:val="22"/>
+        </w:rPr>
+        <w:t>Срок доступности клиентской истории и legal/privacy retention определяются G1.3/G4.3 и не редактируются на странице настроек чата. Активная жалоба, refund, safety case или legal hold может приостановить удаление только связанных материалов; причина и снятие hold фиксируются.</w:t>
+      </w:r>
+    </w:p>
+    <w:p>
+      <w:pPr>
+        <w:pStyle w:val="Heading1"/>
+      </w:pPr>
+      <w:r>
+        <w:t>11. Что видно Агенту</w:t>
+      </w:r>
+    </w:p>
+    <w:p>
+      <w:pPr>
+        <w:keepNext/>
+      </w:pPr>
+      <w:r>
+        <w:rPr>
+          <w:rFonts w:ascii="Calibri" w:hAnsi="Calibri"/>
+          <w:b w:val="0"/>
+          <w:color w:val="17202A"/>
+          <w:sz w:val="22"/>
+        </w:rPr>
+        <w:t>В одном рабочем контуре Агент должен понимать:</w:t>
+      </w:r>
+    </w:p>
+    <w:p>
+      <w:pPr>
+        <w:spacing w:after="80" w:line="300" w:lineRule="exact"/>
+        <w:ind w:left="605" w:hanging="374"/>
+      </w:pPr>
+      <w:r>
+        <w:rPr>
+          <w:rFonts w:ascii="Calibri" w:hAnsi="Calibri"/>
+          <w:color w:val="17202A"/>
+          <w:sz w:val="22"/>
+        </w:rPr>
+        <w:t xml:space="preserve">•  </w:t>
+      </w:r>
+      <w:r>
+        <w:rPr>
+          <w:rFonts w:ascii="Calibri" w:hAnsi="Calibri"/>
+          <w:b w:val="0"/>
+          <w:color w:val="17202A"/>
+          <w:sz w:val="22"/>
+        </w:rPr>
+        <w:t>от какой экспертной анкеты он отвечает;</w:t>
+      </w:r>
+    </w:p>
+    <w:p>
+      <w:pPr>
+        <w:spacing w:after="80" w:line="300" w:lineRule="exact"/>
+        <w:ind w:left="605" w:hanging="374"/>
+      </w:pPr>
+      <w:r>
+        <w:rPr>
+          <w:rFonts w:ascii="Calibri" w:hAnsi="Calibri"/>
+          <w:color w:val="17202A"/>
+          <w:sz w:val="22"/>
+        </w:rPr>
+        <w:t xml:space="preserve">•  </w:t>
+      </w:r>
+      <w:r>
+        <w:rPr>
+          <w:rFonts w:ascii="Calibri" w:hAnsi="Calibri"/>
+          <w:b w:val="0"/>
+          <w:color w:val="17202A"/>
+          <w:sz w:val="22"/>
+        </w:rPr>
+        <w:t>какой клиент, кейс, диалог и session активны;</w:t>
+      </w:r>
+    </w:p>
+    <w:p>
+      <w:pPr>
+        <w:spacing w:after="80" w:line="300" w:lineRule="exact"/>
+        <w:ind w:left="605" w:hanging="374"/>
+      </w:pPr>
+      <w:r>
+        <w:rPr>
+          <w:rFonts w:ascii="Calibri" w:hAnsi="Calibri"/>
+          <w:color w:val="17202A"/>
+          <w:sz w:val="22"/>
+        </w:rPr>
+        <w:t xml:space="preserve">•  </w:t>
+      </w:r>
+      <w:r>
+        <w:rPr>
+          <w:rFonts w:ascii="Calibri" w:hAnsi="Calibri"/>
+          <w:b w:val="0"/>
+          <w:color w:val="17202A"/>
+          <w:sz w:val="22"/>
+        </w:rPr>
+        <w:t>free/trial/paid/pause/end состояние;</w:t>
+      </w:r>
+    </w:p>
+    <w:p>
+      <w:pPr>
+        <w:spacing w:after="80" w:line="300" w:lineRule="exact"/>
+        <w:ind w:left="605" w:hanging="374"/>
+      </w:pPr>
+      <w:r>
+        <w:rPr>
+          <w:rFonts w:ascii="Calibri" w:hAnsi="Calibri"/>
+          <w:color w:val="17202A"/>
+          <w:sz w:val="22"/>
+        </w:rPr>
+        <w:t xml:space="preserve">•  </w:t>
+      </w:r>
+      <w:r>
+        <w:rPr>
+          <w:rFonts w:ascii="Calibri" w:hAnsi="Calibri"/>
+          <w:b w:val="0"/>
+          <w:color w:val="17202A"/>
+          <w:sz w:val="22"/>
+        </w:rPr>
+        <w:t>разрешена ли отправка;</w:t>
+      </w:r>
+    </w:p>
+    <w:p>
+      <w:pPr>
+        <w:spacing w:after="80" w:line="300" w:lineRule="exact"/>
+        <w:ind w:left="605" w:hanging="374"/>
+      </w:pPr>
+      <w:r>
+        <w:rPr>
+          <w:rFonts w:ascii="Calibri" w:hAnsi="Calibri"/>
+          <w:color w:val="17202A"/>
+          <w:sz w:val="22"/>
+        </w:rPr>
+        <w:t xml:space="preserve">•  </w:t>
+      </w:r>
+      <w:r>
+        <w:rPr>
+          <w:rFonts w:ascii="Calibri" w:hAnsi="Calibri"/>
+          <w:b w:val="0"/>
+          <w:color w:val="17202A"/>
+          <w:sz w:val="22"/>
+        </w:rPr>
+        <w:t>актуальную версию правил;</w:t>
+      </w:r>
+    </w:p>
+    <w:p>
+      <w:pPr>
+        <w:spacing w:after="80" w:line="300" w:lineRule="exact"/>
+        <w:ind w:left="605" w:hanging="374"/>
+      </w:pPr>
+      <w:r>
+        <w:rPr>
+          <w:rFonts w:ascii="Calibri" w:hAnsi="Calibri"/>
+          <w:color w:val="17202A"/>
+          <w:sz w:val="22"/>
+        </w:rPr>
+        <w:t xml:space="preserve">•  </w:t>
+      </w:r>
+      <w:r>
+        <w:rPr>
+          <w:rFonts w:ascii="Calibri" w:hAnsi="Calibri"/>
+          <w:b w:val="0"/>
+          <w:color w:val="17202A"/>
+          <w:sz w:val="22"/>
+        </w:rPr>
+        <w:t>применимые quality/support/safety flags;</w:t>
+      </w:r>
+    </w:p>
+    <w:p>
+      <w:pPr>
+        <w:spacing w:after="80" w:line="300" w:lineRule="exact"/>
+        <w:ind w:left="605" w:hanging="374"/>
+      </w:pPr>
+      <w:r>
+        <w:rPr>
+          <w:rFonts w:ascii="Calibri" w:hAnsi="Calibri"/>
+          <w:color w:val="17202A"/>
+          <w:sz w:val="22"/>
+        </w:rPr>
+        <w:t xml:space="preserve">•  </w:t>
+      </w:r>
+      <w:r>
+        <w:rPr>
+          <w:rFonts w:ascii="Calibri" w:hAnsi="Calibri"/>
+          <w:b w:val="0"/>
+          <w:color w:val="17202A"/>
+          <w:sz w:val="22"/>
+        </w:rPr>
+        <w:t>требуется ли top-up, продолжение, завершение или передача в поддержку.</w:t>
+      </w:r>
+    </w:p>
+    <w:p>
+      <w:r>
+        <w:rPr>
+          <w:rFonts w:ascii="Calibri" w:hAnsi="Calibri"/>
+          <w:b w:val="0"/>
+          <w:color w:val="17202A"/>
+          <w:sz w:val="22"/>
+        </w:rPr>
+        <w:t>Деньги и состояние session не должны угадываться по разрозненным экранам.</w:t>
+      </w:r>
+    </w:p>
+    <w:p>
+      <w:pPr>
+        <w:pStyle w:val="Heading1"/>
+      </w:pPr>
+      <w:r>
+        <w:t>12. Что видно super-admin</w:t>
+      </w:r>
+    </w:p>
+    <w:p>
+      <w:pPr>
+        <w:keepNext/>
+      </w:pPr>
+      <w:r>
+        <w:rPr>
+          <w:rFonts w:ascii="Calibri" w:hAnsi="Calibri"/>
+          <w:b w:val="0"/>
+          <w:color w:val="17202A"/>
+          <w:sz w:val="22"/>
+        </w:rPr>
+        <w:t>Super-admin должен иметь возможность восстановить:</w:t>
+      </w:r>
+    </w:p>
+    <w:p>
+      <w:pPr>
+        <w:spacing w:after="80" w:line="300" w:lineRule="exact"/>
+        <w:ind w:left="605" w:hanging="374"/>
+      </w:pPr>
+      <w:r>
+        <w:rPr>
+          <w:rFonts w:ascii="Calibri" w:hAnsi="Calibri"/>
+          <w:color w:val="17202A"/>
+          <w:sz w:val="22"/>
+        </w:rPr>
+        <w:t xml:space="preserve">•  </w:t>
+      </w:r>
+      <w:r>
+        <w:rPr>
+          <w:rFonts w:ascii="Calibri" w:hAnsi="Calibri"/>
+          <w:b w:val="0"/>
+          <w:color w:val="17202A"/>
+          <w:sz w:val="22"/>
+        </w:rPr>
+        <w:t>выбранную публичную экспертную анкету;</w:t>
+      </w:r>
+    </w:p>
+    <w:p>
+      <w:pPr>
+        <w:spacing w:after="80" w:line="300" w:lineRule="exact"/>
+        <w:ind w:left="605" w:hanging="374"/>
+      </w:pPr>
+      <w:r>
+        <w:rPr>
+          <w:rFonts w:ascii="Calibri" w:hAnsi="Calibri"/>
+          <w:color w:val="17202A"/>
+          <w:sz w:val="22"/>
+        </w:rPr>
+        <w:t xml:space="preserve">•  </w:t>
+      </w:r>
+      <w:r>
+        <w:rPr>
+          <w:rFonts w:ascii="Calibri" w:hAnsi="Calibri"/>
+          <w:b w:val="0"/>
+          <w:color w:val="17202A"/>
+          <w:sz w:val="22"/>
+        </w:rPr>
+        <w:t>назначенного Агента в момент события;</w:t>
+      </w:r>
+    </w:p>
+    <w:p>
+      <w:pPr>
+        <w:spacing w:after="80" w:line="300" w:lineRule="exact"/>
+        <w:ind w:left="605" w:hanging="374"/>
+      </w:pPr>
+      <w:r>
+        <w:rPr>
+          <w:rFonts w:ascii="Calibri" w:hAnsi="Calibri"/>
+          <w:color w:val="17202A"/>
+          <w:sz w:val="22"/>
+        </w:rPr>
+        <w:t xml:space="preserve">•  </w:t>
+      </w:r>
+      <w:r>
+        <w:rPr>
+          <w:rFonts w:ascii="Calibri" w:hAnsi="Calibri"/>
+          <w:b w:val="0"/>
+          <w:color w:val="17202A"/>
+          <w:sz w:val="22"/>
+        </w:rPr>
+        <w:t>фактического автора и редактора;</w:t>
+      </w:r>
+    </w:p>
+    <w:p>
+      <w:pPr>
+        <w:spacing w:after="80" w:line="300" w:lineRule="exact"/>
+        <w:ind w:left="605" w:hanging="374"/>
+      </w:pPr>
+      <w:r>
+        <w:rPr>
+          <w:rFonts w:ascii="Calibri" w:hAnsi="Calibri"/>
+          <w:color w:val="17202A"/>
+          <w:sz w:val="22"/>
+        </w:rPr>
+        <w:t xml:space="preserve">•  </w:t>
+      </w:r>
+      <w:r>
+        <w:rPr>
+          <w:rFonts w:ascii="Calibri" w:hAnsi="Calibri"/>
+          <w:b w:val="0"/>
+          <w:color w:val="17202A"/>
+          <w:sz w:val="22"/>
+        </w:rPr>
+        <w:t>последовательность клиентских состояний;</w:t>
+      </w:r>
+    </w:p>
+    <w:p>
+      <w:pPr>
+        <w:spacing w:after="80" w:line="300" w:lineRule="exact"/>
+        <w:ind w:left="605" w:hanging="374"/>
+      </w:pPr>
+      <w:r>
+        <w:rPr>
+          <w:rFonts w:ascii="Calibri" w:hAnsi="Calibri"/>
+          <w:color w:val="17202A"/>
+          <w:sz w:val="22"/>
+        </w:rPr>
+        <w:t xml:space="preserve">•  </w:t>
+      </w:r>
+      <w:r>
+        <w:rPr>
+          <w:rFonts w:ascii="Calibri" w:hAnsi="Calibri"/>
+          <w:b w:val="0"/>
+          <w:color w:val="17202A"/>
+          <w:sz w:val="22"/>
+        </w:rPr>
+        <w:t>free/trial/paid переход;</w:t>
+      </w:r>
+    </w:p>
+    <w:p>
+      <w:pPr>
+        <w:spacing w:after="80" w:line="300" w:lineRule="exact"/>
+        <w:ind w:left="605" w:hanging="374"/>
+      </w:pPr>
+      <w:r>
+        <w:rPr>
+          <w:rFonts w:ascii="Calibri" w:hAnsi="Calibri"/>
+          <w:color w:val="17202A"/>
+          <w:sz w:val="22"/>
+        </w:rPr>
+        <w:t xml:space="preserve">•  </w:t>
+      </w:r>
+      <w:r>
+        <w:rPr>
+          <w:rFonts w:ascii="Calibri" w:hAnsi="Calibri"/>
+          <w:b w:val="0"/>
+          <w:color w:val="17202A"/>
+          <w:sz w:val="22"/>
+        </w:rPr>
+        <w:t>применённую цену и версию правил;</w:t>
+      </w:r>
+    </w:p>
+    <w:p>
+      <w:pPr>
+        <w:spacing w:after="80" w:line="300" w:lineRule="exact"/>
+        <w:ind w:left="605" w:hanging="374"/>
+      </w:pPr>
+      <w:r>
+        <w:rPr>
+          <w:rFonts w:ascii="Calibri" w:hAnsi="Calibri"/>
+          <w:color w:val="17202A"/>
+          <w:sz w:val="22"/>
+        </w:rPr>
+        <w:t xml:space="preserve">•  </w:t>
+      </w:r>
+      <w:r>
+        <w:rPr>
+          <w:rFonts w:ascii="Calibri" w:hAnsi="Calibri"/>
+          <w:b w:val="0"/>
+          <w:color w:val="17202A"/>
+          <w:sz w:val="22"/>
+        </w:rPr>
+        <w:t>censored attempts и действия по ним;</w:t>
+      </w:r>
+    </w:p>
+    <w:p>
+      <w:pPr>
+        <w:spacing w:after="80" w:line="300" w:lineRule="exact"/>
+        <w:ind w:left="605" w:hanging="374"/>
+      </w:pPr>
+      <w:r>
+        <w:rPr>
+          <w:rFonts w:ascii="Calibri" w:hAnsi="Calibri"/>
+          <w:color w:val="17202A"/>
+          <w:sz w:val="22"/>
+        </w:rPr>
+        <w:t xml:space="preserve">•  </w:t>
+      </w:r>
+      <w:r>
+        <w:rPr>
+          <w:rFonts w:ascii="Calibri" w:hAnsi="Calibri"/>
+          <w:b w:val="0"/>
+          <w:color w:val="17202A"/>
+          <w:sz w:val="22"/>
+        </w:rPr>
+        <w:t>ошибки доставки, abnormal end и reconnect;</w:t>
+      </w:r>
+    </w:p>
+    <w:p>
+      <w:pPr>
+        <w:spacing w:after="80" w:line="300" w:lineRule="exact"/>
+        <w:ind w:left="605" w:hanging="374"/>
+      </w:pPr>
+      <w:r>
+        <w:rPr>
+          <w:rFonts w:ascii="Calibri" w:hAnsi="Calibri"/>
+          <w:color w:val="17202A"/>
+          <w:sz w:val="22"/>
+        </w:rPr>
+        <w:t xml:space="preserve">•  </w:t>
+      </w:r>
+      <w:r>
+        <w:rPr>
+          <w:rFonts w:ascii="Calibri" w:hAnsi="Calibri"/>
+          <w:b w:val="0"/>
+          <w:color w:val="17202A"/>
+          <w:sz w:val="22"/>
+        </w:rPr>
+        <w:t>complaint/support/refund/QA контекст;</w:t>
+      </w:r>
+    </w:p>
+    <w:p>
+      <w:pPr>
+        <w:spacing w:after="80" w:line="300" w:lineRule="exact"/>
+        <w:ind w:left="605" w:hanging="374"/>
+      </w:pPr>
+      <w:r>
+        <w:rPr>
+          <w:rFonts w:ascii="Calibri" w:hAnsi="Calibri"/>
+          <w:color w:val="17202A"/>
+          <w:sz w:val="22"/>
+        </w:rPr>
+        <w:t xml:space="preserve">•  </w:t>
+      </w:r>
+      <w:r>
+        <w:rPr>
+          <w:rFonts w:ascii="Calibri" w:hAnsi="Calibri"/>
+          <w:b w:val="0"/>
+          <w:color w:val="17202A"/>
+          <w:sz w:val="22"/>
+        </w:rPr>
+        <w:t>историю переназначений и аварийных вмешательств.</w:t>
+      </w:r>
+    </w:p>
+    <w:p>
+      <w:pPr>
+        <w:pStyle w:val="Heading1"/>
+      </w:pPr>
+      <w:r>
+        <w:t>13. Настройки через админ-панель</w:t>
+      </w:r>
+    </w:p>
+    <w:p>
+      <w:pPr>
+        <w:pStyle w:val="Heading2"/>
+      </w:pPr>
+      <w:r>
+        <w:t>13.1. Место и название страницы</w:t>
+      </w:r>
+    </w:p>
+    <w:p>
+      <w:pPr>
+        <w:keepNext/>
+      </w:pPr>
+      <w:r>
+        <w:rPr>
+          <w:rFonts w:ascii="Calibri" w:hAnsi="Calibri"/>
+          <w:b w:val="0"/>
+          <w:color w:val="17202A"/>
+          <w:sz w:val="22"/>
+        </w:rPr>
+        <w:t xml:space="preserve">В существующем </w:t>
       </w:r>
       <w:r>
         <w:rPr>
@@ -3739,7 +3702,7 @@
           <w:color w:val="31445A"/>
           <w:sz w:val="21"/>
         </w:rPr>
-        <w:t>/ru/admin/settings/chat</w:t>
+        <w:t>/ru/admin/settings/index</w:t>
       </w:r>
       <w:r>
         <w:rPr>
@@ -3748,7 +3711,7 @@
           <w:color w:val="17202A"/>
           <w:sz w:val="22"/>
         </w:rPr>
-        <w:t>;</w:t>
+        <w:t xml:space="preserve"> добавить страницу:</w:t>
       </w:r>
     </w:p>
     <w:p>
@@ -3771,7 +3734,7 @@
           <w:color w:val="17202A"/>
           <w:sz w:val="22"/>
         </w:rPr>
-        <w:t xml:space="preserve">расположение: сразу после </w:t>
+        <w:t xml:space="preserve">название: </w:t>
       </w:r>
       <w:r>
         <w:rPr>
@@ -3780,25 +3743,7 @@
           <w:color w:val="17202A"/>
           <w:sz w:val="22"/>
         </w:rPr>
-        <w:t>«Основные настройки»</w:t>
-      </w:r>
-      <w:r>
-        <w:rPr>
-          <w:rFonts w:ascii="Calibri" w:hAnsi="Calibri"/>
-          <w:b w:val="0"/>
-          <w:color w:val="17202A"/>
-          <w:sz w:val="22"/>
-        </w:rPr>
-        <w:t xml:space="preserve"> и перед </w:t>
-      </w:r>
-      <w:r>
-        <w:rPr>
-          <w:rFonts w:ascii="Calibri" w:hAnsi="Calibri"/>
-          <w:b/>
-          <w:color w:val="17202A"/>
-          <w:sz w:val="22"/>
-        </w:rPr>
-        <w:t>«Настройки фото»</w:t>
+        <w:t>«Настройки чата»</w:t>
       </w:r>
       <w:r>
         <w:rPr>
@@ -3830,7 +3775,24 @@
           <w:color w:val="17202A"/>
           <w:sz w:val="22"/>
         </w:rPr>
-        <w:t>отдельный верхнеуровневый раздел меню не создавать;</w:t>
+        <w:t xml:space="preserve">route: </w:t>
+      </w:r>
+      <w:r>
+        <w:rPr>
+          <w:rFonts w:ascii="Consolas" w:hAnsi="Consolas"/>
+          <w:color w:val="31445A"/>
+          <w:sz w:val="21"/>
+        </w:rPr>
+        <w:t>/ru/admin/settings/chat</w:t>
+      </w:r>
+      <w:r>
+        <w:rPr>
+          <w:rFonts w:ascii="Calibri" w:hAnsi="Calibri"/>
+          <w:b w:val="0"/>
+          <w:color w:val="17202A"/>
+          <w:sz w:val="22"/>
+        </w:rPr>
+        <w:t>;</w:t>
       </w:r>
     </w:p>
     <w:p>
@@ -3853,15 +3815,66 @@
           <w:color w:val="17202A"/>
           <w:sz w:val="22"/>
         </w:rPr>
-        <w:t>доступ в MVP: только super-admin.</w:t>
+        <w:t xml:space="preserve">расположение: сразу после </w:t>
+      </w:r>
+      <w:r>
+        <w:rPr>
+          <w:rFonts w:ascii="Calibri" w:hAnsi="Calibri"/>
+          <w:b/>
+          <w:color w:val="17202A"/>
+          <w:sz w:val="22"/>
+        </w:rPr>
+        <w:t>«Основные настройки»</w:t>
+      </w:r>
+      <w:r>
+        <w:rPr>
+          <w:rFonts w:ascii="Calibri" w:hAnsi="Calibri"/>
+          <w:b w:val="0"/>
+          <w:color w:val="17202A"/>
+          <w:sz w:val="22"/>
+        </w:rPr>
+        <w:t xml:space="preserve"> и перед </w:t>
+      </w:r>
+      <w:r>
+        <w:rPr>
+          <w:rFonts w:ascii="Calibri" w:hAnsi="Calibri"/>
+          <w:b/>
+          <w:color w:val="17202A"/>
+          <w:sz w:val="22"/>
+        </w:rPr>
+        <w:t>«Настройки фото»</w:t>
+      </w:r>
+      <w:r>
+        <w:rPr>
+          <w:rFonts w:ascii="Calibri" w:hAnsi="Calibri"/>
+          <w:b w:val="0"/>
+          <w:color w:val="17202A"/>
+          <w:sz w:val="22"/>
+        </w:rPr>
+        <w:t>;</w:t>
       </w:r>
     </w:p>
     <w:p>
       <w:pPr>
-        <w:pStyle w:val="Heading2"/>
-      </w:pPr>
-      <w:r>
-        <w:t>13.2. Что управляется на странице</w:t>
+        <w:spacing w:after="80" w:line="300" w:lineRule="exact"/>
+        <w:ind w:left="605" w:hanging="374"/>
+      </w:pPr>
+      <w:r>
+        <w:rPr>
+          <w:rFonts w:ascii="Calibri" w:hAnsi="Calibri"/>
+          <w:color w:val="17202A"/>
+          <w:sz w:val="22"/>
+        </w:rPr>
+        <w:t xml:space="preserve">•  </w:t>
+      </w:r>
+      <w:r>
+        <w:rPr>
+          <w:rFonts w:ascii="Calibri" w:hAnsi="Calibri"/>
+          <w:b w:val="0"/>
+          <w:color w:val="17202A"/>
+          <w:sz w:val="22"/>
+        </w:rPr>
+        <w:t>отдельный верхнеуровневый раздел меню не создавать;</w:t>
       </w:r>
     </w:p>
     <w:p>
@@ -3875,7 +3888,7 @@
           <w:color w:val="17202A"/>
           <w:sz w:val="22"/>
         </w:rPr>
-        <w:t xml:space="preserve">1.  </w:t>
+        <w:t xml:space="preserve">•  </w:t>
       </w:r>
       <w:r>
         <w:rPr>
@@ -3884,11 +3897,19 @@
           <w:color w:val="17202A"/>
           <w:sz w:val="22"/>
         </w:rPr>
-        <w:t>Максимальная длина сообщения.</w:t>
+        <w:t>доступ в MVP: только super-admin.</w:t>
       </w:r>
     </w:p>
     <w:p>
       <w:pPr>
+        <w:pStyle w:val="Heading2"/>
+      </w:pPr>
+      <w:r>
+        <w:t>13.2. Что управляется на странице</w:t>
+      </w:r>
+    </w:p>
+    <w:p>
+      <w:pPr>
         <w:spacing w:after="80" w:line="300" w:lineRule="exact"/>
         <w:ind w:left="605" w:hanging="374"/>
       </w:pPr>
@@ -3898,7 +3919,7 @@
           <w:color w:val="17202A"/>
           <w:sz w:val="22"/>
         </w:rPr>
-        <w:t xml:space="preserve">2.  </w:t>
+        <w:t xml:space="preserve">1.  </w:t>
       </w:r>
       <w:r>
         <w:rPr>
@@ -3907,7 +3928,7 @@
           <w:color w:val="17202A"/>
           <w:sz w:val="22"/>
         </w:rPr>
-        <w:t>Допустимое число сообщений и временное окно rate limit.</w:t>
+        <w:t>Максимальная длина сообщения.</w:t>
       </w:r>
     </w:p>
     <w:p>
@@ -3921,7 +3942,7 @@
           <w:color w:val="17202A"/>
           <w:sz w:val="22"/>
         </w:rPr>
-        <w:t xml:space="preserve">3.  </w:t>
+        <w:t xml:space="preserve">2.  </w:t>
       </w:r>
       <w:r>
         <w:rPr>
@@ -3930,7 +3951,7 @@
           <w:color w:val="17202A"/>
           <w:sz w:val="22"/>
         </w:rPr>
-        <w:t>Разрешённые document MIME/types, максимальный размер документа и число вложений.</w:t>
+        <w:t>Допустимое число сообщений и временное окно rate limit.</w:t>
       </w:r>
     </w:p>
     <w:p>
@@ -3944,7 +3965,7 @@
           <w:color w:val="17202A"/>
           <w:sz w:val="22"/>
         </w:rPr>
-        <w:t xml:space="preserve">4.  </w:t>
+        <w:t xml:space="preserve">3.  </w:t>
       </w:r>
       <w:r>
         <w:rPr>
@@ -3953,7 +3974,7 @@
           <w:color w:val="17202A"/>
           <w:sz w:val="22"/>
         </w:rPr>
-        <w:t>Chat-specific проверки документов, изображений, QR/OCR и поведение при невозможности проверки. Общие image limits из «Настройки фото» не дублировать.</w:t>
+        <w:t>Разрешённые document MIME/types, максимальный размер документа и число вложений.</w:t>
       </w:r>
     </w:p>
     <w:p>
@@ -3967,7 +3988,7 @@
           <w:color w:val="17202A"/>
           <w:sz w:val="22"/>
         </w:rPr>
-        <w:t xml:space="preserve">5.  </w:t>
+        <w:t xml:space="preserve">4.  </w:t>
       </w:r>
       <w:r>
         <w:rPr>
@@ -3976,7 +3997,7 @@
           <w:color w:val="17202A"/>
           <w:sz w:val="22"/>
         </w:rPr>
-        <w:t>Включение каждой категории цензуры.</w:t>
+        <w:t>Chat-specific проверки документов, изображений, QR/OCR и поведение при невозможности проверки. Общие image limits из «Настройки фото» не дублировать.</w:t>
       </w:r>
     </w:p>
     <w:p>
@@ -3990,7 +4011,7 @@
           <w:color w:val="17202A"/>
           <w:sz w:val="22"/>
         </w:rPr>
-        <w:t xml:space="preserve">6.  </w:t>
+        <w:t xml:space="preserve">5.  </w:t>
       </w:r>
       <w:r>
         <w:rPr>
@@ -3999,7 +4020,7 @@
           <w:color w:val="17202A"/>
           <w:sz w:val="22"/>
         </w:rPr>
-        <w:t>Allowlist/исключения, текст предупреждения, слово замены, порог повторных нарушений, версия detector/config и rollback.</w:t>
+        <w:t>Включение каждой категории цензуры.</w:t>
       </w:r>
     </w:p>
     <w:p>
@@ -4013,7 +4034,7 @@
           <w:color w:val="17202A"/>
           <w:sz w:val="22"/>
         </w:rPr>
-        <w:t xml:space="preserve">7.  </w:t>
+        <w:t xml:space="preserve">6.  </w:t>
       </w:r>
       <w:r>
         <w:rPr>
@@ -4022,7 +4043,7 @@
           <w:color w:val="17202A"/>
           <w:sz w:val="22"/>
         </w:rPr>
-        <w:t>Client reconnect grace; начальное значение 60 секунд.</w:t>
+        <w:t>Allowlist/исключения, текст предупреждения, слово замены, порог повторных нарушений, версия detector/config и rollback.</w:t>
       </w:r>
     </w:p>
     <w:p>
@@ -4036,7 +4057,7 @@
           <w:color w:val="17202A"/>
           <w:sz w:val="22"/>
         </w:rPr>
-        <w:t xml:space="preserve">8.  </w:t>
+        <w:t xml:space="preserve">7.  </w:t>
       </w:r>
       <w:r>
         <w:rPr>
@@ -4059,7 +4080,7 @@
           <w:color w:val="17202A"/>
           <w:sz w:val="22"/>
         </w:rPr>
-        <w:t xml:space="preserve">9.  </w:t>
+        <w:t xml:space="preserve">8.  </w:t>
       </w:r>
       <w:r>
         <w:rPr>
@@ -4068,7 +4089,7 @@
           <w:color w:val="17202A"/>
           <w:sz w:val="22"/>
         </w:rPr>
-        <w:t>Справочники причин скрытия и завершения.</w:t>
+        <w:t>Справочники причин скрытия сообщения.</w:t>
       </w:r>
     </w:p>
     <w:p>
@@ -4082,7 +4103,7 @@
           <w:color w:val="17202A"/>
           <w:sz w:val="22"/>
         </w:rPr>
-        <w:t xml:space="preserve">10.  </w:t>
+        <w:t xml:space="preserve">9.  </w:t>
       </w:r>
       <w:r>
         <w:rPr>
@@ -4091,7 +4112,7 @@
           <w:color w:val="17202A"/>
           <w:sz w:val="22"/>
         </w:rPr>
-        <w:t>Срок хранения истории; начальное значение 24 месяца.</w:t>
+        <w:t>Chat-specific client messages для delivery/edit/censorship и attachment outcomes.</w:t>
       </w:r>
     </w:p>
     <w:p>
@@ -4308,10 +4329,22 @@
           <w:color w:val="17202A"/>
           <w:sz w:val="22"/>
         </w:rPr>
-        <w:t>agent reconnect и session SLA, если они управляются в карточке консультации G1.1.</w:t>
+        <w:t>client/agent reconnect, request/session timers, balance pause и причины завершения — это «Настройки консультаций» G1.3;</w:t>
       </w:r>
     </w:p>
     <w:p>
+      <w:pPr>
+        <w:spacing w:after="80" w:line="300" w:lineRule="exact"/>
+        <w:ind w:left="605" w:hanging="374"/>
+      </w:pPr>
+      <w:r>
+        <w:rPr>
+          <w:rFonts w:ascii="Calibri" w:hAnsi="Calibri"/>
+          <w:color w:val="17202A"/>
+          <w:sz w:val="22"/>
+        </w:rPr>
+        <w:t xml:space="preserve">•  </w:t>
+      </w:r>
       <w:r>
         <w:rPr>
           <w:rFonts w:ascii="Calibri" w:hAnsi="Calibri"/>
@@ -4319,21 +4352,33 @@
           <w:color w:val="17202A"/>
           <w:sz w:val="22"/>
         </w:rPr>
-        <w:t>Typing/delivered/read, edited marker, idempotent retry, запрет физического удаления, разрешение текста/system/emoji/images/docs и запрет audio/video/arbitrary files являются обязательным поведением, а не выключателями.</w:t>
+        <w:t>client consultation history retention — это lifecycle/privacy contract G1.3/G4.3;</w:t>
       </w:r>
     </w:p>
     <w:p>
       <w:pPr>
-        <w:pStyle w:val="Heading1"/>
-      </w:pPr>
-      <w:r>
-        <w:t>14. Связанные задачи и границы</w:t>
+        <w:spacing w:after="80" w:line="300" w:lineRule="exact"/>
+        <w:ind w:left="605" w:hanging="374"/>
+      </w:pPr>
+      <w:r>
+        <w:rPr>
+          <w:rFonts w:ascii="Calibri" w:hAnsi="Calibri"/>
+          <w:color w:val="17202A"/>
+          <w:sz w:val="22"/>
+        </w:rPr>
+        <w:t xml:space="preserve">•  </w:t>
+      </w:r>
+      <w:r>
+        <w:rPr>
+          <w:rFonts w:ascii="Calibri" w:hAnsi="Calibri"/>
+          <w:b w:val="0"/>
+          <w:color w:val="17202A"/>
+          <w:sz w:val="22"/>
+        </w:rPr>
+        <w:t>quality sanctions, appeals и KPI.</w:t>
       </w:r>
     </w:p>
     <w:p>
-      <w:pPr>
-        <w:keepNext/>
-      </w:pPr>
       <w:r>
         <w:rPr>
           <w:rFonts w:ascii="Calibri" w:hAnsi="Calibri"/>
@@ -4341,11 +4386,33 @@
           <w:color w:val="17202A"/>
           <w:sz w:val="22"/>
         </w:rPr>
-        <w:t>Связанные задачи:</w:t>
+        <w:t>Typing/delivered/read, edited marker, idempotent retry, запрет физического удаления, разрешение текста/system/emoji/images/docs и запрет audio/video/arbitrary files являются обязательным поведением, а не выключателями.</w:t>
       </w:r>
     </w:p>
     <w:p>
       <w:pPr>
+        <w:pStyle w:val="Heading1"/>
+      </w:pPr>
+      <w:r>
+        <w:t>14. Связанные задачи и границы</w:t>
+      </w:r>
+    </w:p>
+    <w:p>
+      <w:pPr>
+        <w:keepNext/>
+      </w:pPr>
+      <w:r>
+        <w:rPr>
+          <w:rFonts w:ascii="Calibri" w:hAnsi="Calibri"/>
+          <w:b w:val="0"/>
+          <w:color w:val="17202A"/>
+          <w:sz w:val="22"/>
+        </w:rPr>
+        <w:t>Связанные задачи:</w:t>
+      </w:r>
+    </w:p>
+    <w:p>
+      <w:pPr>
         <w:spacing w:after="80" w:line="300" w:lineRule="exact"/>
         <w:ind w:left="605" w:hanging="374"/>
       </w:pPr>
@@ -4364,7 +4431,7 @@
           <w:color w:val="17202A"/>
           <w:sz w:val="22"/>
         </w:rPr>
-        <w:t>G1.1 — карточка и lifecycle consultation session;</w:t>
+        <w:t>G1.1 — административная карточка одной consultation session;</w:t>
       </w:r>
     </w:p>
     <w:p>
@@ -4387,7 +4454,7 @@
           <w:color w:val="17202A"/>
           <w:sz w:val="22"/>
         </w:rPr>
-        <w:t>G1.3 — статусы и история;</w:t>
+        <w:t>G1.3 — единственный владелец lifecycle, статусов, таймеров и клиентской истории consultation session;</w:t>
       </w:r>
     </w:p>
     <w:p>
@@ -4490,7 +4557,7 @@
           <w:color w:val="17202A"/>
           <w:sz w:val="22"/>
         </w:rPr>
-        <w:t>В G1.2 входит чат, роли в чате, видимость, сообщения, авторство, цензура, история и chat-specific настройки.</w:t>
+        <w:t>В G1.2 входят постоянный диалог, роли и видимость внутри чата, сообщения и вложения, авторство, цензура, доставка, версии сообщений, отображение chat-событий в истории и chat-specific настройки.</w:t>
       </w:r>
     </w:p>
     <w:p>
@@ -4501,7 +4568,7 @@
           <w:color w:val="17202A"/>
           <w:sz w:val="22"/>
         </w:rPr>
-        <w:t>В G1.2 не входит реализация общей RBAC-модели, расчёт списаний, создание цен/пакетов/coupons, paid queue, асинхронная paid-консультация, экспорт истории, отдельная support-роль, audio/video и автоматическая отправка AI-текста.</w:t>
+        <w:t>В G1.2 не входят lifecycle и расчёт состояний consultation session, реализация общей RBAC-модели, расчёт списаний, создание цен/пакетов/coupons, paid queue, асинхронная paid-консультация, список и retention клиентской истории, экспорт истории, отдельная support-роль, audio/video и автоматическая отправка AI-текста.</w:t>
       </w:r>
     </w:p>
     <w:p>
@@ -5068,7 +5135,7 @@
           <w:color w:val="17202A"/>
           <w:sz w:val="22"/>
         </w:rPr>
-        <w:t>Client reconnect в течение 60 секунд продолжает ту же session без новой минуты.</w:t>
+        <w:t>Chat корректно отображает reconnect-состояние, полученное из G1.3, но не рассчитывает его deadline самостоятельно.</w:t>
       </w:r>
     </w:p>
     <w:p>
@@ -5091,7 +5158,7 @@
           <w:color w:val="17202A"/>
           <w:sz w:val="22"/>
         </w:rPr>
-        <w:t>Timeout даёт technical end/support route без автоматического обещания купона.</w:t>
+        <w:t>Reconnect timeout, определённый G1.3, даёт technical end/support route без автоматического обещания купона.</w:t>
       </w:r>
     </w:p>
     <w:p>
@@ -5855,11 +5922,12 @@
       </w:r>
       <w:r>
         <w:rPr>
-          <w:rFonts w:ascii="Consolas" w:hAnsi="Consolas"/>
-          <w:color w:val="31445A"/>
-          <w:sz w:val="19"/>
-        </w:rPr>
-        <w:t>client reconnect grace = 60 секунд; retention = 24 месяца</w:t>
+          <w:rFonts w:ascii="Calibri" w:hAnsi="Calibri"/>
+          <w:b w:val="0"/>
+          <w:color w:val="5F6B7A"/>
+          <w:sz w:val="20"/>
+        </w:rPr>
+        <w:t>chat rate/attachment/censorship values; lifecycle timers и retention находятся в G1.3/G4.3</w:t>
       </w:r>
     </w:p>
     <w:p>

</xml_diff>

<commit_message>
docs: add unified Igor and Codex integration handoff
</commit_message>
<xml_diff>
--- a/reports/six-goals-functional-tz-2026-07-20/tz-g1-2-for-igor.docx
+++ b/reports/six-goals-functional-tz-2026-07-20/tz-g1-2-for-igor.docx
@@ -13,13 +13,14 @@
           <w:color w:val="175CD3"/>
           <w:sz w:val="18"/>
         </w:rPr>
-        <w:t>ТЕХНИЧЕСКОЕ ЗАДАНИЕ · ДЛЯ СОГЛАСОВАНИЯ</w:t>
+        <w:t>Nebula · Product specification</w:t>
       </w:r>
     </w:p>
     <w:p>
       <w:pPr>
         <w:keepNext/>
-        <w:spacing w:after="100"/>
+        <w:keepLines/>
+        <w:spacing w:after="100" w:line="240" w:lineRule="auto"/>
       </w:pPr>
       <w:r>
         <w:rPr>
@@ -41,7 +42,7 @@
           <w:color w:val="5F6B7A"/>
           <w:sz w:val="25"/>
         </w:rPr>
-        <w:t>Продуктовая постановка для вычитки и согласования с программистом</w:t>
+        <w:t>Продуктовая постановка для вычитки и согласования с программистом.</w:t>
       </w:r>
     </w:p>
     <w:tbl>
@@ -114,7 +115,7 @@
     </w:p>
     <w:p>
       <w:pPr>
-        <w:spacing w:after="80" w:line="300" w:lineRule="exact"/>
+        <w:spacing w:after="120" w:line="288" w:lineRule="auto"/>
         <w:ind w:left="605" w:hanging="374"/>
       </w:pPr>
       <w:r>
@@ -155,7 +156,7 @@
     </w:p>
     <w:p>
       <w:pPr>
-        <w:spacing w:after="80" w:line="300" w:lineRule="exact"/>
+        <w:spacing w:after="120" w:line="288" w:lineRule="auto"/>
         <w:ind w:left="605" w:hanging="374"/>
       </w:pPr>
       <w:r>
@@ -196,7 +197,7 @@
     </w:p>
     <w:p>
       <w:pPr>
-        <w:spacing w:after="80" w:line="300" w:lineRule="exact"/>
+        <w:spacing w:after="120" w:line="288" w:lineRule="auto"/>
         <w:ind w:left="605" w:hanging="374"/>
       </w:pPr>
       <w:r>
@@ -219,7 +220,7 @@
     </w:p>
     <w:p>
       <w:pPr>
-        <w:spacing w:after="80" w:line="300" w:lineRule="exact"/>
+        <w:spacing w:after="120" w:line="288" w:lineRule="auto"/>
         <w:ind w:left="605" w:hanging="374"/>
       </w:pPr>
       <w:r>
@@ -242,7 +243,7 @@
     </w:p>
     <w:p>
       <w:pPr>
-        <w:spacing w:after="80" w:line="300" w:lineRule="exact"/>
+        <w:spacing w:after="120" w:line="288" w:lineRule="auto"/>
         <w:ind w:left="605" w:hanging="374"/>
       </w:pPr>
       <w:r>
@@ -337,7 +338,7 @@
     </w:p>
     <w:p>
       <w:pPr>
-        <w:spacing w:after="80" w:line="300" w:lineRule="exact"/>
+        <w:spacing w:after="120" w:line="288" w:lineRule="auto"/>
         <w:ind w:left="605" w:hanging="374"/>
       </w:pPr>
       <w:r>
@@ -360,7 +361,7 @@
     </w:p>
     <w:p>
       <w:pPr>
-        <w:spacing w:after="80" w:line="300" w:lineRule="exact"/>
+        <w:spacing w:after="120" w:line="288" w:lineRule="auto"/>
         <w:ind w:left="605" w:hanging="374"/>
       </w:pPr>
       <w:r>
@@ -451,7 +452,7 @@
     </w:p>
     <w:p>
       <w:pPr>
-        <w:spacing w:after="80" w:line="300" w:lineRule="exact"/>
+        <w:spacing w:after="120" w:line="288" w:lineRule="auto"/>
         <w:ind w:left="605" w:hanging="374"/>
       </w:pPr>
       <w:r>
@@ -474,7 +475,7 @@
     </w:p>
     <w:p>
       <w:pPr>
-        <w:spacing w:after="80" w:line="300" w:lineRule="exact"/>
+        <w:spacing w:after="120" w:line="288" w:lineRule="auto"/>
         <w:ind w:left="605" w:hanging="374"/>
       </w:pPr>
       <w:r>
@@ -497,7 +498,7 @@
     </w:p>
     <w:p>
       <w:pPr>
-        <w:spacing w:after="80" w:line="300" w:lineRule="exact"/>
+        <w:spacing w:after="120" w:line="288" w:lineRule="auto"/>
         <w:ind w:left="605" w:hanging="374"/>
       </w:pPr>
       <w:r>
@@ -537,7 +538,7 @@
     </w:p>
     <w:p>
       <w:pPr>
-        <w:spacing w:after="80" w:line="300" w:lineRule="exact"/>
+        <w:spacing w:after="120" w:line="288" w:lineRule="auto"/>
         <w:ind w:left="605" w:hanging="374"/>
       </w:pPr>
       <w:r>
@@ -560,7 +561,7 @@
     </w:p>
     <w:p>
       <w:pPr>
-        <w:spacing w:after="80" w:line="300" w:lineRule="exact"/>
+        <w:spacing w:after="120" w:line="288" w:lineRule="auto"/>
         <w:ind w:left="605" w:hanging="374"/>
       </w:pPr>
       <w:r>
@@ -699,7 +700,7 @@
     </w:p>
     <w:p>
       <w:pPr>
-        <w:spacing w:after="80" w:line="300" w:lineRule="exact"/>
+        <w:spacing w:after="120" w:line="288" w:lineRule="auto"/>
         <w:ind w:left="605" w:hanging="374"/>
       </w:pPr>
       <w:r>
@@ -722,7 +723,7 @@
     </w:p>
     <w:p>
       <w:pPr>
-        <w:spacing w:after="80" w:line="300" w:lineRule="exact"/>
+        <w:spacing w:after="120" w:line="288" w:lineRule="auto"/>
         <w:ind w:left="605" w:hanging="374"/>
       </w:pPr>
       <w:r>
@@ -745,7 +746,7 @@
     </w:p>
     <w:p>
       <w:pPr>
-        <w:spacing w:after="80" w:line="300" w:lineRule="exact"/>
+        <w:spacing w:after="120" w:line="288" w:lineRule="auto"/>
         <w:ind w:left="605" w:hanging="374"/>
       </w:pPr>
       <w:r>
@@ -768,7 +769,7 @@
     </w:p>
     <w:p>
       <w:pPr>
-        <w:spacing w:after="80" w:line="300" w:lineRule="exact"/>
+        <w:spacing w:after="120" w:line="288" w:lineRule="auto"/>
         <w:ind w:left="605" w:hanging="374"/>
       </w:pPr>
       <w:r>
@@ -825,7 +826,7 @@
     </w:p>
     <w:p>
       <w:pPr>
-        <w:spacing w:after="80" w:line="300" w:lineRule="exact"/>
+        <w:spacing w:after="120" w:line="288" w:lineRule="auto"/>
         <w:ind w:left="605" w:hanging="374"/>
       </w:pPr>
       <w:r>
@@ -848,7 +849,7 @@
     </w:p>
     <w:p>
       <w:pPr>
-        <w:spacing w:after="80" w:line="300" w:lineRule="exact"/>
+        <w:spacing w:after="120" w:line="288" w:lineRule="auto"/>
         <w:ind w:left="605" w:hanging="374"/>
       </w:pPr>
       <w:r>
@@ -871,7 +872,7 @@
     </w:p>
     <w:p>
       <w:pPr>
-        <w:spacing w:after="80" w:line="300" w:lineRule="exact"/>
+        <w:spacing w:after="120" w:line="288" w:lineRule="auto"/>
         <w:ind w:left="605" w:hanging="374"/>
       </w:pPr>
       <w:r>
@@ -941,7 +942,7 @@
     </w:p>
     <w:p>
       <w:pPr>
-        <w:spacing w:after="80" w:line="300" w:lineRule="exact"/>
+        <w:spacing w:after="120" w:line="288" w:lineRule="auto"/>
         <w:ind w:left="605" w:hanging="374"/>
       </w:pPr>
       <w:r>
@@ -964,7 +965,7 @@
     </w:p>
     <w:p>
       <w:pPr>
-        <w:spacing w:after="80" w:line="300" w:lineRule="exact"/>
+        <w:spacing w:after="120" w:line="288" w:lineRule="auto"/>
         <w:ind w:left="605" w:hanging="374"/>
       </w:pPr>
       <w:r>
@@ -987,7 +988,7 @@
     </w:p>
     <w:p>
       <w:pPr>
-        <w:spacing w:after="80" w:line="300" w:lineRule="exact"/>
+        <w:spacing w:after="120" w:line="288" w:lineRule="auto"/>
         <w:ind w:left="605" w:hanging="374"/>
       </w:pPr>
       <w:r>
@@ -1010,7 +1011,7 @@
     </w:p>
     <w:p>
       <w:pPr>
-        <w:spacing w:after="80" w:line="300" w:lineRule="exact"/>
+        <w:spacing w:after="120" w:line="288" w:lineRule="auto"/>
         <w:ind w:left="605" w:hanging="374"/>
       </w:pPr>
       <w:r>
@@ -1066,7 +1067,7 @@
     </w:p>
     <w:p>
       <w:pPr>
-        <w:spacing w:after="80" w:line="300" w:lineRule="exact"/>
+        <w:spacing w:after="120" w:line="288" w:lineRule="auto"/>
         <w:ind w:left="605" w:hanging="374"/>
       </w:pPr>
       <w:r>
@@ -1089,7 +1090,7 @@
     </w:p>
     <w:p>
       <w:pPr>
-        <w:spacing w:after="80" w:line="300" w:lineRule="exact"/>
+        <w:spacing w:after="120" w:line="288" w:lineRule="auto"/>
         <w:ind w:left="605" w:hanging="374"/>
       </w:pPr>
       <w:r>
@@ -1112,7 +1113,7 @@
     </w:p>
     <w:p>
       <w:pPr>
-        <w:spacing w:after="80" w:line="300" w:lineRule="exact"/>
+        <w:spacing w:after="120" w:line="288" w:lineRule="auto"/>
         <w:ind w:left="605" w:hanging="374"/>
       </w:pPr>
       <w:r>
@@ -1135,7 +1136,7 @@
     </w:p>
     <w:p>
       <w:pPr>
-        <w:spacing w:after="80" w:line="300" w:lineRule="exact"/>
+        <w:spacing w:after="120" w:line="288" w:lineRule="auto"/>
         <w:ind w:left="605" w:hanging="374"/>
       </w:pPr>
       <w:r>
@@ -1158,7 +1159,7 @@
     </w:p>
     <w:p>
       <w:pPr>
-        <w:spacing w:after="80" w:line="300" w:lineRule="exact"/>
+        <w:spacing w:after="120" w:line="288" w:lineRule="auto"/>
         <w:ind w:left="605" w:hanging="374"/>
       </w:pPr>
       <w:r>
@@ -1244,7 +1245,7 @@
     </w:p>
     <w:p>
       <w:pPr>
-        <w:spacing w:after="80" w:line="300" w:lineRule="exact"/>
+        <w:spacing w:after="120" w:line="288" w:lineRule="auto"/>
         <w:ind w:left="605" w:hanging="374"/>
       </w:pPr>
       <w:r>
@@ -1267,7 +1268,7 @@
     </w:p>
     <w:p>
       <w:pPr>
-        <w:spacing w:after="80" w:line="300" w:lineRule="exact"/>
+        <w:spacing w:after="120" w:line="288" w:lineRule="auto"/>
         <w:ind w:left="605" w:hanging="374"/>
       </w:pPr>
       <w:r>
@@ -1323,7 +1324,7 @@
     </w:p>
     <w:p>
       <w:pPr>
-        <w:spacing w:after="80" w:line="300" w:lineRule="exact"/>
+        <w:spacing w:after="120" w:line="288" w:lineRule="auto"/>
         <w:ind w:left="605" w:hanging="374"/>
       </w:pPr>
       <w:r>
@@ -1346,7 +1347,7 @@
     </w:p>
     <w:p>
       <w:pPr>
-        <w:spacing w:after="80" w:line="300" w:lineRule="exact"/>
+        <w:spacing w:after="120" w:line="288" w:lineRule="auto"/>
         <w:ind w:left="605" w:hanging="374"/>
       </w:pPr>
       <w:r>
@@ -1369,7 +1370,7 @@
     </w:p>
     <w:p>
       <w:pPr>
-        <w:spacing w:after="80" w:line="300" w:lineRule="exact"/>
+        <w:spacing w:after="120" w:line="288" w:lineRule="auto"/>
         <w:ind w:left="605" w:hanging="374"/>
       </w:pPr>
       <w:r>
@@ -1392,7 +1393,7 @@
     </w:p>
     <w:p>
       <w:pPr>
-        <w:spacing w:after="80" w:line="300" w:lineRule="exact"/>
+        <w:spacing w:after="120" w:line="288" w:lineRule="auto"/>
         <w:ind w:left="605" w:hanging="374"/>
       </w:pPr>
       <w:r>
@@ -1432,7 +1433,7 @@
     </w:p>
     <w:p>
       <w:pPr>
-        <w:spacing w:after="80" w:line="300" w:lineRule="exact"/>
+        <w:spacing w:after="120" w:line="288" w:lineRule="auto"/>
         <w:ind w:left="605" w:hanging="374"/>
       </w:pPr>
       <w:r>
@@ -1477,7 +1478,7 @@
     </w:p>
     <w:p>
       <w:pPr>
-        <w:spacing w:after="80" w:line="300" w:lineRule="exact"/>
+        <w:spacing w:after="120" w:line="288" w:lineRule="auto"/>
         <w:ind w:left="605" w:hanging="374"/>
       </w:pPr>
       <w:r>
@@ -1500,7 +1501,7 @@
     </w:p>
     <w:p>
       <w:pPr>
-        <w:spacing w:after="80" w:line="300" w:lineRule="exact"/>
+        <w:spacing w:after="120" w:line="288" w:lineRule="auto"/>
         <w:ind w:left="605" w:hanging="374"/>
       </w:pPr>
       <w:r>
@@ -1523,7 +1524,7 @@
     </w:p>
     <w:p>
       <w:pPr>
-        <w:spacing w:after="80" w:line="300" w:lineRule="exact"/>
+        <w:spacing w:after="120" w:line="288" w:lineRule="auto"/>
         <w:ind w:left="605" w:hanging="374"/>
       </w:pPr>
       <w:r>
@@ -1546,7 +1547,7 @@
     </w:p>
     <w:p>
       <w:pPr>
-        <w:spacing w:after="80" w:line="300" w:lineRule="exact"/>
+        <w:spacing w:after="120" w:line="288" w:lineRule="auto"/>
         <w:ind w:left="605" w:hanging="374"/>
       </w:pPr>
       <w:r>
@@ -1569,7 +1570,7 @@
     </w:p>
     <w:p>
       <w:pPr>
-        <w:spacing w:after="80" w:line="300" w:lineRule="exact"/>
+        <w:spacing w:after="120" w:line="288" w:lineRule="auto"/>
         <w:ind w:left="605" w:hanging="374"/>
       </w:pPr>
       <w:r>
@@ -1592,7 +1593,7 @@
     </w:p>
     <w:p>
       <w:pPr>
-        <w:spacing w:after="80" w:line="300" w:lineRule="exact"/>
+        <w:spacing w:after="120" w:line="288" w:lineRule="auto"/>
         <w:ind w:left="605" w:hanging="374"/>
       </w:pPr>
       <w:r>
@@ -1615,7 +1616,7 @@
     </w:p>
     <w:p>
       <w:pPr>
-        <w:spacing w:after="80" w:line="300" w:lineRule="exact"/>
+        <w:spacing w:after="120" w:line="288" w:lineRule="auto"/>
         <w:ind w:left="605" w:hanging="374"/>
       </w:pPr>
       <w:r>
@@ -1638,7 +1639,7 @@
     </w:p>
     <w:p>
       <w:pPr>
-        <w:spacing w:after="80" w:line="300" w:lineRule="exact"/>
+        <w:spacing w:after="120" w:line="288" w:lineRule="auto"/>
         <w:ind w:left="605" w:hanging="374"/>
       </w:pPr>
       <w:r>
@@ -1661,7 +1662,7 @@
     </w:p>
     <w:p>
       <w:pPr>
-        <w:spacing w:after="80" w:line="300" w:lineRule="exact"/>
+        <w:spacing w:after="120" w:line="288" w:lineRule="auto"/>
         <w:ind w:left="605" w:hanging="374"/>
       </w:pPr>
       <w:r>
@@ -1684,7 +1685,7 @@
     </w:p>
     <w:p>
       <w:pPr>
-        <w:spacing w:after="80" w:line="300" w:lineRule="exact"/>
+        <w:spacing w:after="120" w:line="288" w:lineRule="auto"/>
         <w:ind w:left="605" w:hanging="374"/>
       </w:pPr>
       <w:r>
@@ -1707,7 +1708,7 @@
     </w:p>
     <w:p>
       <w:pPr>
-        <w:spacing w:after="80" w:line="300" w:lineRule="exact"/>
+        <w:spacing w:after="120" w:line="288" w:lineRule="auto"/>
         <w:ind w:left="605" w:hanging="374"/>
       </w:pPr>
       <w:r>
@@ -1730,7 +1731,7 @@
     </w:p>
     <w:p>
       <w:pPr>
-        <w:spacing w:after="80" w:line="300" w:lineRule="exact"/>
+        <w:spacing w:after="120" w:line="288" w:lineRule="auto"/>
         <w:ind w:left="605" w:hanging="374"/>
       </w:pPr>
       <w:r>
@@ -1753,7 +1754,7 @@
     </w:p>
     <w:p>
       <w:pPr>
-        <w:spacing w:after="80" w:line="300" w:lineRule="exact"/>
+        <w:spacing w:after="120" w:line="288" w:lineRule="auto"/>
         <w:ind w:left="605" w:hanging="374"/>
       </w:pPr>
       <w:r>
@@ -1809,7 +1810,7 @@
     </w:p>
     <w:p>
       <w:pPr>
-        <w:spacing w:after="80" w:line="300" w:lineRule="exact"/>
+        <w:spacing w:after="120" w:line="288" w:lineRule="auto"/>
         <w:ind w:left="605" w:hanging="374"/>
       </w:pPr>
       <w:r>
@@ -1832,7 +1833,7 @@
     </w:p>
     <w:p>
       <w:pPr>
-        <w:spacing w:after="80" w:line="300" w:lineRule="exact"/>
+        <w:spacing w:after="120" w:line="288" w:lineRule="auto"/>
         <w:ind w:left="605" w:hanging="374"/>
       </w:pPr>
       <w:r>
@@ -1855,7 +1856,7 @@
     </w:p>
     <w:p>
       <w:pPr>
-        <w:spacing w:after="80" w:line="300" w:lineRule="exact"/>
+        <w:spacing w:after="120" w:line="288" w:lineRule="auto"/>
         <w:ind w:left="605" w:hanging="374"/>
       </w:pPr>
       <w:r>
@@ -1878,7 +1879,7 @@
     </w:p>
     <w:p>
       <w:pPr>
-        <w:spacing w:after="80" w:line="300" w:lineRule="exact"/>
+        <w:spacing w:after="120" w:line="288" w:lineRule="auto"/>
         <w:ind w:left="605" w:hanging="374"/>
       </w:pPr>
       <w:r>
@@ -1901,7 +1902,7 @@
     </w:p>
     <w:p>
       <w:pPr>
-        <w:spacing w:after="80" w:line="300" w:lineRule="exact"/>
+        <w:spacing w:after="120" w:line="288" w:lineRule="auto"/>
         <w:ind w:left="605" w:hanging="374"/>
       </w:pPr>
       <w:r>
@@ -2094,7 +2095,7 @@
     </w:p>
     <w:p>
       <w:pPr>
-        <w:spacing w:after="80" w:line="300" w:lineRule="exact"/>
+        <w:spacing w:after="120" w:line="288" w:lineRule="auto"/>
         <w:ind w:left="605" w:hanging="374"/>
       </w:pPr>
       <w:r>
@@ -2117,7 +2118,7 @@
     </w:p>
     <w:p>
       <w:pPr>
-        <w:spacing w:after="80" w:line="300" w:lineRule="exact"/>
+        <w:spacing w:after="120" w:line="288" w:lineRule="auto"/>
         <w:ind w:left="605" w:hanging="374"/>
       </w:pPr>
       <w:r>
@@ -2140,7 +2141,7 @@
     </w:p>
     <w:p>
       <w:pPr>
-        <w:spacing w:after="80" w:line="300" w:lineRule="exact"/>
+        <w:spacing w:after="120" w:line="288" w:lineRule="auto"/>
         <w:ind w:left="605" w:hanging="374"/>
       </w:pPr>
       <w:r>
@@ -2163,7 +2164,7 @@
     </w:p>
     <w:p>
       <w:pPr>
-        <w:spacing w:after="80" w:line="300" w:lineRule="exact"/>
+        <w:spacing w:after="120" w:line="288" w:lineRule="auto"/>
         <w:ind w:left="605" w:hanging="374"/>
       </w:pPr>
       <w:r>
@@ -2186,7 +2187,7 @@
     </w:p>
     <w:p>
       <w:pPr>
-        <w:spacing w:after="80" w:line="300" w:lineRule="exact"/>
+        <w:spacing w:after="120" w:line="288" w:lineRule="auto"/>
         <w:ind w:left="605" w:hanging="374"/>
       </w:pPr>
       <w:r>
@@ -2209,7 +2210,7 @@
     </w:p>
     <w:p>
       <w:pPr>
-        <w:spacing w:after="80" w:line="300" w:lineRule="exact"/>
+        <w:spacing w:after="120" w:line="288" w:lineRule="auto"/>
         <w:ind w:left="605" w:hanging="374"/>
       </w:pPr>
       <w:r>
@@ -2232,7 +2233,7 @@
     </w:p>
     <w:p>
       <w:pPr>
-        <w:spacing w:after="80" w:line="300" w:lineRule="exact"/>
+        <w:spacing w:after="120" w:line="288" w:lineRule="auto"/>
         <w:ind w:left="605" w:hanging="374"/>
       </w:pPr>
       <w:r>
@@ -2255,7 +2256,7 @@
     </w:p>
     <w:p>
       <w:pPr>
-        <w:spacing w:after="80" w:line="300" w:lineRule="exact"/>
+        <w:spacing w:after="120" w:line="288" w:lineRule="auto"/>
         <w:ind w:left="605" w:hanging="374"/>
       </w:pPr>
       <w:r>
@@ -2278,7 +2279,7 @@
     </w:p>
     <w:p>
       <w:pPr>
-        <w:spacing w:after="80" w:line="300" w:lineRule="exact"/>
+        <w:spacing w:after="120" w:line="288" w:lineRule="auto"/>
         <w:ind w:left="605" w:hanging="374"/>
       </w:pPr>
       <w:r>
@@ -2334,7 +2335,7 @@
     </w:p>
     <w:p>
       <w:pPr>
-        <w:spacing w:after="80" w:line="300" w:lineRule="exact"/>
+        <w:spacing w:after="120" w:line="288" w:lineRule="auto"/>
         <w:ind w:left="605" w:hanging="374"/>
       </w:pPr>
       <w:r>
@@ -2357,7 +2358,7 @@
     </w:p>
     <w:p>
       <w:pPr>
-        <w:spacing w:after="80" w:line="300" w:lineRule="exact"/>
+        <w:spacing w:after="120" w:line="288" w:lineRule="auto"/>
         <w:ind w:left="605" w:hanging="374"/>
       </w:pPr>
       <w:r>
@@ -2380,7 +2381,7 @@
     </w:p>
     <w:p>
       <w:pPr>
-        <w:spacing w:after="80" w:line="300" w:lineRule="exact"/>
+        <w:spacing w:after="120" w:line="288" w:lineRule="auto"/>
         <w:ind w:left="605" w:hanging="374"/>
       </w:pPr>
       <w:r>
@@ -2421,7 +2422,7 @@
     </w:p>
     <w:p>
       <w:pPr>
-        <w:spacing w:after="80" w:line="300" w:lineRule="exact"/>
+        <w:spacing w:after="120" w:line="288" w:lineRule="auto"/>
         <w:ind w:left="605" w:hanging="374"/>
       </w:pPr>
       <w:r>
@@ -2579,7 +2580,7 @@
     </w:p>
     <w:p>
       <w:pPr>
-        <w:spacing w:after="80" w:line="300" w:lineRule="exact"/>
+        <w:spacing w:after="120" w:line="288" w:lineRule="auto"/>
         <w:ind w:left="605" w:hanging="374"/>
       </w:pPr>
       <w:r>
@@ -2602,7 +2603,7 @@
     </w:p>
     <w:p>
       <w:pPr>
-        <w:spacing w:after="80" w:line="300" w:lineRule="exact"/>
+        <w:spacing w:after="120" w:line="288" w:lineRule="auto"/>
         <w:ind w:left="605" w:hanging="374"/>
       </w:pPr>
       <w:r>
@@ -2625,7 +2626,7 @@
     </w:p>
     <w:p>
       <w:pPr>
-        <w:spacing w:after="80" w:line="300" w:lineRule="exact"/>
+        <w:spacing w:after="120" w:line="288" w:lineRule="auto"/>
         <w:ind w:left="605" w:hanging="374"/>
       </w:pPr>
       <w:r>
@@ -2648,7 +2649,7 @@
     </w:p>
     <w:p>
       <w:pPr>
-        <w:spacing w:after="80" w:line="300" w:lineRule="exact"/>
+        <w:spacing w:after="120" w:line="288" w:lineRule="auto"/>
         <w:ind w:left="605" w:hanging="374"/>
       </w:pPr>
       <w:r>
@@ -2693,7 +2694,7 @@
     </w:p>
     <w:p>
       <w:pPr>
-        <w:spacing w:after="80" w:line="300" w:lineRule="exact"/>
+        <w:spacing w:after="120" w:line="288" w:lineRule="auto"/>
         <w:ind w:left="605" w:hanging="374"/>
       </w:pPr>
       <w:r>
@@ -2716,7 +2717,7 @@
     </w:p>
     <w:p>
       <w:pPr>
-        <w:spacing w:after="80" w:line="300" w:lineRule="exact"/>
+        <w:spacing w:after="120" w:line="288" w:lineRule="auto"/>
         <w:ind w:left="605" w:hanging="374"/>
       </w:pPr>
       <w:r>
@@ -2739,7 +2740,7 @@
     </w:p>
     <w:p>
       <w:pPr>
-        <w:spacing w:after="80" w:line="300" w:lineRule="exact"/>
+        <w:spacing w:after="120" w:line="288" w:lineRule="auto"/>
         <w:ind w:left="605" w:hanging="374"/>
       </w:pPr>
       <w:r>
@@ -2762,7 +2763,7 @@
     </w:p>
     <w:p>
       <w:pPr>
-        <w:spacing w:after="80" w:line="300" w:lineRule="exact"/>
+        <w:spacing w:after="120" w:line="288" w:lineRule="auto"/>
         <w:ind w:left="605" w:hanging="374"/>
       </w:pPr>
       <w:r>
@@ -2835,7 +2836,7 @@
     </w:p>
     <w:p>
       <w:pPr>
-        <w:spacing w:after="80" w:line="300" w:lineRule="exact"/>
+        <w:spacing w:after="120" w:line="288" w:lineRule="auto"/>
         <w:ind w:left="605" w:hanging="374"/>
       </w:pPr>
       <w:r>
@@ -2858,7 +2859,7 @@
     </w:p>
     <w:p>
       <w:pPr>
-        <w:spacing w:after="80" w:line="300" w:lineRule="exact"/>
+        <w:spacing w:after="120" w:line="288" w:lineRule="auto"/>
         <w:ind w:left="605" w:hanging="374"/>
       </w:pPr>
       <w:r>
@@ -2881,7 +2882,7 @@
     </w:p>
     <w:p>
       <w:pPr>
-        <w:spacing w:after="80" w:line="300" w:lineRule="exact"/>
+        <w:spacing w:after="120" w:line="288" w:lineRule="auto"/>
         <w:ind w:left="605" w:hanging="374"/>
       </w:pPr>
       <w:r>
@@ -2904,7 +2905,7 @@
     </w:p>
     <w:p>
       <w:pPr>
-        <w:spacing w:after="80" w:line="300" w:lineRule="exact"/>
+        <w:spacing w:after="120" w:line="288" w:lineRule="auto"/>
         <w:ind w:left="605" w:hanging="374"/>
       </w:pPr>
       <w:r>
@@ -2927,7 +2928,7 @@
     </w:p>
     <w:p>
       <w:pPr>
-        <w:spacing w:after="80" w:line="300" w:lineRule="exact"/>
+        <w:spacing w:after="120" w:line="288" w:lineRule="auto"/>
         <w:ind w:left="605" w:hanging="374"/>
       </w:pPr>
       <w:r>
@@ -2950,7 +2951,7 @@
     </w:p>
     <w:p>
       <w:pPr>
-        <w:spacing w:after="80" w:line="300" w:lineRule="exact"/>
+        <w:spacing w:after="120" w:line="288" w:lineRule="auto"/>
         <w:ind w:left="605" w:hanging="374"/>
       </w:pPr>
       <w:r>
@@ -3006,7 +3007,7 @@
     </w:p>
     <w:p>
       <w:pPr>
-        <w:spacing w:after="80" w:line="300" w:lineRule="exact"/>
+        <w:spacing w:after="120" w:line="288" w:lineRule="auto"/>
         <w:ind w:left="605" w:hanging="374"/>
       </w:pPr>
       <w:r>
@@ -3029,7 +3030,7 @@
     </w:p>
     <w:p>
       <w:pPr>
-        <w:spacing w:after="80" w:line="300" w:lineRule="exact"/>
+        <w:spacing w:after="120" w:line="288" w:lineRule="auto"/>
         <w:ind w:left="605" w:hanging="374"/>
       </w:pPr>
       <w:r>
@@ -3052,7 +3053,7 @@
     </w:p>
     <w:p>
       <w:pPr>
-        <w:spacing w:after="80" w:line="300" w:lineRule="exact"/>
+        <w:spacing w:after="120" w:line="288" w:lineRule="auto"/>
         <w:ind w:left="605" w:hanging="374"/>
       </w:pPr>
       <w:r>
@@ -3075,7 +3076,7 @@
     </w:p>
     <w:p>
       <w:pPr>
-        <w:spacing w:after="80" w:line="300" w:lineRule="exact"/>
+        <w:spacing w:after="120" w:line="288" w:lineRule="auto"/>
         <w:ind w:left="605" w:hanging="374"/>
       </w:pPr>
       <w:r>
@@ -3098,7 +3099,7 @@
     </w:p>
     <w:p>
       <w:pPr>
-        <w:spacing w:after="80" w:line="300" w:lineRule="exact"/>
+        <w:spacing w:after="120" w:line="288" w:lineRule="auto"/>
         <w:ind w:left="605" w:hanging="374"/>
       </w:pPr>
       <w:r>
@@ -3121,7 +3122,7 @@
     </w:p>
     <w:p>
       <w:pPr>
-        <w:spacing w:after="80" w:line="300" w:lineRule="exact"/>
+        <w:spacing w:after="120" w:line="288" w:lineRule="auto"/>
         <w:ind w:left="605" w:hanging="374"/>
       </w:pPr>
       <w:r>
@@ -3144,7 +3145,7 @@
     </w:p>
     <w:p>
       <w:pPr>
-        <w:spacing w:after="80" w:line="300" w:lineRule="exact"/>
+        <w:spacing w:after="120" w:line="288" w:lineRule="auto"/>
         <w:ind w:left="605" w:hanging="374"/>
       </w:pPr>
       <w:r>
@@ -3167,7 +3168,7 @@
     </w:p>
     <w:p>
       <w:pPr>
-        <w:spacing w:after="80" w:line="300" w:lineRule="exact"/>
+        <w:spacing w:after="120" w:line="288" w:lineRule="auto"/>
         <w:ind w:left="605" w:hanging="374"/>
       </w:pPr>
       <w:r>
@@ -3222,40 +3223,46 @@
       </w:r>
     </w:p>
     <w:p>
-      <w:pPr>
-        <w:pStyle w:val="Heading1"/>
-      </w:pPr>
-      <w:r>
-        <w:t>11. Что видно Агенту</w:t>
+      <w:r>
+        <w:rPr>
+          <w:rFonts w:ascii="Calibri" w:hAnsi="Calibri"/>
+          <w:b w:val="0"/>
+          <w:color w:val="17202A"/>
+          <w:sz w:val="22"/>
+        </w:rPr>
+        <w:t xml:space="preserve">В утверждённом admin-макете сохраняется действие </w:t>
+      </w:r>
+      <w:r>
+        <w:rPr>
+          <w:rFonts w:ascii="Calibri" w:hAnsi="Calibri"/>
+          <w:b/>
+          <w:color w:val="17202A"/>
+          <w:sz w:val="22"/>
+        </w:rPr>
+        <w:t>«Copy history»</w:t>
+      </w:r>
+      <w:r>
+        <w:rPr>
+          <w:rFonts w:ascii="Calibri" w:hAnsi="Calibri"/>
+          <w:b w:val="0"/>
+          <w:color w:val="17202A"/>
+          <w:sz w:val="22"/>
+        </w:rPr>
+        <w:t>. В MVP оно доступно super-admin; позднее право можно выдать staff через существующий permissions-контур. Это не клиентское скачивание или экспорт. В буфер попадает только recipient-safe текущий диалог/связанный session-контекст: без private notes, исходных censored-фрагментов, платёжных данных, внутренних ID и служебных комментариев. Содержимое должно быть сформировано из server-safe представления, а факт копирования хранится в audit с actor, ролью, scope, временем и версией применённых правил.</w:t>
       </w:r>
     </w:p>
     <w:p>
       <w:pPr>
-        <w:keepNext/>
-      </w:pPr>
-      <w:r>
-        <w:rPr>
-          <w:rFonts w:ascii="Calibri" w:hAnsi="Calibri"/>
-          <w:b w:val="0"/>
-          <w:color w:val="17202A"/>
-          <w:sz w:val="22"/>
-        </w:rPr>
-        <w:t>В одном рабочем контуре Агент должен понимать:</w:t>
+        <w:pStyle w:val="Heading1"/>
+      </w:pPr>
+      <w:r>
+        <w:t>11. Что видно Агенту</w:t>
       </w:r>
     </w:p>
     <w:p>
       <w:pPr>
-        <w:spacing w:after="80" w:line="300" w:lineRule="exact"/>
-        <w:ind w:left="605" w:hanging="374"/>
-      </w:pPr>
-      <w:r>
-        <w:rPr>
-          <w:rFonts w:ascii="Calibri" w:hAnsi="Calibri"/>
-          <w:color w:val="17202A"/>
-          <w:sz w:val="22"/>
-        </w:rPr>
-        <w:t xml:space="preserve">•  </w:t>
-      </w:r>
+        <w:keepNext/>
+      </w:pPr>
       <w:r>
         <w:rPr>
           <w:rFonts w:ascii="Calibri" w:hAnsi="Calibri"/>
@@ -3263,12 +3270,12 @@
           <w:color w:val="17202A"/>
           <w:sz w:val="22"/>
         </w:rPr>
-        <w:t>от какой экспертной анкеты он отвечает;</w:t>
+        <w:t>В одном рабочем контуре Агент должен понимать:</w:t>
       </w:r>
     </w:p>
     <w:p>
       <w:pPr>
-        <w:spacing w:after="80" w:line="300" w:lineRule="exact"/>
+        <w:spacing w:after="120" w:line="288" w:lineRule="auto"/>
         <w:ind w:left="605" w:hanging="374"/>
       </w:pPr>
       <w:r>
@@ -3286,12 +3293,12 @@
           <w:color w:val="17202A"/>
           <w:sz w:val="22"/>
         </w:rPr>
-        <w:t>какой клиент, кейс, диалог и session активны;</w:t>
+        <w:t>от какой экспертной анкеты он отвечает;</w:t>
       </w:r>
     </w:p>
     <w:p>
       <w:pPr>
-        <w:spacing w:after="80" w:line="300" w:lineRule="exact"/>
+        <w:spacing w:after="120" w:line="288" w:lineRule="auto"/>
         <w:ind w:left="605" w:hanging="374"/>
       </w:pPr>
       <w:r>
@@ -3309,12 +3316,12 @@
           <w:color w:val="17202A"/>
           <w:sz w:val="22"/>
         </w:rPr>
-        <w:t>free/trial/paid/pause/end состояние;</w:t>
+        <w:t>какой клиент, кейс, диалог и session активны;</w:t>
       </w:r>
     </w:p>
     <w:p>
       <w:pPr>
-        <w:spacing w:after="80" w:line="300" w:lineRule="exact"/>
+        <w:spacing w:after="120" w:line="288" w:lineRule="auto"/>
         <w:ind w:left="605" w:hanging="374"/>
       </w:pPr>
       <w:r>
@@ -3332,12 +3339,12 @@
           <w:color w:val="17202A"/>
           <w:sz w:val="22"/>
         </w:rPr>
-        <w:t>разрешена ли отправка;</w:t>
+        <w:t>free/trial/paid/pause/end состояние;</w:t>
       </w:r>
     </w:p>
     <w:p>
       <w:pPr>
-        <w:spacing w:after="80" w:line="300" w:lineRule="exact"/>
+        <w:spacing w:after="120" w:line="288" w:lineRule="auto"/>
         <w:ind w:left="605" w:hanging="374"/>
       </w:pPr>
       <w:r>
@@ -3355,12 +3362,12 @@
           <w:color w:val="17202A"/>
           <w:sz w:val="22"/>
         </w:rPr>
-        <w:t>актуальную версию правил;</w:t>
+        <w:t>разрешена ли отправка;</w:t>
       </w:r>
     </w:p>
     <w:p>
       <w:pPr>
-        <w:spacing w:after="80" w:line="300" w:lineRule="exact"/>
+        <w:spacing w:after="120" w:line="288" w:lineRule="auto"/>
         <w:ind w:left="605" w:hanging="374"/>
       </w:pPr>
       <w:r>
@@ -3378,12 +3385,12 @@
           <w:color w:val="17202A"/>
           <w:sz w:val="22"/>
         </w:rPr>
-        <w:t>применимые quality/support/safety flags;</w:t>
+        <w:t>актуальную версию правил;</w:t>
       </w:r>
     </w:p>
     <w:p>
       <w:pPr>
-        <w:spacing w:after="80" w:line="300" w:lineRule="exact"/>
+        <w:spacing w:after="120" w:line="288" w:lineRule="auto"/>
         <w:ind w:left="605" w:hanging="374"/>
       </w:pPr>
       <w:r>
@@ -3401,10 +3408,22 @@
           <w:color w:val="17202A"/>
           <w:sz w:val="22"/>
         </w:rPr>
-        <w:t>требуется ли top-up, продолжение, завершение или передача в поддержку.</w:t>
+        <w:t>применимые quality/support/safety flags;</w:t>
       </w:r>
     </w:p>
     <w:p>
+      <w:pPr>
+        <w:spacing w:after="120" w:line="288" w:lineRule="auto"/>
+        <w:ind w:left="605" w:hanging="374"/>
+      </w:pPr>
+      <w:r>
+        <w:rPr>
+          <w:rFonts w:ascii="Calibri" w:hAnsi="Calibri"/>
+          <w:color w:val="17202A"/>
+          <w:sz w:val="22"/>
+        </w:rPr>
+        <w:t xml:space="preserve">•  </w:t>
+      </w:r>
       <w:r>
         <w:rPr>
           <w:rFonts w:ascii="Calibri" w:hAnsi="Calibri"/>
@@ -3412,44 +3431,32 @@
           <w:color w:val="17202A"/>
           <w:sz w:val="22"/>
         </w:rPr>
-        <w:t>Деньги и состояние session не должны угадываться по разрозненным экранам.</w:t>
+        <w:t>требуется ли top-up, продолжение, завершение или передача в поддержку.</w:t>
       </w:r>
     </w:p>
     <w:p>
-      <w:pPr>
-        <w:pStyle w:val="Heading1"/>
-      </w:pPr>
-      <w:r>
-        <w:t>12. Что видно super-admin</w:t>
+      <w:r>
+        <w:rPr>
+          <w:rFonts w:ascii="Calibri" w:hAnsi="Calibri"/>
+          <w:b w:val="0"/>
+          <w:color w:val="17202A"/>
+          <w:sz w:val="22"/>
+        </w:rPr>
+        <w:t>Деньги и состояние session не должны угадываться по разрозненным экранам.</w:t>
       </w:r>
     </w:p>
     <w:p>
       <w:pPr>
-        <w:keepNext/>
-      </w:pPr>
-      <w:r>
-        <w:rPr>
-          <w:rFonts w:ascii="Calibri" w:hAnsi="Calibri"/>
-          <w:b w:val="0"/>
-          <w:color w:val="17202A"/>
-          <w:sz w:val="22"/>
-        </w:rPr>
-        <w:t>Super-admin должен иметь возможность восстановить:</w:t>
+        <w:pStyle w:val="Heading1"/>
+      </w:pPr>
+      <w:r>
+        <w:t>12. Что видно super-admin</w:t>
       </w:r>
     </w:p>
     <w:p>
       <w:pPr>
-        <w:spacing w:after="80" w:line="300" w:lineRule="exact"/>
-        <w:ind w:left="605" w:hanging="374"/>
-      </w:pPr>
-      <w:r>
-        <w:rPr>
-          <w:rFonts w:ascii="Calibri" w:hAnsi="Calibri"/>
-          <w:color w:val="17202A"/>
-          <w:sz w:val="22"/>
-        </w:rPr>
-        <w:t xml:space="preserve">•  </w:t>
-      </w:r>
+        <w:keepNext/>
+      </w:pPr>
       <w:r>
         <w:rPr>
           <w:rFonts w:ascii="Calibri" w:hAnsi="Calibri"/>
@@ -3457,12 +3464,12 @@
           <w:color w:val="17202A"/>
           <w:sz w:val="22"/>
         </w:rPr>
-        <w:t>выбранную публичную экспертную анкету;</w:t>
+        <w:t>Super-admin должен иметь возможность восстановить:</w:t>
       </w:r>
     </w:p>
     <w:p>
       <w:pPr>
-        <w:spacing w:after="80" w:line="300" w:lineRule="exact"/>
+        <w:spacing w:after="120" w:line="288" w:lineRule="auto"/>
         <w:ind w:left="605" w:hanging="374"/>
       </w:pPr>
       <w:r>
@@ -3480,12 +3487,12 @@
           <w:color w:val="17202A"/>
           <w:sz w:val="22"/>
         </w:rPr>
-        <w:t>назначенного Агента в момент события;</w:t>
+        <w:t>выбранную публичную экспертную анкету;</w:t>
       </w:r>
     </w:p>
     <w:p>
       <w:pPr>
-        <w:spacing w:after="80" w:line="300" w:lineRule="exact"/>
+        <w:spacing w:after="120" w:line="288" w:lineRule="auto"/>
         <w:ind w:left="605" w:hanging="374"/>
       </w:pPr>
       <w:r>
@@ -3503,12 +3510,12 @@
           <w:color w:val="17202A"/>
           <w:sz w:val="22"/>
         </w:rPr>
-        <w:t>фактического автора и редактора;</w:t>
+        <w:t>назначенного Агента в момент события;</w:t>
       </w:r>
     </w:p>
     <w:p>
       <w:pPr>
-        <w:spacing w:after="80" w:line="300" w:lineRule="exact"/>
+        <w:spacing w:after="120" w:line="288" w:lineRule="auto"/>
         <w:ind w:left="605" w:hanging="374"/>
       </w:pPr>
       <w:r>
@@ -3526,12 +3533,12 @@
           <w:color w:val="17202A"/>
           <w:sz w:val="22"/>
         </w:rPr>
-        <w:t>последовательность клиентских состояний;</w:t>
+        <w:t>фактического автора и редактора;</w:t>
       </w:r>
     </w:p>
     <w:p>
       <w:pPr>
-        <w:spacing w:after="80" w:line="300" w:lineRule="exact"/>
+        <w:spacing w:after="120" w:line="288" w:lineRule="auto"/>
         <w:ind w:left="605" w:hanging="374"/>
       </w:pPr>
       <w:r>
@@ -3549,12 +3556,12 @@
           <w:color w:val="17202A"/>
           <w:sz w:val="22"/>
         </w:rPr>
-        <w:t>free/trial/paid переход;</w:t>
+        <w:t>последовательность клиентских состояний;</w:t>
       </w:r>
     </w:p>
     <w:p>
       <w:pPr>
-        <w:spacing w:after="80" w:line="300" w:lineRule="exact"/>
+        <w:spacing w:after="120" w:line="288" w:lineRule="auto"/>
         <w:ind w:left="605" w:hanging="374"/>
       </w:pPr>
       <w:r>
@@ -3572,12 +3579,12 @@
           <w:color w:val="17202A"/>
           <w:sz w:val="22"/>
         </w:rPr>
-        <w:t>применённую цену и версию правил;</w:t>
+        <w:t>free/trial/paid переход;</w:t>
       </w:r>
     </w:p>
     <w:p>
       <w:pPr>
-        <w:spacing w:after="80" w:line="300" w:lineRule="exact"/>
+        <w:spacing w:after="120" w:line="288" w:lineRule="auto"/>
         <w:ind w:left="605" w:hanging="374"/>
       </w:pPr>
       <w:r>
@@ -3595,12 +3602,12 @@
           <w:color w:val="17202A"/>
           <w:sz w:val="22"/>
         </w:rPr>
-        <w:t>censored attempts и действия по ним;</w:t>
+        <w:t>применённую цену и версию правил;</w:t>
       </w:r>
     </w:p>
     <w:p>
       <w:pPr>
-        <w:spacing w:after="80" w:line="300" w:lineRule="exact"/>
+        <w:spacing w:after="120" w:line="288" w:lineRule="auto"/>
         <w:ind w:left="605" w:hanging="374"/>
       </w:pPr>
       <w:r>
@@ -3618,12 +3625,12 @@
           <w:color w:val="17202A"/>
           <w:sz w:val="22"/>
         </w:rPr>
-        <w:t>ошибки доставки, abnormal end и reconnect;</w:t>
+        <w:t>censored attempts и действия по ним;</w:t>
       </w:r>
     </w:p>
     <w:p>
       <w:pPr>
-        <w:spacing w:after="80" w:line="300" w:lineRule="exact"/>
+        <w:spacing w:after="120" w:line="288" w:lineRule="auto"/>
         <w:ind w:left="605" w:hanging="374"/>
       </w:pPr>
       <w:r>
@@ -3641,12 +3648,35 @@
           <w:color w:val="17202A"/>
           <w:sz w:val="22"/>
         </w:rPr>
-        <w:t>complaint/support/refund/QA контекст;</w:t>
+        <w:t>ошибки доставки, abnormal end и reconnect;</w:t>
       </w:r>
     </w:p>
     <w:p>
       <w:pPr>
-        <w:spacing w:after="80" w:line="300" w:lineRule="exact"/>
+        <w:spacing w:after="120" w:line="288" w:lineRule="auto"/>
+        <w:ind w:left="605" w:hanging="374"/>
+      </w:pPr>
+      <w:r>
+        <w:rPr>
+          <w:rFonts w:ascii="Calibri" w:hAnsi="Calibri"/>
+          <w:color w:val="17202A"/>
+          <w:sz w:val="22"/>
+        </w:rPr>
+        <w:t xml:space="preserve">•  </w:t>
+      </w:r>
+      <w:r>
+        <w:rPr>
+          <w:rFonts w:ascii="Calibri" w:hAnsi="Calibri"/>
+          <w:b w:val="0"/>
+          <w:color w:val="17202A"/>
+          <w:sz w:val="22"/>
+        </w:rPr>
+        <w:t>complaint/support/refund/QA контекст;</w:t>
+      </w:r>
+    </w:p>
+    <w:p>
+      <w:pPr>
+        <w:spacing w:after="120" w:line="288" w:lineRule="auto"/>
         <w:ind w:left="605" w:hanging="374"/>
       </w:pPr>
       <w:r>
@@ -3716,7 +3746,7 @@
     </w:p>
     <w:p>
       <w:pPr>
-        <w:spacing w:after="80" w:line="300" w:lineRule="exact"/>
+        <w:spacing w:after="120" w:line="288" w:lineRule="auto"/>
         <w:ind w:left="605" w:hanging="374"/>
       </w:pPr>
       <w:r>
@@ -3757,7 +3787,7 @@
     </w:p>
     <w:p>
       <w:pPr>
-        <w:spacing w:after="80" w:line="300" w:lineRule="exact"/>
+        <w:spacing w:after="120" w:line="288" w:lineRule="auto"/>
         <w:ind w:left="605" w:hanging="374"/>
       </w:pPr>
       <w:r>
@@ -3797,7 +3827,7 @@
     </w:p>
     <w:p>
       <w:pPr>
-        <w:spacing w:after="80" w:line="300" w:lineRule="exact"/>
+        <w:spacing w:after="120" w:line="288" w:lineRule="auto"/>
         <w:ind w:left="605" w:hanging="374"/>
       </w:pPr>
       <w:r>
@@ -3856,7 +3886,7 @@
     </w:p>
     <w:p>
       <w:pPr>
-        <w:spacing w:after="80" w:line="300" w:lineRule="exact"/>
+        <w:spacing w:after="120" w:line="288" w:lineRule="auto"/>
         <w:ind w:left="605" w:hanging="374"/>
       </w:pPr>
       <w:r>
@@ -3879,7 +3909,7 @@
     </w:p>
     <w:p>
       <w:pPr>
-        <w:spacing w:after="80" w:line="300" w:lineRule="exact"/>
+        <w:spacing w:after="120" w:line="288" w:lineRule="auto"/>
         <w:ind w:left="605" w:hanging="374"/>
       </w:pPr>
       <w:r>
@@ -3910,7 +3940,7 @@
     </w:p>
     <w:p>
       <w:pPr>
-        <w:spacing w:after="80" w:line="300" w:lineRule="exact"/>
+        <w:spacing w:after="120" w:line="288" w:lineRule="auto"/>
         <w:ind w:left="605" w:hanging="374"/>
       </w:pPr>
       <w:r>
@@ -3933,7 +3963,7 @@
     </w:p>
     <w:p>
       <w:pPr>
-        <w:spacing w:after="80" w:line="300" w:lineRule="exact"/>
+        <w:spacing w:after="120" w:line="288" w:lineRule="auto"/>
         <w:ind w:left="605" w:hanging="374"/>
       </w:pPr>
       <w:r>
@@ -3956,7 +3986,7 @@
     </w:p>
     <w:p>
       <w:pPr>
-        <w:spacing w:after="80" w:line="300" w:lineRule="exact"/>
+        <w:spacing w:after="120" w:line="288" w:lineRule="auto"/>
         <w:ind w:left="605" w:hanging="374"/>
       </w:pPr>
       <w:r>
@@ -3979,7 +4009,7 @@
     </w:p>
     <w:p>
       <w:pPr>
-        <w:spacing w:after="80" w:line="300" w:lineRule="exact"/>
+        <w:spacing w:after="120" w:line="288" w:lineRule="auto"/>
         <w:ind w:left="605" w:hanging="374"/>
       </w:pPr>
       <w:r>
@@ -4002,7 +4032,7 @@
     </w:p>
     <w:p>
       <w:pPr>
-        <w:spacing w:after="80" w:line="300" w:lineRule="exact"/>
+        <w:spacing w:after="120" w:line="288" w:lineRule="auto"/>
         <w:ind w:left="605" w:hanging="374"/>
       </w:pPr>
       <w:r>
@@ -4025,7 +4055,7 @@
     </w:p>
     <w:p>
       <w:pPr>
-        <w:spacing w:after="80" w:line="300" w:lineRule="exact"/>
+        <w:spacing w:after="120" w:line="288" w:lineRule="auto"/>
         <w:ind w:left="605" w:hanging="374"/>
       </w:pPr>
       <w:r>
@@ -4048,7 +4078,7 @@
     </w:p>
     <w:p>
       <w:pPr>
-        <w:spacing w:after="80" w:line="300" w:lineRule="exact"/>
+        <w:spacing w:after="120" w:line="288" w:lineRule="auto"/>
         <w:ind w:left="605" w:hanging="374"/>
       </w:pPr>
       <w:r>
@@ -4071,7 +4101,7 @@
     </w:p>
     <w:p>
       <w:pPr>
-        <w:spacing w:after="80" w:line="300" w:lineRule="exact"/>
+        <w:spacing w:after="120" w:line="288" w:lineRule="auto"/>
         <w:ind w:left="605" w:hanging="374"/>
       </w:pPr>
       <w:r>
@@ -4094,7 +4124,7 @@
     </w:p>
     <w:p>
       <w:pPr>
-        <w:spacing w:after="80" w:line="300" w:lineRule="exact"/>
+        <w:spacing w:after="120" w:line="288" w:lineRule="auto"/>
         <w:ind w:left="605" w:hanging="374"/>
       </w:pPr>
       <w:r>
@@ -4150,7 +4180,7 @@
     </w:p>
     <w:p>
       <w:pPr>
-        <w:spacing w:after="80" w:line="300" w:lineRule="exact"/>
+        <w:spacing w:after="120" w:line="288" w:lineRule="auto"/>
         <w:ind w:left="605" w:hanging="374"/>
       </w:pPr>
       <w:r>
@@ -4173,7 +4203,7 @@
     </w:p>
     <w:p>
       <w:pPr>
-        <w:spacing w:after="80" w:line="300" w:lineRule="exact"/>
+        <w:spacing w:after="120" w:line="288" w:lineRule="auto"/>
         <w:ind w:left="605" w:hanging="374"/>
       </w:pPr>
       <w:r>
@@ -4196,7 +4226,7 @@
     </w:p>
     <w:p>
       <w:pPr>
-        <w:spacing w:after="80" w:line="300" w:lineRule="exact"/>
+        <w:spacing w:after="120" w:line="288" w:lineRule="auto"/>
         <w:ind w:left="605" w:hanging="374"/>
       </w:pPr>
       <w:r>
@@ -4219,7 +4249,7 @@
     </w:p>
     <w:p>
       <w:pPr>
-        <w:spacing w:after="80" w:line="300" w:lineRule="exact"/>
+        <w:spacing w:after="120" w:line="288" w:lineRule="auto"/>
         <w:ind w:left="605" w:hanging="374"/>
       </w:pPr>
       <w:r>
@@ -4242,7 +4272,7 @@
     </w:p>
     <w:p>
       <w:pPr>
-        <w:spacing w:after="80" w:line="300" w:lineRule="exact"/>
+        <w:spacing w:after="120" w:line="288" w:lineRule="auto"/>
         <w:ind w:left="605" w:hanging="374"/>
       </w:pPr>
       <w:r>
@@ -4265,7 +4295,7 @@
     </w:p>
     <w:p>
       <w:pPr>
-        <w:spacing w:after="80" w:line="300" w:lineRule="exact"/>
+        <w:spacing w:after="120" w:line="288" w:lineRule="auto"/>
         <w:ind w:left="605" w:hanging="374"/>
       </w:pPr>
       <w:r>
@@ -4288,7 +4318,7 @@
     </w:p>
     <w:p>
       <w:pPr>
-        <w:spacing w:after="80" w:line="300" w:lineRule="exact"/>
+        <w:spacing w:after="120" w:line="288" w:lineRule="auto"/>
         <w:ind w:left="605" w:hanging="374"/>
       </w:pPr>
       <w:r>
@@ -4311,7 +4341,7 @@
     </w:p>
     <w:p>
       <w:pPr>
-        <w:spacing w:after="80" w:line="300" w:lineRule="exact"/>
+        <w:spacing w:after="120" w:line="288" w:lineRule="auto"/>
         <w:ind w:left="605" w:hanging="374"/>
       </w:pPr>
       <w:r>
@@ -4334,7 +4364,7 @@
     </w:p>
     <w:p>
       <w:pPr>
-        <w:spacing w:after="80" w:line="300" w:lineRule="exact"/>
+        <w:spacing w:after="120" w:line="288" w:lineRule="auto"/>
         <w:ind w:left="605" w:hanging="374"/>
       </w:pPr>
       <w:r>
@@ -4357,7 +4387,7 @@
     </w:p>
     <w:p>
       <w:pPr>
-        <w:spacing w:after="80" w:line="300" w:lineRule="exact"/>
+        <w:spacing w:after="120" w:line="288" w:lineRule="auto"/>
         <w:ind w:left="605" w:hanging="374"/>
       </w:pPr>
       <w:r>
@@ -4390,40 +4420,28 @@
       </w:r>
     </w:p>
     <w:p>
-      <w:pPr>
-        <w:pStyle w:val="Heading1"/>
-      </w:pPr>
-      <w:r>
-        <w:t>14. Связанные задачи и границы</w:t>
+      <w:r>
+        <w:rPr>
+          <w:rFonts w:ascii="Calibri" w:hAnsi="Calibri"/>
+          <w:b w:val="0"/>
+          <w:color w:val="17202A"/>
+          <w:sz w:val="22"/>
+        </w:rPr>
+        <w:t>Все видимые labels, ошибки, aria-labels, системные сообщения, шаблоны и тексты модалей подключаются через существующую систему translation keys. Игорь инвентаризирует недостающие ключи и подключает RU/EN source pair; смысл продуктовых, support и legal формулировок не изменяется самовольно.</w:t>
       </w:r>
     </w:p>
     <w:p>
       <w:pPr>
-        <w:keepNext/>
-      </w:pPr>
-      <w:r>
-        <w:rPr>
-          <w:rFonts w:ascii="Calibri" w:hAnsi="Calibri"/>
-          <w:b w:val="0"/>
-          <w:color w:val="17202A"/>
-          <w:sz w:val="22"/>
-        </w:rPr>
-        <w:t>Связанные задачи:</w:t>
+        <w:pStyle w:val="Heading1"/>
+      </w:pPr>
+      <w:r>
+        <w:t>14. Связанные задачи и границы</w:t>
       </w:r>
     </w:p>
     <w:p>
       <w:pPr>
-        <w:spacing w:after="80" w:line="300" w:lineRule="exact"/>
-        <w:ind w:left="605" w:hanging="374"/>
-      </w:pPr>
-      <w:r>
-        <w:rPr>
-          <w:rFonts w:ascii="Calibri" w:hAnsi="Calibri"/>
-          <w:color w:val="17202A"/>
-          <w:sz w:val="22"/>
-        </w:rPr>
-        <w:t xml:space="preserve">•  </w:t>
-      </w:r>
+        <w:keepNext/>
+      </w:pPr>
       <w:r>
         <w:rPr>
           <w:rFonts w:ascii="Calibri" w:hAnsi="Calibri"/>
@@ -4431,12 +4449,12 @@
           <w:color w:val="17202A"/>
           <w:sz w:val="22"/>
         </w:rPr>
-        <w:t>G1.1 — административная карточка одной consultation session;</w:t>
+        <w:t>Связанные задачи:</w:t>
       </w:r>
     </w:p>
     <w:p>
       <w:pPr>
-        <w:spacing w:after="80" w:line="300" w:lineRule="exact"/>
+        <w:spacing w:after="120" w:line="288" w:lineRule="auto"/>
         <w:ind w:left="605" w:hanging="374"/>
       </w:pPr>
       <w:r>
@@ -4454,12 +4472,12 @@
           <w:color w:val="17202A"/>
           <w:sz w:val="22"/>
         </w:rPr>
-        <w:t>G1.3 — единственный владелец lifecycle, статусов, таймеров и клиентской истории consultation session;</w:t>
+        <w:t>G1.1 — административная карточка одной consultation session;</w:t>
       </w:r>
     </w:p>
     <w:p>
       <w:pPr>
-        <w:spacing w:after="80" w:line="300" w:lineRule="exact"/>
+        <w:spacing w:after="120" w:line="288" w:lineRule="auto"/>
         <w:ind w:left="605" w:hanging="374"/>
       </w:pPr>
       <w:r>
@@ -4477,12 +4495,12 @@
           <w:color w:val="17202A"/>
           <w:sz w:val="22"/>
         </w:rPr>
-        <w:t>G1.4 — уведомления;</w:t>
+        <w:t>G1.3 — единственный владелец lifecycle, статусов, таймеров и клиентской истории consultation session;</w:t>
       </w:r>
     </w:p>
     <w:p>
       <w:pPr>
-        <w:spacing w:after="80" w:line="300" w:lineRule="exact"/>
+        <w:spacing w:after="120" w:line="288" w:lineRule="auto"/>
         <w:ind w:left="605" w:hanging="374"/>
       </w:pPr>
       <w:r>
@@ -4500,12 +4518,12 @@
           <w:color w:val="17202A"/>
           <w:sz w:val="22"/>
         </w:rPr>
-        <w:t>G2 — credits, цена, coupons, billing и refund;</w:t>
+        <w:t>G1.4 — уведомления;</w:t>
       </w:r>
     </w:p>
     <w:p>
       <w:pPr>
-        <w:spacing w:after="80" w:line="300" w:lineRule="exact"/>
+        <w:spacing w:after="120" w:line="288" w:lineRule="auto"/>
         <w:ind w:left="605" w:hanging="374"/>
       </w:pPr>
       <w:r>
@@ -4523,12 +4541,12 @@
           <w:color w:val="17202A"/>
           <w:sz w:val="22"/>
         </w:rPr>
-        <w:t>G4 — support, жалобы, документы и safety;</w:t>
+        <w:t>G2 — credits, цена, coupons, billing и refund;</w:t>
       </w:r>
     </w:p>
     <w:p>
       <w:pPr>
-        <w:spacing w:after="80" w:line="300" w:lineRule="exact"/>
+        <w:spacing w:after="120" w:line="288" w:lineRule="auto"/>
         <w:ind w:left="605" w:hanging="374"/>
       </w:pPr>
       <w:r>
@@ -4546,10 +4564,22 @@
           <w:color w:val="17202A"/>
           <w:sz w:val="22"/>
         </w:rPr>
-        <w:t>G6 — назначения, permissions, SLA и quality.</w:t>
+        <w:t>G4 — support, жалобы, документы и safety;</w:t>
       </w:r>
     </w:p>
     <w:p>
+      <w:pPr>
+        <w:spacing w:after="120" w:line="288" w:lineRule="auto"/>
+        <w:ind w:left="605" w:hanging="374"/>
+      </w:pPr>
+      <w:r>
+        <w:rPr>
+          <w:rFonts w:ascii="Calibri" w:hAnsi="Calibri"/>
+          <w:color w:val="17202A"/>
+          <w:sz w:val="22"/>
+        </w:rPr>
+        <w:t xml:space="preserve">•  </w:t>
+      </w:r>
       <w:r>
         <w:rPr>
           <w:rFonts w:ascii="Calibri" w:hAnsi="Calibri"/>
@@ -4557,7 +4587,7 @@
           <w:color w:val="17202A"/>
           <w:sz w:val="22"/>
         </w:rPr>
-        <w:t>В G1.2 входят постоянный диалог, роли и видимость внутри чата, сообщения и вложения, авторство, цензура, доставка, версии сообщений, отображение chat-событий в истории и chat-specific настройки.</w:t>
+        <w:t>G6 — назначения, permissions, SLA и quality.</w:t>
       </w:r>
     </w:p>
     <w:p>
@@ -4568,44 +4598,32 @@
           <w:color w:val="17202A"/>
           <w:sz w:val="22"/>
         </w:rPr>
-        <w:t>В G1.2 не входят lifecycle и расчёт состояний consultation session, реализация общей RBAC-модели, расчёт списаний, создание цен/пакетов/coupons, paid queue, асинхронная paid-консультация, список и retention клиентской истории, экспорт истории, отдельная support-роль, audio/video и автоматическая отправка AI-текста.</w:t>
+        <w:t>В G1.2 входят постоянный диалог, роли и видимость внутри чата, сообщения и вложения, авторство, цензура, доставка, версии сообщений, отображение chat-событий в истории и chat-specific настройки.</w:t>
       </w:r>
     </w:p>
     <w:p>
-      <w:pPr>
-        <w:pStyle w:val="Heading1"/>
-      </w:pPr>
-      <w:r>
-        <w:t>15. Ошибки и запрещённое поведение</w:t>
+      <w:r>
+        <w:rPr>
+          <w:rFonts w:ascii="Calibri" w:hAnsi="Calibri"/>
+          <w:b w:val="0"/>
+          <w:color w:val="17202A"/>
+          <w:sz w:val="22"/>
+        </w:rPr>
+        <w:t>В G1.2 не входят lifecycle и расчёт состояний consultation session, реализация общей RBAC-модели, расчёт списаний, создание цен/пакетов/coupons, paid queue, асинхронная paid-консультация, список и retention клиентской истории, экспорт истории, отдельная support-роль, audio/video и автоматическая отправка AI-текста.</w:t>
       </w:r>
     </w:p>
     <w:p>
       <w:pPr>
-        <w:keepNext/>
-      </w:pPr>
-      <w:r>
-        <w:rPr>
-          <w:rFonts w:ascii="Calibri" w:hAnsi="Calibri"/>
-          <w:b w:val="0"/>
-          <w:color w:val="17202A"/>
-          <w:sz w:val="22"/>
-        </w:rPr>
-        <w:t>Система должна явно отклонять действие без утечки данных и побочных эффектов, если:</w:t>
+        <w:pStyle w:val="Heading1"/>
+      </w:pPr>
+      <w:r>
+        <w:t>15. Ошибки и запрещённое поведение</w:t>
       </w:r>
     </w:p>
     <w:p>
       <w:pPr>
-        <w:spacing w:after="80" w:line="300" w:lineRule="exact"/>
-        <w:ind w:left="605" w:hanging="374"/>
-      </w:pPr>
-      <w:r>
-        <w:rPr>
-          <w:rFonts w:ascii="Calibri" w:hAnsi="Calibri"/>
-          <w:color w:val="17202A"/>
-          <w:sz w:val="22"/>
-        </w:rPr>
-        <w:t xml:space="preserve">•  </w:t>
-      </w:r>
+        <w:keepNext/>
+      </w:pPr>
       <w:r>
         <w:rPr>
           <w:rFonts w:ascii="Calibri" w:hAnsi="Calibri"/>
@@ -4613,12 +4631,12 @@
           <w:color w:val="17202A"/>
           <w:sz w:val="22"/>
         </w:rPr>
-        <w:t>Агент открывает или отправляет от неназначенной анкеты;</w:t>
+        <w:t>Система должна явно отклонять действие без утечки данных и побочных эффектов, если:</w:t>
       </w:r>
     </w:p>
     <w:p>
       <w:pPr>
-        <w:spacing w:after="80" w:line="300" w:lineRule="exact"/>
+        <w:spacing w:after="120" w:line="288" w:lineRule="auto"/>
         <w:ind w:left="605" w:hanging="374"/>
       </w:pPr>
       <w:r>
@@ -4636,12 +4654,12 @@
           <w:color w:val="17202A"/>
           <w:sz w:val="22"/>
         </w:rPr>
-        <w:t>вторая paid/pause session запускается для занятого Агента;</w:t>
+        <w:t>Агент открывает или отправляет от неназначенной анкеты;</w:t>
       </w:r>
     </w:p>
     <w:p>
       <w:pPr>
-        <w:spacing w:after="80" w:line="300" w:lineRule="exact"/>
+        <w:spacing w:after="120" w:line="288" w:lineRule="auto"/>
         <w:ind w:left="605" w:hanging="374"/>
       </w:pPr>
       <w:r>
@@ -4659,12 +4677,12 @@
           <w:color w:val="17202A"/>
           <w:sz w:val="22"/>
         </w:rPr>
-        <w:t>session стартует из бесплатного сообщения без явного запроса;</w:t>
+        <w:t>вторая paid/pause session запускается для занятого Агента;</w:t>
       </w:r>
     </w:p>
     <w:p>
       <w:pPr>
-        <w:spacing w:after="80" w:line="300" w:lineRule="exact"/>
+        <w:spacing w:after="120" w:line="288" w:lineRule="auto"/>
         <w:ind w:left="605" w:hanging="374"/>
       </w:pPr>
       <w:r>
@@ -4682,12 +4700,12 @@
           <w:color w:val="17202A"/>
           <w:sz w:val="22"/>
         </w:rPr>
-        <w:t>paid начинается без обязательного consent;</w:t>
+        <w:t>session стартует из бесплатного сообщения без явного запроса;</w:t>
       </w:r>
     </w:p>
     <w:p>
       <w:pPr>
-        <w:spacing w:after="80" w:line="300" w:lineRule="exact"/>
+        <w:spacing w:after="120" w:line="288" w:lineRule="auto"/>
         <w:ind w:left="605" w:hanging="374"/>
       </w:pPr>
       <w:r>
@@ -4705,12 +4723,12 @@
           <w:color w:val="17202A"/>
           <w:sz w:val="22"/>
         </w:rPr>
-        <w:t>moderator/super-admin показан клиенту как Эксперт;</w:t>
+        <w:t>paid начинается без обязательного consent;</w:t>
       </w:r>
     </w:p>
     <w:p>
       <w:pPr>
-        <w:spacing w:after="80" w:line="300" w:lineRule="exact"/>
+        <w:spacing w:after="120" w:line="288" w:lineRule="auto"/>
         <w:ind w:left="605" w:hanging="374"/>
       </w:pPr>
       <w:r>
@@ -4728,12 +4746,12 @@
           <w:color w:val="17202A"/>
           <w:sz w:val="22"/>
         </w:rPr>
-        <w:t>повторный запрос создаёт дубль;</w:t>
+        <w:t>moderator/super-admin показан клиенту как Эксперт;</w:t>
       </w:r>
     </w:p>
     <w:p>
       <w:pPr>
-        <w:spacing w:after="80" w:line="300" w:lineRule="exact"/>
+        <w:spacing w:after="120" w:line="288" w:lineRule="auto"/>
         <w:ind w:left="605" w:hanging="374"/>
       </w:pPr>
       <w:r>
@@ -4751,12 +4769,12 @@
           <w:color w:val="17202A"/>
           <w:sz w:val="22"/>
         </w:rPr>
-        <w:t>файл запрещён, переименован или не может быть проверен;</w:t>
+        <w:t>повторный запрос создаёт дубль;</w:t>
       </w:r>
     </w:p>
     <w:p>
       <w:pPr>
-        <w:spacing w:after="80" w:line="300" w:lineRule="exact"/>
+        <w:spacing w:after="120" w:line="288" w:lineRule="auto"/>
         <w:ind w:left="605" w:hanging="374"/>
       </w:pPr>
       <w:r>
@@ -4774,12 +4792,12 @@
           <w:color w:val="17202A"/>
           <w:sz w:val="22"/>
         </w:rPr>
-        <w:t>edit уничтожает прежнюю версию;</w:t>
+        <w:t>файл запрещён, переименован или не может быть проверен;</w:t>
       </w:r>
     </w:p>
     <w:p>
       <w:pPr>
-        <w:spacing w:after="80" w:line="300" w:lineRule="exact"/>
+        <w:spacing w:after="120" w:line="288" w:lineRule="auto"/>
         <w:ind w:left="605" w:hanging="374"/>
       </w:pPr>
       <w:r>
@@ -4797,12 +4815,12 @@
           <w:color w:val="17202A"/>
           <w:sz w:val="22"/>
         </w:rPr>
-        <w:t>staff пытается физически удалить консультационную историю;</w:t>
+        <w:t>edit уничтожает прежнюю версию;</w:t>
       </w:r>
     </w:p>
     <w:p>
       <w:pPr>
-        <w:spacing w:after="80" w:line="300" w:lineRule="exact"/>
+        <w:spacing w:after="120" w:line="288" w:lineRule="auto"/>
         <w:ind w:left="605" w:hanging="374"/>
       </w:pPr>
       <w:r>
@@ -4820,12 +4838,12 @@
           <w:color w:val="17202A"/>
           <w:sz w:val="22"/>
         </w:rPr>
-        <w:t>шаблон или AI-подсказка отправляется автоматически;</w:t>
+        <w:t>staff пытается физически удалить консультационную историю;</w:t>
       </w:r>
     </w:p>
     <w:p>
       <w:pPr>
-        <w:spacing w:after="80" w:line="300" w:lineRule="exact"/>
+        <w:spacing w:after="120" w:line="288" w:lineRule="auto"/>
         <w:ind w:left="605" w:hanging="374"/>
       </w:pPr>
       <w:r>
@@ -4843,12 +4861,12 @@
           <w:color w:val="17202A"/>
           <w:sz w:val="22"/>
         </w:rPr>
-        <w:t>получатель пытается восстановить процензурированный оригинал;</w:t>
+        <w:t>шаблон или AI-подсказка отправляется автоматически;</w:t>
       </w:r>
     </w:p>
     <w:p>
       <w:pPr>
-        <w:spacing w:after="80" w:line="300" w:lineRule="exact"/>
+        <w:spacing w:after="120" w:line="288" w:lineRule="auto"/>
         <w:ind w:left="605" w:hanging="374"/>
       </w:pPr>
       <w:r>
@@ -4866,12 +4884,12 @@
           <w:color w:val="17202A"/>
           <w:sz w:val="22"/>
         </w:rPr>
-        <w:t>скрывается окончание trial/paid или создаётся давление на основе баланса;</w:t>
+        <w:t>получатель пытается восстановить процензурированный оригинал;</w:t>
       </w:r>
     </w:p>
     <w:p>
       <w:pPr>
-        <w:spacing w:after="80" w:line="300" w:lineRule="exact"/>
+        <w:spacing w:after="120" w:line="288" w:lineRule="auto"/>
         <w:ind w:left="605" w:hanging="374"/>
       </w:pPr>
       <w:r>
@@ -4889,51 +4907,51 @@
           <w:color w:val="17202A"/>
           <w:sz w:val="22"/>
         </w:rPr>
-        <w:t>используются гарантии, страх, зависимость, выдуманная срочность или профессиональная медицинская/юридическая/финансовая роль.</w:t>
+        <w:t>скрывается окончание trial/paid или создаётся давление на основе баланса;</w:t>
       </w:r>
     </w:p>
     <w:p>
       <w:pPr>
-        <w:pStyle w:val="Heading1"/>
-      </w:pPr>
-      <w:r>
-        <w:t>16. Критерии готового результата</w:t>
+        <w:spacing w:after="120" w:line="288" w:lineRule="auto"/>
+        <w:ind w:left="605" w:hanging="374"/>
+      </w:pPr>
+      <w:r>
+        <w:rPr>
+          <w:rFonts w:ascii="Calibri" w:hAnsi="Calibri"/>
+          <w:color w:val="17202A"/>
+          <w:sz w:val="22"/>
+        </w:rPr>
+        <w:t xml:space="preserve">•  </w:t>
+      </w:r>
+      <w:r>
+        <w:rPr>
+          <w:rFonts w:ascii="Calibri" w:hAnsi="Calibri"/>
+          <w:b w:val="0"/>
+          <w:color w:val="17202A"/>
+          <w:sz w:val="22"/>
+        </w:rPr>
+        <w:t>используются гарантии, страх, зависимость, выдуманная срочность или профессиональная медицинская/юридическая/финансовая роль.</w:t>
       </w:r>
     </w:p>
     <w:p>
       <w:pPr>
-        <w:pStyle w:val="Heading2"/>
-      </w:pPr>
-      <w:r>
-        <w:t>Положительные проверки</w:t>
+        <w:pStyle w:val="Heading1"/>
+      </w:pPr>
+      <w:r>
+        <w:t>16. Критерии готового результата</w:t>
       </w:r>
     </w:p>
     <w:p>
       <w:pPr>
-        <w:spacing w:after="80" w:line="300" w:lineRule="exact"/>
-        <w:ind w:left="605" w:hanging="374"/>
-      </w:pPr>
-      <w:r>
-        <w:rPr>
-          <w:rFonts w:ascii="Calibri" w:hAnsi="Calibri"/>
-          <w:color w:val="17202A"/>
-          <w:sz w:val="22"/>
-        </w:rPr>
-        <w:t xml:space="preserve">1.  </w:t>
-      </w:r>
-      <w:r>
-        <w:rPr>
-          <w:rFonts w:ascii="Calibri" w:hAnsi="Calibri"/>
-          <w:b w:val="0"/>
-          <w:color w:val="17202A"/>
-          <w:sz w:val="22"/>
-        </w:rPr>
-        <w:t>Бесплатное сообщение создаёт/открывает один диалог и не запускает timer/debit.</w:t>
+        <w:pStyle w:val="Heading2"/>
+      </w:pPr>
+      <w:r>
+        <w:t>Положительные проверки</w:t>
       </w:r>
     </w:p>
     <w:p>
       <w:pPr>
-        <w:spacing w:after="80" w:line="300" w:lineRule="exact"/>
+        <w:spacing w:after="120" w:line="288" w:lineRule="auto"/>
         <w:ind w:left="605" w:hanging="374"/>
       </w:pPr>
       <w:r>
@@ -4942,7 +4960,7 @@
           <w:color w:val="17202A"/>
           <w:sz w:val="22"/>
         </w:rPr>
-        <w:t xml:space="preserve">2.  </w:t>
+        <w:t xml:space="preserve">1.  </w:t>
       </w:r>
       <w:r>
         <w:rPr>
@@ -4951,12 +4969,12 @@
           <w:color w:val="17202A"/>
           <w:sz w:val="22"/>
         </w:rPr>
-        <w:t>Agent accept запроса не создаёт session; последующий committed client consent создаёт exactly one session в том же диалоге. Принятие клиентом предложения Эксперта даёт тот же результат.</w:t>
+        <w:t>Бесплатное сообщение создаёт/открывает один диалог и не запускает timer/debit.</w:t>
       </w:r>
     </w:p>
     <w:p>
       <w:pPr>
-        <w:spacing w:after="80" w:line="300" w:lineRule="exact"/>
+        <w:spacing w:after="120" w:line="288" w:lineRule="auto"/>
         <w:ind w:left="605" w:hanging="374"/>
       </w:pPr>
       <w:r>
@@ -4965,7 +4983,7 @@
           <w:color w:val="17202A"/>
           <w:sz w:val="22"/>
         </w:rPr>
-        <w:t xml:space="preserve">3.  </w:t>
+        <w:t xml:space="preserve">2.  </w:t>
       </w:r>
       <w:r>
         <w:rPr>
@@ -4974,12 +4992,12 @@
           <w:color w:val="17202A"/>
           <w:sz w:val="22"/>
         </w:rPr>
-        <w:t>После end диалог возвращается в free mode; следующий кейс создаёт новую session.</w:t>
+        <w:t>Agent accept запроса не создаёт session; последующий committed client consent создаёт exactly one session в том же диалоге. Принятие клиентом предложения Эксперта даёт тот же результат.</w:t>
       </w:r>
     </w:p>
     <w:p>
       <w:pPr>
-        <w:spacing w:after="80" w:line="300" w:lineRule="exact"/>
+        <w:spacing w:after="120" w:line="288" w:lineRule="auto"/>
         <w:ind w:left="605" w:hanging="374"/>
       </w:pPr>
       <w:r>
@@ -4988,7 +5006,7 @@
           <w:color w:val="17202A"/>
           <w:sz w:val="22"/>
         </w:rPr>
-        <w:t xml:space="preserve">4.  </w:t>
+        <w:t xml:space="preserve">3.  </w:t>
       </w:r>
       <w:r>
         <w:rPr>
@@ -4997,12 +5015,12 @@
           <w:color w:val="17202A"/>
           <w:sz w:val="22"/>
         </w:rPr>
-        <w:t>Клиент видит Эксперта, а внутренний audit — фактического Агента.</w:t>
+        <w:t>После end диалог возвращается в free mode; следующий кейс создаёт новую session.</w:t>
       </w:r>
     </w:p>
     <w:p>
       <w:pPr>
-        <w:spacing w:after="80" w:line="300" w:lineRule="exact"/>
+        <w:spacing w:after="120" w:line="288" w:lineRule="auto"/>
         <w:ind w:left="605" w:hanging="374"/>
       </w:pPr>
       <w:r>
@@ -5011,7 +5029,7 @@
           <w:color w:val="17202A"/>
           <w:sz w:val="22"/>
         </w:rPr>
-        <w:t xml:space="preserve">5.  </w:t>
+        <w:t xml:space="preserve">4.  </w:t>
       </w:r>
       <w:r>
         <w:rPr>
@@ -5020,12 +5038,12 @@
           <w:color w:val="17202A"/>
           <w:sz w:val="22"/>
         </w:rPr>
-        <w:t>Агент видит только назначенную анкету и историю текущей пары.</w:t>
+        <w:t>Клиент видит Эксперта, а внутренний audit — фактического Агента.</w:t>
       </w:r>
     </w:p>
     <w:p>
       <w:pPr>
-        <w:spacing w:after="80" w:line="300" w:lineRule="exact"/>
+        <w:spacing w:after="120" w:line="288" w:lineRule="auto"/>
         <w:ind w:left="605" w:hanging="374"/>
       </w:pPr>
       <w:r>
@@ -5034,7 +5052,7 @@
           <w:color w:val="17202A"/>
           <w:sz w:val="22"/>
         </w:rPr>
-        <w:t xml:space="preserve">6.  </w:t>
+        <w:t xml:space="preserve">5.  </w:t>
       </w:r>
       <w:r>
         <w:rPr>
@@ -5043,12 +5061,12 @@
           <w:color w:val="17202A"/>
           <w:sz w:val="22"/>
         </w:rPr>
-        <w:t>Модератор и аварийный super-admin видны как «Поддержка Nebula».</w:t>
+        <w:t>Агент видит только назначенную анкету и историю текущей пары.</w:t>
       </w:r>
     </w:p>
     <w:p>
       <w:pPr>
-        <w:spacing w:after="80" w:line="300" w:lineRule="exact"/>
+        <w:spacing w:after="120" w:line="288" w:lineRule="auto"/>
         <w:ind w:left="605" w:hanging="374"/>
       </w:pPr>
       <w:r>
@@ -5057,7 +5075,7 @@
           <w:color w:val="17202A"/>
           <w:sz w:val="22"/>
         </w:rPr>
-        <w:t xml:space="preserve">7.  </w:t>
+        <w:t xml:space="preserve">6.  </w:t>
       </w:r>
       <w:r>
         <w:rPr>
@@ -5066,12 +5084,12 @@
           <w:color w:val="17202A"/>
           <w:sz w:val="22"/>
         </w:rPr>
-        <w:t>Разрешённые text/emoji/image/document доставляются; статусы доставки не меняют billing.</w:t>
+        <w:t>Модератор и аварийный super-admin видны как «Поддержка Nebula».</w:t>
       </w:r>
     </w:p>
     <w:p>
       <w:pPr>
-        <w:spacing w:after="80" w:line="300" w:lineRule="exact"/>
+        <w:spacing w:after="120" w:line="288" w:lineRule="auto"/>
         <w:ind w:left="605" w:hanging="374"/>
       </w:pPr>
       <w:r>
@@ -5080,7 +5098,7 @@
           <w:color w:val="17202A"/>
           <w:sz w:val="22"/>
         </w:rPr>
-        <w:t xml:space="preserve">8.  </w:t>
+        <w:t xml:space="preserve">7.  </w:t>
       </w:r>
       <w:r>
         <w:rPr>
@@ -5089,12 +5107,12 @@
           <w:color w:val="17202A"/>
           <w:sz w:val="22"/>
         </w:rPr>
-        <w:t>Редактирование прочитанного сообщения Экспертом показывает «изменено»; редактирование непрочитанного сообщения не показывает эту отметку клиенту; оба варианта сохраняют все версии для super-admin.</w:t>
+        <w:t>Разрешённые text/emoji/image/document доставляются; статусы доставки не меняют billing.</w:t>
       </w:r>
     </w:p>
     <w:p>
       <w:pPr>
-        <w:spacing w:after="80" w:line="300" w:lineRule="exact"/>
+        <w:spacing w:after="120" w:line="288" w:lineRule="auto"/>
         <w:ind w:left="605" w:hanging="374"/>
       </w:pPr>
       <w:r>
@@ -5103,7 +5121,7 @@
           <w:color w:val="17202A"/>
           <w:sz w:val="22"/>
         </w:rPr>
-        <w:t xml:space="preserve">9.  </w:t>
+        <w:t xml:space="preserve">8.  </w:t>
       </w:r>
       <w:r>
         <w:rPr>
@@ -5112,12 +5130,12 @@
           <w:color w:val="17202A"/>
           <w:sz w:val="22"/>
         </w:rPr>
-        <w:t>Запрещённый фрагмент виден отправителю, заменён на «ЦЕНЗУРА» для получателя и создаёт одну audit-запись.</w:t>
+        <w:t>Редактирование прочитанного сообщения Экспертом показывает «изменено»; редактирование непрочитанного сообщения не показывает эту отметку клиенту; оба варианта сохраняют все версии для super-admin.</w:t>
       </w:r>
     </w:p>
     <w:p>
       <w:pPr>
-        <w:spacing w:after="80" w:line="300" w:lineRule="exact"/>
+        <w:spacing w:after="120" w:line="288" w:lineRule="auto"/>
         <w:ind w:left="605" w:hanging="374"/>
       </w:pPr>
       <w:r>
@@ -5126,7 +5144,7 @@
           <w:color w:val="17202A"/>
           <w:sz w:val="22"/>
         </w:rPr>
-        <w:t xml:space="preserve">10.  </w:t>
+        <w:t xml:space="preserve">9.  </w:t>
       </w:r>
       <w:r>
         <w:rPr>
@@ -5135,12 +5153,12 @@
           <w:color w:val="17202A"/>
           <w:sz w:val="22"/>
         </w:rPr>
-        <w:t>Chat корректно отображает reconnect-состояние, полученное из G1.3, но не рассчитывает его deadline самостоятельно.</w:t>
+        <w:t>Запрещённый фрагмент виден отправителю, заменён на «ЦЕНЗУРА» для получателя и создаёт одну audit-запись.</w:t>
       </w:r>
     </w:p>
     <w:p>
       <w:pPr>
-        <w:spacing w:after="80" w:line="300" w:lineRule="exact"/>
+        <w:spacing w:after="120" w:line="288" w:lineRule="auto"/>
         <w:ind w:left="605" w:hanging="374"/>
       </w:pPr>
       <w:r>
@@ -5149,7 +5167,7 @@
           <w:color w:val="17202A"/>
           <w:sz w:val="22"/>
         </w:rPr>
-        <w:t xml:space="preserve">11.  </w:t>
+        <w:t xml:space="preserve">10.  </w:t>
       </w:r>
       <w:r>
         <w:rPr>
@@ -5158,12 +5176,12 @@
           <w:color w:val="17202A"/>
           <w:sz w:val="22"/>
         </w:rPr>
-        <w:t>Reconnect timeout, определённый G1.3, даёт technical end/support route без автоматического обещания купона.</w:t>
+        <w:t>Chat корректно отображает reconnect-состояние, полученное из G1.3, но не рассчитывает его deadline самостоятельно.</w:t>
       </w:r>
     </w:p>
     <w:p>
       <w:pPr>
-        <w:spacing w:after="80" w:line="300" w:lineRule="exact"/>
+        <w:spacing w:after="120" w:line="288" w:lineRule="auto"/>
         <w:ind w:left="605" w:hanging="374"/>
       </w:pPr>
       <w:r>
@@ -5172,7 +5190,7 @@
           <w:color w:val="17202A"/>
           <w:sz w:val="22"/>
         </w:rPr>
-        <w:t xml:space="preserve">12.  </w:t>
+        <w:t xml:space="preserve">11.  </w:t>
       </w:r>
       <w:r>
         <w:rPr>
@@ -5181,12 +5199,12 @@
           <w:color w:val="17202A"/>
           <w:sz w:val="22"/>
         </w:rPr>
-        <w:t>После end клиент видит итог и read-only «Историю консультации».</w:t>
+        <w:t>Reconnect timeout, определённый G1.3, даёт technical end/support route без автоматического обещания купона.</w:t>
       </w:r>
     </w:p>
     <w:p>
       <w:pPr>
-        <w:spacing w:after="80" w:line="300" w:lineRule="exact"/>
+        <w:spacing w:after="120" w:line="288" w:lineRule="auto"/>
         <w:ind w:left="605" w:hanging="374"/>
       </w:pPr>
       <w:r>
@@ -5195,7 +5213,7 @@
           <w:color w:val="17202A"/>
           <w:sz w:val="22"/>
         </w:rPr>
-        <w:t xml:space="preserve">13.  </w:t>
+        <w:t xml:space="preserve">12.  </w:t>
       </w:r>
       <w:r>
         <w:rPr>
@@ -5204,43 +5222,43 @@
           <w:color w:val="17202A"/>
           <w:sz w:val="22"/>
         </w:rPr>
-        <w:t>Super-admin меняет chat setting, видит audit, а новое событие использует новую версию без переписывания истории.</w:t>
+        <w:t>После end клиент видит итог и read-only «Историю консультации».</w:t>
       </w:r>
     </w:p>
     <w:p>
       <w:pPr>
-        <w:pStyle w:val="Heading2"/>
-      </w:pPr>
-      <w:r>
-        <w:t>Отрицательные и повторные проверки</w:t>
+        <w:spacing w:after="120" w:line="288" w:lineRule="auto"/>
+        <w:ind w:left="605" w:hanging="374"/>
+      </w:pPr>
+      <w:r>
+        <w:rPr>
+          <w:rFonts w:ascii="Calibri" w:hAnsi="Calibri"/>
+          <w:color w:val="17202A"/>
+          <w:sz w:val="22"/>
+        </w:rPr>
+        <w:t xml:space="preserve">13.  </w:t>
+      </w:r>
+      <w:r>
+        <w:rPr>
+          <w:rFonts w:ascii="Calibri" w:hAnsi="Calibri"/>
+          <w:b w:val="0"/>
+          <w:color w:val="17202A"/>
+          <w:sz w:val="22"/>
+        </w:rPr>
+        <w:t>Super-admin меняет chat setting, видит audit, а новое событие использует новую версию без переписывания истории.</w:t>
       </w:r>
     </w:p>
     <w:p>
       <w:pPr>
-        <w:spacing w:after="80" w:line="300" w:lineRule="exact"/>
-        <w:ind w:left="605" w:hanging="374"/>
-      </w:pPr>
-      <w:r>
-        <w:rPr>
-          <w:rFonts w:ascii="Calibri" w:hAnsi="Calibri"/>
-          <w:color w:val="17202A"/>
-          <w:sz w:val="22"/>
-        </w:rPr>
-        <w:t xml:space="preserve">1.  </w:t>
-      </w:r>
-      <w:r>
-        <w:rPr>
-          <w:rFonts w:ascii="Calibri" w:hAnsi="Calibri"/>
-          <w:b w:val="0"/>
-          <w:color w:val="17202A"/>
-          <w:sz w:val="22"/>
-        </w:rPr>
-        <w:t>Прямой URL и повторный запрос не дают Агенту чужую анкету или данные.</w:t>
+        <w:pStyle w:val="Heading2"/>
+      </w:pPr>
+      <w:r>
+        <w:t>Отрицательные и повторные проверки</w:t>
       </w:r>
     </w:p>
     <w:p>
       <w:pPr>
-        <w:spacing w:after="80" w:line="300" w:lineRule="exact"/>
+        <w:spacing w:after="120" w:line="288" w:lineRule="auto"/>
         <w:ind w:left="605" w:hanging="374"/>
       </w:pPr>
       <w:r>
@@ -5249,7 +5267,7 @@
           <w:color w:val="17202A"/>
           <w:sz w:val="22"/>
         </w:rPr>
-        <w:t xml:space="preserve">2.  </w:t>
+        <w:t xml:space="preserve">1.  </w:t>
       </w:r>
       <w:r>
         <w:rPr>
@@ -5258,12 +5276,12 @@
           <w:color w:val="17202A"/>
           <w:sz w:val="22"/>
         </w:rPr>
-        <w:t>Чужой actor/assignment не позволяет отправить сообщение.</w:t>
+        <w:t>Прямой URL и повторный запрос не дают Агенту чужую анкету или данные.</w:t>
       </w:r>
     </w:p>
     <w:p>
       <w:pPr>
-        <w:spacing w:after="80" w:line="300" w:lineRule="exact"/>
+        <w:spacing w:after="120" w:line="288" w:lineRule="auto"/>
         <w:ind w:left="605" w:hanging="374"/>
       </w:pPr>
       <w:r>
@@ -5272,7 +5290,7 @@
           <w:color w:val="17202A"/>
           <w:sz w:val="22"/>
         </w:rPr>
-        <w:t xml:space="preserve">3.  </w:t>
+        <w:t xml:space="preserve">2.  </w:t>
       </w:r>
       <w:r>
         <w:rPr>
@@ -5281,12 +5299,12 @@
           <w:color w:val="17202A"/>
           <w:sz w:val="22"/>
         </w:rPr>
-        <w:t>Вторая paid/pause session для Агента отклоняется.</w:t>
+        <w:t>Чужой actor/assignment не позволяет отправить сообщение.</w:t>
       </w:r>
     </w:p>
     <w:p>
       <w:pPr>
-        <w:spacing w:after="80" w:line="300" w:lineRule="exact"/>
+        <w:spacing w:after="120" w:line="288" w:lineRule="auto"/>
         <w:ind w:left="605" w:hanging="374"/>
       </w:pPr>
       <w:r>
@@ -5295,7 +5313,7 @@
           <w:color w:val="17202A"/>
           <w:sz w:val="22"/>
         </w:rPr>
-        <w:t xml:space="preserve">4.  </w:t>
+        <w:t xml:space="preserve">3.  </w:t>
       </w:r>
       <w:r>
         <w:rPr>
@@ -5304,12 +5322,12 @@
           <w:color w:val="17202A"/>
           <w:sz w:val="22"/>
         </w:rPr>
-        <w:t>Duplicate/retry не создаёт второе сообщение, warning, incident, coupon, debit или session.</w:t>
+        <w:t>Вторая paid/pause session для Агента отклоняется.</w:t>
       </w:r>
     </w:p>
     <w:p>
       <w:pPr>
-        <w:spacing w:after="80" w:line="300" w:lineRule="exact"/>
+        <w:spacing w:after="120" w:line="288" w:lineRule="auto"/>
         <w:ind w:left="605" w:hanging="374"/>
       </w:pPr>
       <w:r>
@@ -5318,7 +5336,7 @@
           <w:color w:val="17202A"/>
           <w:sz w:val="22"/>
         </w:rPr>
-        <w:t xml:space="preserve">5.  </w:t>
+        <w:t xml:space="preserve">4.  </w:t>
       </w:r>
       <w:r>
         <w:rPr>
@@ -5327,12 +5345,12 @@
           <w:color w:val="17202A"/>
           <w:sz w:val="22"/>
         </w:rPr>
-        <w:t>Audio/video/arbitrary или замаскированный файл не доставляется.</w:t>
+        <w:t>Duplicate/retry не создаёт второе сообщение, warning, incident, coupon, debit или session.</w:t>
       </w:r>
     </w:p>
     <w:p>
       <w:pPr>
-        <w:spacing w:after="80" w:line="300" w:lineRule="exact"/>
+        <w:spacing w:after="120" w:line="288" w:lineRule="auto"/>
         <w:ind w:left="605" w:hanging="374"/>
       </w:pPr>
       <w:r>
@@ -5341,7 +5359,7 @@
           <w:color w:val="17202A"/>
           <w:sz w:val="22"/>
         </w:rPr>
-        <w:t xml:space="preserve">6.  </w:t>
+        <w:t xml:space="preserve">5.  </w:t>
       </w:r>
       <w:r>
         <w:rPr>
@@ -5350,12 +5368,12 @@
           <w:color w:val="17202A"/>
           <w:sz w:val="22"/>
         </w:rPr>
-        <w:t>Непроверяемое вложение не обходит цензуру.</w:t>
+        <w:t>Audio/video/arbitrary или замаскированный файл не доставляется.</w:t>
       </w:r>
     </w:p>
     <w:p>
       <w:pPr>
-        <w:spacing w:after="80" w:line="300" w:lineRule="exact"/>
+        <w:spacing w:after="120" w:line="288" w:lineRule="auto"/>
         <w:ind w:left="605" w:hanging="374"/>
       </w:pPr>
       <w:r>
@@ -5364,7 +5382,7 @@
           <w:color w:val="17202A"/>
           <w:sz w:val="22"/>
         </w:rPr>
-        <w:t xml:space="preserve">7.  </w:t>
+        <w:t xml:space="preserve">6.  </w:t>
       </w:r>
       <w:r>
         <w:rPr>
@@ -5373,12 +5391,12 @@
           <w:color w:val="17202A"/>
           <w:sz w:val="22"/>
         </w:rPr>
-        <w:t>Получатель не восстанавливает censored original через quote, notification, history или search.</w:t>
+        <w:t>Непроверяемое вложение не обходит цензуру.</w:t>
       </w:r>
     </w:p>
     <w:p>
       <w:pPr>
-        <w:spacing w:after="80" w:line="300" w:lineRule="exact"/>
+        <w:spacing w:after="120" w:line="288" w:lineRule="auto"/>
         <w:ind w:left="605" w:hanging="374"/>
       </w:pPr>
       <w:r>
@@ -5387,7 +5405,7 @@
           <w:color w:val="17202A"/>
           <w:sz w:val="22"/>
         </w:rPr>
-        <w:t xml:space="preserve">8.  </w:t>
+        <w:t xml:space="preserve">7.  </w:t>
       </w:r>
       <w:r>
         <w:rPr>
@@ -5396,12 +5414,12 @@
           <w:color w:val="17202A"/>
           <w:sz w:val="22"/>
         </w:rPr>
-        <w:t>Staff без причины не скрывает сообщение и не завершает session.</w:t>
+        <w:t>Получатель не восстанавливает censored original через quote, notification, history или search.</w:t>
       </w:r>
     </w:p>
     <w:p>
       <w:pPr>
-        <w:spacing w:after="80" w:line="300" w:lineRule="exact"/>
+        <w:spacing w:after="120" w:line="288" w:lineRule="auto"/>
         <w:ind w:left="605" w:hanging="374"/>
       </w:pPr>
       <w:r>
@@ -5410,7 +5428,7 @@
           <w:color w:val="17202A"/>
           <w:sz w:val="22"/>
         </w:rPr>
-        <w:t xml:space="preserve">9.  </w:t>
+        <w:t xml:space="preserve">8.  </w:t>
       </w:r>
       <w:r>
         <w:rPr>
@@ -5419,12 +5437,12 @@
           <w:color w:val="17202A"/>
           <w:sz w:val="22"/>
         </w:rPr>
-        <w:t>Physical delete консультационного сообщения недоступен.</w:t>
+        <w:t>Staff без причины не скрывает сообщение и не завершает session.</w:t>
       </w:r>
     </w:p>
     <w:p>
       <w:pPr>
-        <w:spacing w:after="80" w:line="300" w:lineRule="exact"/>
+        <w:spacing w:after="120" w:line="288" w:lineRule="auto"/>
         <w:ind w:left="605" w:hanging="374"/>
       </w:pPr>
       <w:r>
@@ -5433,7 +5451,7 @@
           <w:color w:val="17202A"/>
           <w:sz w:val="22"/>
         </w:rPr>
-        <w:t xml:space="preserve">10.  </w:t>
+        <w:t xml:space="preserve">9.  </w:t>
       </w:r>
       <w:r>
         <w:rPr>
@@ -5442,12 +5460,12 @@
           <w:color w:val="17202A"/>
           <w:sz w:val="22"/>
         </w:rPr>
-        <w:t>Переназначение во время active paid/pause отклоняется и не меняет историю.</w:t>
+        <w:t>Physical delete консультационного сообщения недоступен.</w:t>
       </w:r>
     </w:p>
     <w:p>
       <w:pPr>
-        <w:spacing w:after="80" w:line="300" w:lineRule="exact"/>
+        <w:spacing w:after="120" w:line="288" w:lineRule="auto"/>
         <w:ind w:left="605" w:hanging="374"/>
       </w:pPr>
       <w:r>
@@ -5456,7 +5474,7 @@
           <w:color w:val="17202A"/>
           <w:sz w:val="22"/>
         </w:rPr>
-        <w:t xml:space="preserve">11.  </w:t>
+        <w:t xml:space="preserve">10.  </w:t>
       </w:r>
       <w:r>
         <w:rPr>
@@ -5465,12 +5483,12 @@
           <w:color w:val="17202A"/>
           <w:sz w:val="22"/>
         </w:rPr>
-        <w:t>Частичный сбой не оставляет клиенту ложный статус доставки, обещание купона или скрытое списание.</w:t>
+        <w:t>Переназначение во время active paid/pause отклоняется и не меняет историю.</w:t>
       </w:r>
     </w:p>
     <w:p>
       <w:pPr>
-        <w:spacing w:after="80" w:line="300" w:lineRule="exact"/>
+        <w:spacing w:after="120" w:line="288" w:lineRule="auto"/>
         <w:ind w:left="605" w:hanging="374"/>
       </w:pPr>
       <w:r>
@@ -5479,7 +5497,7 @@
           <w:color w:val="17202A"/>
           <w:sz w:val="22"/>
         </w:rPr>
-        <w:t xml:space="preserve">12.  </w:t>
+        <w:t xml:space="preserve">11.  </w:t>
       </w:r>
       <w:r>
         <w:rPr>
@@ -5488,44 +5506,44 @@
           <w:color w:val="17202A"/>
           <w:sz w:val="22"/>
         </w:rPr>
-        <w:t>Непрочитанное до edit сообщение не получает клиентскую отметку «изменено», а прочитанное до edit не теряет обязательную отметку.</w:t>
+        <w:t>Частичный сбой не оставляет клиенту ложный статус доставки, обещание купона или скрытое списание.</w:t>
       </w:r>
     </w:p>
     <w:p>
       <w:pPr>
-        <w:pStyle w:val="Heading1"/>
-      </w:pPr>
-      <w:r>
-        <w:t>17. Что Игорь возвращает на вычитку и приёмку</w:t>
+        <w:spacing w:after="120" w:line="288" w:lineRule="auto"/>
+        <w:ind w:left="605" w:hanging="374"/>
+      </w:pPr>
+      <w:r>
+        <w:rPr>
+          <w:rFonts w:ascii="Calibri" w:hAnsi="Calibri"/>
+          <w:color w:val="17202A"/>
+          <w:sz w:val="22"/>
+        </w:rPr>
+        <w:t xml:space="preserve">12.  </w:t>
+      </w:r>
+      <w:r>
+        <w:rPr>
+          <w:rFonts w:ascii="Calibri" w:hAnsi="Calibri"/>
+          <w:b w:val="0"/>
+          <w:color w:val="17202A"/>
+          <w:sz w:val="22"/>
+        </w:rPr>
+        <w:t>Непрочитанное до edit сообщение не получает клиентскую отметку «изменено», а прочитанное до edit не теряет обязательную отметку.</w:t>
       </w:r>
     </w:p>
     <w:p>
       <w:pPr>
-        <w:keepNext/>
-      </w:pPr>
-      <w:r>
-        <w:rPr>
-          <w:rFonts w:ascii="Calibri" w:hAnsi="Calibri"/>
-          <w:b w:val="0"/>
-          <w:color w:val="17202A"/>
-          <w:sz w:val="22"/>
-        </w:rPr>
-        <w:t>Перед реализацией:</w:t>
+        <w:pStyle w:val="Heading1"/>
+      </w:pPr>
+      <w:r>
+        <w:t>17. Что Игорь возвращает на вычитку и приёмку</w:t>
       </w:r>
     </w:p>
     <w:p>
       <w:pPr>
-        <w:spacing w:after="80" w:line="300" w:lineRule="exact"/>
-        <w:ind w:left="605" w:hanging="374"/>
-      </w:pPr>
-      <w:r>
-        <w:rPr>
-          <w:rFonts w:ascii="Calibri" w:hAnsi="Calibri"/>
-          <w:color w:val="17202A"/>
-          <w:sz w:val="22"/>
-        </w:rPr>
-        <w:t xml:space="preserve">•  </w:t>
-      </w:r>
+        <w:keepNext/>
+      </w:pPr>
       <w:r>
         <w:rPr>
           <w:rFonts w:ascii="Calibri" w:hAnsi="Calibri"/>
@@ -5533,12 +5551,12 @@
           <w:color w:val="17202A"/>
           <w:sz w:val="22"/>
         </w:rPr>
-        <w:t>краткое подтверждение понимания scope и зависимостей;</w:t>
+        <w:t>Перед реализацией:</w:t>
       </w:r>
     </w:p>
     <w:p>
       <w:pPr>
-        <w:spacing w:after="80" w:line="300" w:lineRule="exact"/>
+        <w:spacing w:after="120" w:line="288" w:lineRule="auto"/>
         <w:ind w:left="605" w:hanging="374"/>
       </w:pPr>
       <w:r>
@@ -5556,12 +5574,12 @@
           <w:color w:val="17202A"/>
           <w:sz w:val="22"/>
         </w:rPr>
-        <w:t>перечень найденных конфликтов с текущим сайтом;</w:t>
+        <w:t>краткое подтверждение понимания scope и зависимостей;</w:t>
       </w:r>
     </w:p>
     <w:p>
       <w:pPr>
-        <w:spacing w:after="80" w:line="300" w:lineRule="exact"/>
+        <w:spacing w:after="120" w:line="288" w:lineRule="auto"/>
         <w:ind w:left="605" w:hanging="374"/>
       </w:pPr>
       <w:r>
@@ -5579,12 +5597,12 @@
           <w:color w:val="17202A"/>
           <w:sz w:val="22"/>
         </w:rPr>
-        <w:t>список открытых продуктовых вопросов, если без решения поведение будет неоднозначным;</w:t>
+        <w:t>перечень найденных конфликтов с текущим сайтом;</w:t>
       </w:r>
     </w:p>
     <w:p>
       <w:pPr>
-        <w:spacing w:after="80" w:line="300" w:lineRule="exact"/>
+        <w:spacing w:after="120" w:line="288" w:lineRule="auto"/>
         <w:ind w:left="605" w:hanging="374"/>
       </w:pPr>
       <w:r>
@@ -5602,13 +5620,22 @@
           <w:color w:val="17202A"/>
           <w:sz w:val="22"/>
         </w:rPr>
-        <w:t>план проверки положительных и отрицательных сценариев.</w:t>
+        <w:t>список открытых продуктовых вопросов, если без решения поведение будет неоднозначным;</w:t>
       </w:r>
     </w:p>
     <w:p>
       <w:pPr>
-        <w:keepNext/>
-      </w:pPr>
+        <w:spacing w:after="120" w:line="288" w:lineRule="auto"/>
+        <w:ind w:left="605" w:hanging="374"/>
+      </w:pPr>
+      <w:r>
+        <w:rPr>
+          <w:rFonts w:ascii="Calibri" w:hAnsi="Calibri"/>
+          <w:color w:val="17202A"/>
+          <w:sz w:val="22"/>
+        </w:rPr>
+        <w:t xml:space="preserve">•  </w:t>
+      </w:r>
       <w:r>
         <w:rPr>
           <w:rFonts w:ascii="Calibri" w:hAnsi="Calibri"/>
@@ -5616,22 +5643,13 @@
           <w:color w:val="17202A"/>
           <w:sz w:val="22"/>
         </w:rPr>
-        <w:t>После реализации:</w:t>
+        <w:t>план проверки положительных и отрицательных сценариев.</w:t>
       </w:r>
     </w:p>
     <w:p>
       <w:pPr>
-        <w:spacing w:after="80" w:line="300" w:lineRule="exact"/>
-        <w:ind w:left="605" w:hanging="374"/>
-      </w:pPr>
-      <w:r>
-        <w:rPr>
-          <w:rFonts w:ascii="Calibri" w:hAnsi="Calibri"/>
-          <w:color w:val="17202A"/>
-          <w:sz w:val="22"/>
-        </w:rPr>
-        <w:t xml:space="preserve">•  </w:t>
-      </w:r>
+        <w:keepNext/>
+      </w:pPr>
       <w:r>
         <w:rPr>
           <w:rFonts w:ascii="Calibri" w:hAnsi="Calibri"/>
@@ -5639,12 +5657,12 @@
           <w:color w:val="17202A"/>
           <w:sz w:val="22"/>
         </w:rPr>
-        <w:t>ссылку на build/commit;</w:t>
+        <w:t>После реализации:</w:t>
       </w:r>
     </w:p>
     <w:p>
       <w:pPr>
-        <w:spacing w:after="80" w:line="300" w:lineRule="exact"/>
+        <w:spacing w:after="120" w:line="288" w:lineRule="auto"/>
         <w:ind w:left="605" w:hanging="374"/>
       </w:pPr>
       <w:r>
@@ -5662,12 +5680,12 @@
           <w:color w:val="17202A"/>
           <w:sz w:val="22"/>
         </w:rPr>
-        <w:t>карту изменённых клиентских, agent, support и admin поверхностей;</w:t>
+        <w:t>ссылку на build/commit;</w:t>
       </w:r>
     </w:p>
     <w:p>
       <w:pPr>
-        <w:spacing w:after="80" w:line="300" w:lineRule="exact"/>
+        <w:spacing w:after="120" w:line="288" w:lineRule="auto"/>
         <w:ind w:left="605" w:hanging="374"/>
       </w:pPr>
       <w:r>
@@ -5685,12 +5703,12 @@
           <w:color w:val="17202A"/>
           <w:sz w:val="22"/>
         </w:rPr>
-        <w:t>proof для прав и прямых запросов;</w:t>
+        <w:t>карту изменённых клиентских, agent, support и admin поверхностей;</w:t>
       </w:r>
     </w:p>
     <w:p>
       <w:pPr>
-        <w:spacing w:after="80" w:line="300" w:lineRule="exact"/>
+        <w:spacing w:after="120" w:line="288" w:lineRule="auto"/>
         <w:ind w:left="605" w:hanging="374"/>
       </w:pPr>
       <w:r>
@@ -5708,12 +5726,12 @@
           <w:color w:val="17202A"/>
           <w:sz w:val="22"/>
         </w:rPr>
-        <w:t>proof состояний, idempotency, цензуры, audit, настроек и historical readback;</w:t>
+        <w:t>proof для прав и прямых запросов;</w:t>
       </w:r>
     </w:p>
     <w:p>
       <w:pPr>
-        <w:spacing w:after="80" w:line="300" w:lineRule="exact"/>
+        <w:spacing w:after="120" w:line="288" w:lineRule="auto"/>
         <w:ind w:left="605" w:hanging="374"/>
       </w:pPr>
       <w:r>
@@ -5731,12 +5749,35 @@
           <w:color w:val="17202A"/>
           <w:sz w:val="22"/>
         </w:rPr>
-        <w:t>rollback/cleanup plan;</w:t>
+        <w:t>proof состояний, idempotency, цензуры, audit, настроек и historical readback;</w:t>
       </w:r>
     </w:p>
     <w:p>
       <w:pPr>
-        <w:spacing w:after="80" w:line="300" w:lineRule="exact"/>
+        <w:spacing w:after="120" w:line="288" w:lineRule="auto"/>
+        <w:ind w:left="605" w:hanging="374"/>
+      </w:pPr>
+      <w:r>
+        <w:rPr>
+          <w:rFonts w:ascii="Calibri" w:hAnsi="Calibri"/>
+          <w:color w:val="17202A"/>
+          <w:sz w:val="22"/>
+        </w:rPr>
+        <w:t xml:space="preserve">•  </w:t>
+      </w:r>
+      <w:r>
+        <w:rPr>
+          <w:rFonts w:ascii="Calibri" w:hAnsi="Calibri"/>
+          <w:b w:val="0"/>
+          <w:color w:val="17202A"/>
+          <w:sz w:val="22"/>
+        </w:rPr>
+        <w:t>rollback/cleanup plan;</w:t>
+      </w:r>
+    </w:p>
+    <w:p>
+      <w:pPr>
+        <w:spacing w:after="120" w:line="288" w:lineRule="auto"/>
         <w:ind w:left="605" w:hanging="374"/>
       </w:pPr>
       <w:r>
@@ -5817,7 +5858,7 @@
           <w:color w:val="31445A"/>
           <w:sz w:val="19"/>
         </w:rPr>
-        <w:t>2.0</w:t>
+        <w:t>2.1</w:t>
       </w:r>
     </w:p>
     <w:p>
@@ -5839,7 +5880,7 @@
           <w:color w:val="31445A"/>
           <w:sz w:val="19"/>
         </w:rPr>
-        <w:t>2026-07-27</w:t>
+        <w:t>2026-08-04</w:t>
       </w:r>
     </w:p>
     <w:p>
@@ -5992,7 +6033,7 @@
     <w:pPr>
       <w:pStyle w:val="Footer"/>
       <w:spacing w:after="0"/>
-      <w:jc w:val="right"/>
+      <w:jc w:val="center"/>
     </w:pPr>
     <w:r>
       <w:rPr>
@@ -6380,7 +6421,7 @@
     <w:qFormat/>
     <w:rsid w:val="00FC693F"/>
     <w:pPr>
-      <w:spacing w:after="120" w:line="300" w:lineRule="exact"/>
+      <w:spacing w:after="120" w:line="276" w:lineRule="auto"/>
     </w:pPr>
     <w:rPr>
       <w:rFonts w:ascii="Calibri" w:hAnsi="Calibri"/>
@@ -6443,7 +6484,7 @@
     <w:pPr>
       <w:keepNext/>
       <w:keepLines/>
-      <w:spacing w:before="360" w:after="200"/>
+      <w:spacing w:before="360" w:after="200" w:line="269" w:lineRule="auto"/>
       <w:outlineLvl w:val="0"/>
     </w:pPr>
     <w:rPr>
@@ -6467,7 +6508,7 @@
     <w:pPr>
       <w:keepNext/>
       <w:keepLines/>
-      <w:spacing w:before="280" w:after="140"/>
+      <w:spacing w:before="280" w:after="140" w:line="269" w:lineRule="auto"/>
       <w:outlineLvl w:val="1"/>
     </w:pPr>
     <w:rPr>
@@ -6491,7 +6532,7 @@
     <w:pPr>
       <w:keepNext/>
       <w:keepLines/>
-      <w:spacing w:before="200" w:after="100"/>
+      <w:spacing w:before="200" w:after="100" w:line="269" w:lineRule="auto"/>
       <w:outlineLvl w:val="2"/>
     </w:pPr>
     <w:rPr>
@@ -6915,7 +6956,7 @@
       <w:numPr>
         <w:numId w:val="1"/>
       </w:numPr>
-      <w:spacing w:after="80" w:line="300" w:lineRule="exact"/>
+      <w:spacing w:after="80" w:line="276" w:lineRule="auto"/>
       <w:ind w:left="540" w:hanging="271"/>
       <w:contextualSpacing/>
     </w:pPr>
@@ -6960,7 +7001,7 @@
       <w:numPr>
         <w:numId w:val="5"/>
       </w:numPr>
-      <w:spacing w:after="80" w:line="300" w:lineRule="exact"/>
+      <w:spacing w:after="80" w:line="276" w:lineRule="auto"/>
       <w:ind w:left="540" w:hanging="271"/>
       <w:contextualSpacing/>
     </w:pPr>

</xml_diff>

<commit_message>
docs: finalize G1.2 chat handoff for Igor and Codex
</commit_message>
<xml_diff>
--- a/reports/six-goals-functional-tz-2026-07-20/tz-g1-2-for-igor.docx
+++ b/reports/six-goals-functional-tz-2026-07-20/tz-g1-2-for-igor.docx
@@ -13,7 +13,7 @@
           <w:color w:val="175CD3"/>
           <w:sz w:val="18"/>
         </w:rPr>
-        <w:t>Nebula · Product specification</w:t>
+        <w:t>ТЕХНИЧЕСКОЕ ЗАДАНИЕ · ДЛЯ СОГЛАСОВАНИЯ</w:t>
       </w:r>
     </w:p>
     <w:p>
@@ -2054,13 +2054,27 @@
     </w:p>
     <w:p>
       <w:r>
-        <w:rPr>
-          <w:rFonts w:ascii="Calibri" w:hAnsi="Calibri"/>
-          <w:b w:val="0"/>
-          <w:color w:val="17202A"/>
-          <w:sz w:val="22"/>
-        </w:rPr>
-        <w:t>Шаблоны ответов являются необязательными редактируемыми подсказками. Агент самостоятельно выбирает или изменяет текст и явно отправляет его. Автоматическая отправка шаблона, AI-подсказки или подготовленного ответа запрещена.</w:t>
+        <w:t>Поле выбора шаблона и кнопки Needs reply, Assign, Note, Resolve в текущем HTML-макете являются визуальными точками действий. Полная логика кнопок отложена отдельным PM-решением. Каноничны три слоя каталога: системный список super-admin, шаблоны конкретного Эксперта и личные шаблоны оператора. Стартовый системный набор создаёт и публикует super-admin в отдельном функционале; после публикации он доступен авторизованным участникам рабочего admin-чата по permissions только для выбора; публичный Эксперт не является отдельным админским пользователем. Для записи нужны название, категория/сценарий, ровно одно положение доступности — Пинги (pings), Активный чат (active_chat) или Платный чат (paid_chat) — утверждённые RU/EN и список переменных. Селектор фильтрует каталог по текущему положению, сервер повторно проверяет placement при выборе и отправке. Макет сам по себе набор не утверждает.</w:t>
+      </w:r>
+    </w:p>
+    <w:p>
+      <w:r>
+        <w:t>При регистрации язык определяется существующей функцией по предпочтениям браузера и сохраняется в профиле. Клиент может изменить язык в профиле. Чат по умолчанию использует режим AUTO и актуальный язык профиля. Expert/Agent может сохранить результирующий язык для текущего диалога во вкладке Quality; профиль клиента это не меняет. Разовый выбор для одного сообщения не становится языком следующих сообщений. Super-admin может заблокировать изменение и сброс override на странице Настройки чата.</w:t>
+      </w:r>
+    </w:p>
+    <w:p>
+      <w:r>
+        <w:t>Язык чата и результирующий язык клиента</w:t>
+      </w:r>
+    </w:p>
+    <w:p>
+      <w:r>
+        <w:t>Разрешены только переменные {{client_first_name}}, {{expert_public_name}}, {{consultation_price_credits_per_minute}}, {{trial_minutes}}, {{consultation_date}}, {{consultation_time}}, {{client_timezone}}, {{consultation_link}}, {{topup_link}} и {{support_link}}. Подстановка выполняется сервером при показе и повторно при явной отправке. Если обязательное значение недоступно, шаблон не предлагается и literal-токен не показывается. Внутренние ID, имя Агента, платёжные данные, raw balance, контакты, HTML/JS и произвольные URL запрещены; ссылки формируются сервером. Выбор шаблона не отправляет сообщение автоматически.</w:t>
+      </w:r>
+    </w:p>
+    <w:p>
+      <w:r>
+        <w:t>Переменные шаблонов (MVP allowlist)</w:t>
       </w:r>
     </w:p>
     <w:p>
@@ -2068,7 +2082,7 @@
         <w:pStyle w:val="Heading1"/>
       </w:pPr>
       <w:r>
-        <w:t>8. Цензура контактов и защищённых данных</w:t>
+        <w:t>Разрешены только переменные {{client_name}}, {{expert_name}}, {{price_min}} (session snapshot, либо effective price выбранного Эксперта до создания session), {{trial_min}}, {{consult_date}}, {{consult_time}}, {{timezone}}, {{consult_link}}, {{topup_link}} и {{support_link}}. Подстановка выполняется сервером при показе и повторно при явной отправке. Если обязательное значение недоступно, шаблон не предлагается и literal-токен не показывается. Внутренние ID, имя Агента, платёжные данные, raw balance, контакты, HTML/JS и произвольные URL запрещены; ссылки формируются сервером. Выбор шаблона не отправляет сообщение автоматически.</w:t>
       </w:r>
     </w:p>
     <w:p>
@@ -4082,21 +4096,7 @@
         <w:ind w:left="605" w:hanging="374"/>
       </w:pPr>
       <w:r>
-        <w:rPr>
-          <w:rFonts w:ascii="Calibri" w:hAnsi="Calibri"/>
-          <w:color w:val="17202A"/>
-          <w:sz w:val="22"/>
-        </w:rPr>
-        <w:t xml:space="preserve">7.  </w:t>
-      </w:r>
-      <w:r>
-        <w:rPr>
-          <w:rFonts w:ascii="Calibri" w:hAnsi="Calibri"/>
-          <w:b w:val="0"/>
-          <w:color w:val="17202A"/>
-          <w:sz w:val="22"/>
-        </w:rPr>
-        <w:t>Ручные шаблоны и системные сообщения внутри чата.</w:t>
+        <w:t>7.  Визуальный placeholder шаблонов и действий внутри чата; каталог, языковая/переводная логика и semantics действий отложены PM-решением.</w:t>
       </w:r>
     </w:p>
     <w:p>
@@ -5250,14 +5250,6 @@
     </w:p>
     <w:p>
       <w:pPr>
-        <w:pStyle w:val="Heading2"/>
-      </w:pPr>
-      <w:r>
-        <w:t>Отрицательные и повторные проверки</w:t>
-      </w:r>
-    </w:p>
-    <w:p>
-      <w:pPr>
         <w:spacing w:after="120" w:line="288" w:lineRule="auto"/>
         <w:ind w:left="605" w:hanging="374"/>
       </w:pPr>
@@ -5267,7 +5259,7 @@
           <w:color w:val="17202A"/>
           <w:sz w:val="22"/>
         </w:rPr>
-        <w:t xml:space="preserve">1.  </w:t>
+        <w:t xml:space="preserve">14.  </w:t>
       </w:r>
       <w:r>
         <w:rPr>
@@ -5276,7 +5268,7 @@
           <w:color w:val="17202A"/>
           <w:sz w:val="22"/>
         </w:rPr>
-        <w:t>Прямой URL и повторный запрос не дают Агенту чужую анкету или данные.</w:t>
+        <w:t>Для каждого изменяемого guard super-admin может сохранить минимально допустимое, максимально допустимое и типичное значение; новое событие применяет ровно сохранённую версию, а UI и server-side validation дают одинаковый результат.</w:t>
       </w:r>
     </w:p>
     <w:p>
@@ -5290,7 +5282,7 @@
           <w:color w:val="17202A"/>
           <w:sz w:val="22"/>
         </w:rPr>
-        <w:t xml:space="preserve">2.  </w:t>
+        <w:t xml:space="preserve">15.  </w:t>
       </w:r>
       <w:r>
         <w:rPr>
@@ -5299,7 +5291,15 @@
           <w:color w:val="17202A"/>
           <w:sz w:val="22"/>
         </w:rPr>
-        <w:t>Чужой actor/assignment не позволяет отправить сообщение.</w:t>
+        <w:t>Выключение одной категории цензуры не выключает остальные категории и не меняет обязательный запрет audio/video/arbitrary files.</w:t>
+      </w:r>
+    </w:p>
+    <w:p>
+      <w:pPr>
+        <w:pStyle w:val="Heading2"/>
+      </w:pPr>
+      <w:r>
+        <w:t>Отрицательные и повторные проверки</w:t>
       </w:r>
     </w:p>
     <w:p>
@@ -5313,7 +5313,7 @@
           <w:color w:val="17202A"/>
           <w:sz w:val="22"/>
         </w:rPr>
-        <w:t xml:space="preserve">3.  </w:t>
+        <w:t xml:space="preserve">1.  </w:t>
       </w:r>
       <w:r>
         <w:rPr>
@@ -5322,7 +5322,7 @@
           <w:color w:val="17202A"/>
           <w:sz w:val="22"/>
         </w:rPr>
-        <w:t>Вторая paid/pause session для Агента отклоняется.</w:t>
+        <w:t>Прямой URL и повторный запрос не дают Агенту чужую анкету или данные.</w:t>
       </w:r>
     </w:p>
     <w:p>
@@ -5336,7 +5336,7 @@
           <w:color w:val="17202A"/>
           <w:sz w:val="22"/>
         </w:rPr>
-        <w:t xml:space="preserve">4.  </w:t>
+        <w:t xml:space="preserve">2.  </w:t>
       </w:r>
       <w:r>
         <w:rPr>
@@ -5345,7 +5345,7 @@
           <w:color w:val="17202A"/>
           <w:sz w:val="22"/>
         </w:rPr>
-        <w:t>Duplicate/retry не создаёт второе сообщение, warning, incident, coupon, debit или session.</w:t>
+        <w:t>Чужой actor/assignment не позволяет отправить сообщение.</w:t>
       </w:r>
     </w:p>
     <w:p>
@@ -5359,7 +5359,7 @@
           <w:color w:val="17202A"/>
           <w:sz w:val="22"/>
         </w:rPr>
-        <w:t xml:space="preserve">5.  </w:t>
+        <w:t xml:space="preserve">3.  </w:t>
       </w:r>
       <w:r>
         <w:rPr>
@@ -5368,7 +5368,7 @@
           <w:color w:val="17202A"/>
           <w:sz w:val="22"/>
         </w:rPr>
-        <w:t>Audio/video/arbitrary или замаскированный файл не доставляется.</w:t>
+        <w:t>Вторая paid/pause session для Агента отклоняется.</w:t>
       </w:r>
     </w:p>
     <w:p>
@@ -5382,7 +5382,7 @@
           <w:color w:val="17202A"/>
           <w:sz w:val="22"/>
         </w:rPr>
-        <w:t xml:space="preserve">6.  </w:t>
+        <w:t xml:space="preserve">4.  </w:t>
       </w:r>
       <w:r>
         <w:rPr>
@@ -5391,7 +5391,7 @@
           <w:color w:val="17202A"/>
           <w:sz w:val="22"/>
         </w:rPr>
-        <w:t>Непроверяемое вложение не обходит цензуру.</w:t>
+        <w:t>Duplicate/retry не создаёт второе сообщение, warning, incident, coupon, debit или session.</w:t>
       </w:r>
     </w:p>
     <w:p>
@@ -5405,7 +5405,7 @@
           <w:color w:val="17202A"/>
           <w:sz w:val="22"/>
         </w:rPr>
-        <w:t xml:space="preserve">7.  </w:t>
+        <w:t xml:space="preserve">5.  </w:t>
       </w:r>
       <w:r>
         <w:rPr>
@@ -5414,7 +5414,7 @@
           <w:color w:val="17202A"/>
           <w:sz w:val="22"/>
         </w:rPr>
-        <w:t>Получатель не восстанавливает censored original через quote, notification, history или search.</w:t>
+        <w:t>Audio/video/arbitrary или замаскированный файл не доставляется.</w:t>
       </w:r>
     </w:p>
     <w:p>
@@ -5428,7 +5428,7 @@
           <w:color w:val="17202A"/>
           <w:sz w:val="22"/>
         </w:rPr>
-        <w:t xml:space="preserve">8.  </w:t>
+        <w:t xml:space="preserve">6.  </w:t>
       </w:r>
       <w:r>
         <w:rPr>
@@ -5437,7 +5437,7 @@
           <w:color w:val="17202A"/>
           <w:sz w:val="22"/>
         </w:rPr>
-        <w:t>Staff без причины не скрывает сообщение и не завершает session.</w:t>
+        <w:t>Непроверяемое вложение не обходит цензуру.</w:t>
       </w:r>
     </w:p>
     <w:p>
@@ -5451,7 +5451,7 @@
           <w:color w:val="17202A"/>
           <w:sz w:val="22"/>
         </w:rPr>
-        <w:t xml:space="preserve">9.  </w:t>
+        <w:t xml:space="preserve">7.  </w:t>
       </w:r>
       <w:r>
         <w:rPr>
@@ -5460,7 +5460,7 @@
           <w:color w:val="17202A"/>
           <w:sz w:val="22"/>
         </w:rPr>
-        <w:t>Physical delete консультационного сообщения недоступен.</w:t>
+        <w:t>Получатель не восстанавливает censored original через quote, notification, history или search.</w:t>
       </w:r>
     </w:p>
     <w:p>
@@ -5474,7 +5474,7 @@
           <w:color w:val="17202A"/>
           <w:sz w:val="22"/>
         </w:rPr>
-        <w:t xml:space="preserve">10.  </w:t>
+        <w:t xml:space="preserve">8.  </w:t>
       </w:r>
       <w:r>
         <w:rPr>
@@ -5483,7 +5483,7 @@
           <w:color w:val="17202A"/>
           <w:sz w:val="22"/>
         </w:rPr>
-        <w:t>Переназначение во время active paid/pause отклоняется и не меняет историю.</w:t>
+        <w:t>Staff без причины не скрывает сообщение и не завершает session.</w:t>
       </w:r>
     </w:p>
     <w:p>
@@ -5497,7 +5497,7 @@
           <w:color w:val="17202A"/>
           <w:sz w:val="22"/>
         </w:rPr>
-        <w:t xml:space="preserve">11.  </w:t>
+        <w:t xml:space="preserve">9.  </w:t>
       </w:r>
       <w:r>
         <w:rPr>
@@ -5506,7 +5506,7 @@
           <w:color w:val="17202A"/>
           <w:sz w:val="22"/>
         </w:rPr>
-        <w:t>Частичный сбой не оставляет клиенту ложный статус доставки, обещание купона или скрытое списание.</w:t>
+        <w:t>Physical delete консультационного сообщения недоступен.</w:t>
       </w:r>
     </w:p>
     <w:p>
@@ -5520,6 +5520,52 @@
           <w:color w:val="17202A"/>
           <w:sz w:val="22"/>
         </w:rPr>
+        <w:t xml:space="preserve">10.  </w:t>
+      </w:r>
+      <w:r>
+        <w:rPr>
+          <w:rFonts w:ascii="Calibri" w:hAnsi="Calibri"/>
+          <w:b w:val="0"/>
+          <w:color w:val="17202A"/>
+          <w:sz w:val="22"/>
+        </w:rPr>
+        <w:t>Переназначение во время active paid/pause отклоняется и не меняет историю.</w:t>
+      </w:r>
+    </w:p>
+    <w:p>
+      <w:pPr>
+        <w:spacing w:after="120" w:line="288" w:lineRule="auto"/>
+        <w:ind w:left="605" w:hanging="374"/>
+      </w:pPr>
+      <w:r>
+        <w:rPr>
+          <w:rFonts w:ascii="Calibri" w:hAnsi="Calibri"/>
+          <w:color w:val="17202A"/>
+          <w:sz w:val="22"/>
+        </w:rPr>
+        <w:t xml:space="preserve">11.  </w:t>
+      </w:r>
+      <w:r>
+        <w:rPr>
+          <w:rFonts w:ascii="Calibri" w:hAnsi="Calibri"/>
+          <w:b w:val="0"/>
+          <w:color w:val="17202A"/>
+          <w:sz w:val="22"/>
+        </w:rPr>
+        <w:t>Частичный сбой не оставляет клиенту ложный статус доставки, обещание купона или скрытое списание.</w:t>
+      </w:r>
+    </w:p>
+    <w:p>
+      <w:pPr>
+        <w:spacing w:after="120" w:line="288" w:lineRule="auto"/>
+        <w:ind w:left="605" w:hanging="374"/>
+      </w:pPr>
+      <w:r>
+        <w:rPr>
+          <w:rFonts w:ascii="Calibri" w:hAnsi="Calibri"/>
+          <w:color w:val="17202A"/>
+          <w:sz w:val="22"/>
+        </w:rPr>
         <w:t xml:space="preserve">12.  </w:t>
       </w:r>
       <w:r>
@@ -5530,6 +5576,144 @@
           <w:sz w:val="22"/>
         </w:rPr>
         <w:t>Непрочитанное до edit сообщение не получает клиентскую отметку «изменено», а прочитанное до edit не теряет обязательную отметку.</w:t>
+      </w:r>
+    </w:p>
+    <w:p>
+      <w:pPr>
+        <w:spacing w:after="120" w:line="288" w:lineRule="auto"/>
+        <w:ind w:left="605" w:hanging="374"/>
+      </w:pPr>
+      <w:r>
+        <w:rPr>
+          <w:rFonts w:ascii="Calibri" w:hAnsi="Calibri"/>
+          <w:color w:val="17202A"/>
+          <w:sz w:val="22"/>
+        </w:rPr>
+        <w:t xml:space="preserve">13.  </w:t>
+      </w:r>
+      <w:r>
+        <w:rPr>
+          <w:rFonts w:ascii="Calibri" w:hAnsi="Calibri"/>
+          <w:b w:val="0"/>
+          <w:color w:val="17202A"/>
+          <w:sz w:val="22"/>
+        </w:rPr>
+        <w:t>Сообщение на границе максимальной длины проходит, а превышение на один символ отклоняется; тот же тест выполняется для rate-limit count/window без off-by-one.</w:t>
+      </w:r>
+    </w:p>
+    <w:p>
+      <w:pPr>
+        <w:spacing w:after="120" w:line="288" w:lineRule="auto"/>
+        <w:ind w:left="605" w:hanging="374"/>
+      </w:pPr>
+      <w:r>
+        <w:rPr>
+          <w:rFonts w:ascii="Calibri" w:hAnsi="Calibri"/>
+          <w:color w:val="17202A"/>
+          <w:sz w:val="22"/>
+        </w:rPr>
+        <w:t xml:space="preserve">14.  </w:t>
+      </w:r>
+      <w:r>
+        <w:rPr>
+          <w:rFonts w:ascii="Calibri" w:hAnsi="Calibri"/>
+          <w:b w:val="0"/>
+          <w:color w:val="17202A"/>
+          <w:sz w:val="22"/>
+        </w:rPr>
+        <w:t>Вложение на разрешённой границе размера/количества/MIME проходит, а превышение, неподдерживаемый MIME и несовпадение MIME с фактической сигнатурой отклоняются.</w:t>
+      </w:r>
+    </w:p>
+    <w:p>
+      <w:pPr>
+        <w:spacing w:after="120" w:line="288" w:lineRule="auto"/>
+        <w:ind w:left="605" w:hanging="374"/>
+      </w:pPr>
+      <w:r>
+        <w:rPr>
+          <w:rFonts w:ascii="Calibri" w:hAnsi="Calibri"/>
+          <w:color w:val="17202A"/>
+          <w:sz w:val="22"/>
+        </w:rPr>
+        <w:t xml:space="preserve">15.  </w:t>
+      </w:r>
+      <w:r>
+        <w:rPr>
+          <w:rFonts w:ascii="Calibri" w:hAnsi="Calibri"/>
+          <w:b w:val="0"/>
+          <w:color w:val="17202A"/>
+          <w:sz w:val="22"/>
+        </w:rPr>
+        <w:t>QR, OCR, обфускация контакта и непроверяемое вложение не обходят включённые категории; выключенная категория перестаёт срабатывать только для новых событий и не переписывает старый incident.</w:t>
+      </w:r>
+    </w:p>
+    <w:p>
+      <w:pPr>
+        <w:spacing w:after="120" w:line="288" w:lineRule="auto"/>
+        <w:ind w:left="605" w:hanging="374"/>
+      </w:pPr>
+      <w:r>
+        <w:rPr>
+          <w:rFonts w:ascii="Calibri" w:hAnsi="Calibri"/>
+          <w:color w:val="17202A"/>
+          <w:sz w:val="22"/>
+        </w:rPr>
+        <w:t xml:space="preserve">16.  </w:t>
+      </w:r>
+      <w:r>
+        <w:rPr>
+          <w:rFonts w:ascii="Calibri" w:hAnsi="Calibri"/>
+          <w:b w:val="0"/>
+          <w:color w:val="17202A"/>
+          <w:sz w:val="22"/>
+        </w:rPr>
+        <w:t>Доступ super-admin к censored original требует отдельного разрешённого действия, обязательной причины и audit; обычный Agent, moderator и клиент не получают original через прямой URL/API.</w:t>
+      </w:r>
+    </w:p>
+    <w:p>
+      <w:pPr>
+        <w:spacing w:after="120" w:line="288" w:lineRule="auto"/>
+        <w:ind w:left="605" w:hanging="374"/>
+      </w:pPr>
+      <w:r>
+        <w:rPr>
+          <w:rFonts w:ascii="Calibri" w:hAnsi="Calibri"/>
+          <w:color w:val="17202A"/>
+          <w:sz w:val="22"/>
+        </w:rPr>
+        <w:t xml:space="preserve">17.  </w:t>
+      </w:r>
+      <w:r>
+        <w:rPr>
+          <w:rFonts w:ascii="Calibri" w:hAnsi="Calibri"/>
+          <w:b w:val="0"/>
+          <w:color w:val="17202A"/>
+          <w:sz w:val="22"/>
+        </w:rPr>
+        <w:t>Rollback chat-config создаёт новую версию, сохраняет автора/причину и применяется только к новым событиям; историческое сообщение продолжает ссылаться на прежнюю applied version.</w:t>
+      </w:r>
+    </w:p>
+    <w:p>
+      <w:pPr>
+        <w:spacing w:after="120" w:line="288" w:lineRule="auto"/>
+        <w:ind w:left="605" w:hanging="374"/>
+      </w:pPr>
+      <w:r>
+        <w:rPr>
+          <w:rFonts w:ascii="Calibri" w:hAnsi="Calibri"/>
+          <w:color w:val="17202A"/>
+          <w:sz w:val="22"/>
+        </w:rPr>
+        <w:t xml:space="preserve">18.  </w:t>
+      </w:r>
+      <w:r>
+        <w:rPr>
+          <w:rFonts w:ascii="Calibri" w:hAnsi="Calibri"/>
+          <w:b w:val="0"/>
+          <w:color w:val="17202A"/>
+          <w:sz w:val="22"/>
+        </w:rPr>
+        <w:t>Ручной шаблон, AI-подсказка и system message не отправляются автоматически от имени Эксперта/Агента и не обходят validation, цензуру, attachment guards или idempotency.</w:t>
       </w:r>
     </w:p>
     <w:p>
@@ -5844,13 +6028,21 @@
         <w:spacing w:after="40"/>
       </w:pPr>
       <w:r>
+        <w:t>Версия: 2.5</w:t>
+      </w:r>
+    </w:p>
+    <w:p>
+      <w:pPr>
+        <w:spacing w:after="40"/>
+      </w:pPr>
+      <w:r>
         <w:rPr>
           <w:rFonts w:ascii="Calibri" w:hAnsi="Calibri"/>
           <w:b/>
           <w:color w:val="123B63"/>
           <w:sz w:val="20"/>
         </w:rPr>
-        <w:t xml:space="preserve">Версия: </w:t>
+        <w:t xml:space="preserve">Дата: </w:t>
       </w:r>
       <w:r>
         <w:rPr>
@@ -5858,29 +6050,7 @@
           <w:color w:val="31445A"/>
           <w:sz w:val="19"/>
         </w:rPr>
-        <w:t>2.1</w:t>
-      </w:r>
-    </w:p>
-    <w:p>
-      <w:pPr>
-        <w:spacing w:after="40"/>
-      </w:pPr>
-      <w:r>
-        <w:rPr>
-          <w:rFonts w:ascii="Calibri" w:hAnsi="Calibri"/>
-          <w:b/>
-          <w:color w:val="123B63"/>
-          <w:sz w:val="20"/>
-        </w:rPr>
-        <w:t xml:space="preserve">Дата: </w:t>
-      </w:r>
-      <w:r>
-        <w:rPr>
-          <w:rFonts w:ascii="Consolas" w:hAnsi="Consolas"/>
-          <w:color w:val="31445A"/>
-          <w:sz w:val="19"/>
-        </w:rPr>
-        <w:t>2026-08-04</w:t>
+        <w:t>2026-08-09</w:t>
       </w:r>
     </w:p>
     <w:p>

</xml_diff>